<commit_message>
Update CV to 2026-10-19 version
Co-Authored-By: Claude Opus 5.5 <noreply@anthropic.com>
</commit_message>
<xml_diff>
--- a/resume/Yifan_Yang_CV.docx
+++ b/resume/Yifan_Yang_CV.docx
@@ -126,7 +126,7 @@
             <w:r>
               <w:t xml:space="preserve">Email: </w:t>
             </w:r>
-            <w:hyperlink w:history="1" r:id="rIdlzlrq9qrdvxt0r-1asr7i">
+            <w:hyperlink w:history="1" r:id="rIdyw3aqng0vhhn1jhoaye1h">
               <w:r>
                 <w:rPr>
                   <w:rStyle w:val="Hyperlink"/>
@@ -143,7 +143,7 @@
             <w:r>
               <w:t xml:space="preserve">Website: </w:t>
             </w:r>
-            <w:hyperlink w:history="1" r:id="rIdk_qg_bghklvuoblycoixk">
+            <w:hyperlink w:history="1" r:id="rIdkfjqzpjms1gkn_9tdt7td">
               <w:r>
                 <w:rPr>
                   <w:rStyle w:val="Hyperlink"/>
@@ -160,7 +160,7 @@
             <w:r>
               <w:t xml:space="preserve">Google Scholar: </w:t>
             </w:r>
-            <w:hyperlink w:history="1" r:id="rId8ddp7kn3fqw1hjaczpcva">
+            <w:hyperlink w:history="1" r:id="rIdx97fjbvwf-cz1h--80wj8">
               <w:r>
                 <w:rPr>
                   <w:rStyle w:val="Hyperlink"/>
@@ -177,7 +177,7 @@
             <w:r>
               <w:t xml:space="preserve">ORCID: </w:t>
             </w:r>
-            <w:hyperlink w:history="1" r:id="rId4_bv7gfyxzvkcetn6mbnv">
+            <w:hyperlink w:history="1" r:id="rIdmnzxs9w-ttlimejaqylt4">
               <w:r>
                 <w:rPr>
                   <w:rStyle w:val="Hyperlink"/>
@@ -194,7 +194,7 @@
             <w:r>
               <w:t xml:space="preserve">GitHub: </w:t>
             </w:r>
-            <w:hyperlink w:history="1" r:id="rId1csx6smtka4y0c8-lpkik">
+            <w:hyperlink w:history="1" r:id="rId-b5ct6xy7b11rvnpzrz9j">
               <w:r>
                 <w:rPr>
                   <w:rStyle w:val="Hyperlink"/>
@@ -281,7 +281,7 @@
               <w:spacing w:after="0" w:before="60"/>
             </w:pPr>
             <w:r>
-              <w:t xml:space="preserve">Responsible and Autonomous GeoAI</w:t>
+              <w:t xml:space="preserve">Spatiotemporal Complementarity</w:t>
             </w:r>
           </w:p>
           <w:p>
@@ -294,7 +294,7 @@
               <w:spacing w:after="0" w:before="60"/>
             </w:pPr>
             <w:r>
-              <w:t xml:space="preserve">Spatial Reasoning under Incomplete Observation</w:t>
+              <w:t xml:space="preserve">Place Specificity vs. Transferability</w:t>
             </w:r>
           </w:p>
           <w:p>
@@ -307,7 +307,7 @@
               <w:spacing w:after="0" w:before="60"/>
             </w:pPr>
             <w:r>
-              <w:t xml:space="preserve">Cross-View Evidence Fusion (Satellite and Street-View)</w:t>
+              <w:t xml:space="preserve">Accountability in GeoAI</w:t>
             </w:r>
           </w:p>
           <w:p>
@@ -320,7 +320,7 @@
               <w:spacing w:after="0" w:before="60"/>
             </w:pPr>
             <w:r>
-              <w:t xml:space="preserve">Closed-Loop Autonomous GeoAI Agents</w:t>
+              <w:t xml:space="preserve">Responsible and Agentic GeoAI</w:t>
             </w:r>
           </w:p>
         </w:tc>
@@ -350,7 +350,7 @@
               <w:spacing w:after="0" w:before="60"/>
             </w:pPr>
             <w:r>
-              <w:t xml:space="preserve">Generative and Multimodal AI</w:t>
+              <w:t xml:space="preserve">Generative AI and Multimodal Learning</w:t>
             </w:r>
           </w:p>
           <w:p>
@@ -363,7 +363,7 @@
               <w:spacing w:after="0" w:before="60"/>
             </w:pPr>
             <w:r>
-              <w:t xml:space="preserve">GIScience and Spatial Data Science</w:t>
+              <w:t xml:space="preserve">Street-View Imagery and Remote Sensing</w:t>
             </w:r>
           </w:p>
           <w:p>
@@ -389,7 +389,7 @@
               <w:spacing w:after="0" w:before="60"/>
             </w:pPr>
             <w:r>
-              <w:t xml:space="preserve">AI for Science (AI4Science)</w:t>
+              <w:t xml:space="preserve">GIScience and AI for Science (AI4Science)</w:t>
             </w:r>
           </w:p>
         </w:tc>
@@ -754,13 +754,32 @@
         <w:jc w:val="both"/>
       </w:pPr>
       <w:r>
+        <w:t xml:space="preserve">2026-2027</w:t>
+      </w:r>
+      <w:r>
+        <w:t xml:space="preserve">	</w:t>
+      </w:r>
+      <w:r>
+        <w:t xml:space="preserve">Student Director, Geographic Information Science and Systems (GISS) Specialty Group, American Association of Geographers (AAG)</w:t>
+      </w:r>
+    </w:p>
+    <w:p>
+      <w:pPr>
+        <w:tabs>
+          <w:tab w:val="left" w:pos="1440"/>
+        </w:tabs>
+        <w:spacing w:after="60" w:before="60"/>
+        <w:ind w:left="1440" w:hanging="1166"/>
+        <w:jc w:val="both"/>
+      </w:pPr>
+      <w:r>
         <w:t xml:space="preserve">2025-2027</w:t>
       </w:r>
       <w:r>
         <w:t xml:space="preserve">	</w:t>
       </w:r>
       <w:r>
-        <w:t xml:space="preserve">Student Co-Director, Remote Sensing Specialty Group, American Association of Geographers (AAG)</w:t>
+        <w:t xml:space="preserve">Student Co-Director, Remote Sensing Specialty Group, AAG</w:t>
       </w:r>
     </w:p>
     <w:p>
@@ -898,6 +917,25 @@
         <w:t xml:space="preserve">	</w:t>
       </w:r>
       <w:r>
+        <w:t xml:space="preserve">Travel Award, 34th ACM SIGSPATIAL International Conference on Advances in Geographic Information Systems (SIGSPATIAL 2026), Riverside, CA, $500</w:t>
+      </w:r>
+    </w:p>
+    <w:p>
+      <w:pPr>
+        <w:tabs>
+          <w:tab w:val="left" w:pos="1440"/>
+        </w:tabs>
+        <w:spacing w:after="30" w:before="30"/>
+        <w:ind w:left="1440" w:hanging="1166"/>
+        <w:jc w:val="both"/>
+      </w:pPr>
+      <w:r>
+        <w:t xml:space="preserve">2026</w:t>
+      </w:r>
+      <w:r>
+        <w:t xml:space="preserve">	</w:t>
+      </w:r>
+      <w:r>
         <w:t xml:space="preserve">2nd Place, AAG GIS Specialty Group (GISSG) Student Honors Paper Competition, $350</w:t>
       </w:r>
     </w:p>
@@ -1590,7 +1628,7 @@
       <w:r>
         <w:t xml:space="preserve"> A WebGIS / smartphone progressive web app with a risk-analyst assistant (Ray) that may only state what the evidence supports, and a Steward Harness that enforces outcome, process, and institutional validity in code. Submitted to OASIS @ ACM SIGSPATIAL 2026 (Track A). </w:t>
       </w:r>
-      <w:hyperlink w:history="1" r:id="rIdbiql6ybu5iugd1x5avnx8">
+      <w:hyperlink w:history="1" r:id="rIdmlspdi2s_fq2jixhqcdfu">
         <w:r>
           <w:rPr>
             <w:rStyle w:val="Hyperlink"/>
@@ -1601,7 +1639,7 @@
       <w:r>
         <w:t xml:space="preserve">] </w:t>
       </w:r>
-      <w:hyperlink w:history="1" r:id="rIdu8uj3yfp8xeujar9qoa0h">
+      <w:hyperlink w:history="1" r:id="rId8uvvo7m53v5saerlmfor3">
         <w:r>
           <w:rPr>
             <w:rStyle w:val="Hyperlink"/>
@@ -1694,7 +1732,7 @@
       <w:r>
         <w:t xml:space="preserve"> A multimodal generative framework that benchmarks cross-view image generation strategies integrating diffusion models, ControlNet, and VLM-guided semantic conditioning to synthesize realistic street-view imagery from post-disaster satellite imagery. </w:t>
       </w:r>
-      <w:hyperlink w:history="1" r:id="rIdyfdavsln7popotu3tcilt">
+      <w:hyperlink w:history="1" r:id="rId3hrq1ugod_smw1msgjiac">
         <w:r>
           <w:rPr>
             <w:rStyle w:val="Hyperlink"/>
@@ -1787,7 +1825,7 @@
       <w:r>
         <w:t xml:space="preserve"> An autonomous multi-agent GeoAI framework for hyperlocal, interpretable, near-real-time damage assessment that orchestrates specialized agents built on vision-language foundation models for cross-view perception, damage recognition, reasoning, and automated report generation without task-specific retraining. </w:t>
       </w:r>
-      <w:hyperlink w:history="1" r:id="rId_giktxf5i_oppn24oe_wx">
+      <w:hyperlink w:history="1" r:id="rIdlwayj50remx8w4gkcmpfl">
         <w:r>
           <w:rPr>
             <w:rStyle w:val="Hyperlink"/>
@@ -1866,7 +1904,7 @@
       <w:r>
         <w:t xml:space="preserve"> A multimodal arbitration framework for hyperlocal hurricane damage assessment from bi-temporal street-view imagery, integrating vision-language models (CLIP) with deep vision backbones (ViT-B/16) to improve robustness under post-disaster uncertainty. </w:t>
       </w:r>
-      <w:hyperlink w:history="1" r:id="rId3dbinrqkhlnn_xe3nxafj">
+      <w:hyperlink w:history="1" r:id="rIddidphmntosi0gjmz2mjtz">
         <w:r>
           <w:rPr>
             <w:rStyle w:val="Hyperlink"/>
@@ -1931,7 +1969,7 @@
       <w:r>
         <w:t xml:space="preserve"> A dual-channel framework using pre-trained vision backbones (Swin Transformer, ConvNeXt) on pre- and post-disaster street-view pairs to improve the accuracy and interpretability of damage-severity estimation. </w:t>
       </w:r>
-      <w:hyperlink w:history="1" r:id="rIdnwpleeauppik4wk_vuek2">
+      <w:hyperlink w:history="1" r:id="rIdaijjpfoujglxmqggpoepr">
         <w:r>
           <w:rPr>
             <w:rStyle w:val="Hyperlink"/>
@@ -2005,7 +2043,7 @@
       <w:r>
         <w:t xml:space="preserve">: featured by Mosaic - Geospatial Imaging Leaders (Prague, Czech Republic) for 360° street-level surveying and disaster-intelligence applications </w:t>
       </w:r>
-      <w:hyperlink w:history="1" r:id="rIdjofry1u1_c7blpvcpj7gv">
+      <w:hyperlink w:history="1" r:id="rIdxncbghd8kvshrnrqzp5uh">
         <w:r>
           <w:rPr>
             <w:rStyle w:val="Hyperlink"/>
@@ -2062,7 +2100,7 @@
       <w:r>
         <w:t xml:space="preserve">, AutonomousGeoAI4Science (AutoGeoAI4Sci), an open research community and hub for papers, tools, benchmarks, and collaboration advancing autonomous and multimodal GeoAI for scientific discovery. </w:t>
       </w:r>
-      <w:hyperlink w:history="1" r:id="rIdwb1nnemqxirnvrabejno3">
+      <w:hyperlink w:history="1" r:id="rId5m0diyjxsji3ockfwwd5q">
         <w:r>
           <w:rPr>
             <w:rStyle w:val="Hyperlink"/>
@@ -2168,7 +2206,7 @@
         </w:numPr>
         <w:spacing w:after="20" w:before="0"/>
       </w:pPr>
-      <w:hyperlink w:history="1" r:id="rIdypchhyfhyy33cu7qefnu3">
+      <w:hyperlink w:history="1" r:id="rId8pdnjp1-zatggqhwzlxyt">
         <w:r>
           <w:rPr>
             <w:rStyle w:val="Hyperlink"/>
@@ -2177,7 +2215,7 @@
         </w:r>
       </w:hyperlink>
       <w:r>
-        <w:t xml:space="preserve">: 412 citations, h-index 7, i10-index 7 (as of September 2026)</w:t>
+        <w:t xml:space="preserve">: 434 citations, h-index 8, i10-index 7 (as of October 2026)</w:t>
       </w:r>
     </w:p>
     <w:p>
@@ -2198,7 +2236,7 @@
         <w:t xml:space="preserve">Total</w:t>
       </w:r>
       <w:r>
-        <w:t xml:space="preserve">: 23 (published/accepted: 17; in review: 3; preprints: 3)</w:t>
+        <w:t xml:space="preserve">: 27 (published/accepted: 22; in review: 2; preprints: 3)</w:t>
       </w:r>
     </w:p>
     <w:p>
@@ -2212,7 +2250,7 @@
         <w:spacing w:after="20" w:before="0"/>
       </w:pPr>
       <w:r>
-        <w:t xml:space="preserve">First-Authored Publications: 8 (journal articles: 3, conference proceedings: 4, book chapters: 1)</w:t>
+        <w:t xml:space="preserve">First-Authored Publications: 9 (journal articles: 3, conference proceedings: 5, book chapters: 1)</w:t>
       </w:r>
     </w:p>
     <w:p>
@@ -2226,7 +2264,7 @@
         <w:spacing w:after="20" w:before="0"/>
       </w:pPr>
       <w:r>
-        <w:t xml:space="preserve">Co-Authored Publications: 15 (journal articles: 9, conference proceedings: 3, preprints: 3)</w:t>
+        <w:t xml:space="preserve">Co-Authored Publications: 18 (journal articles: 10, conference proceedings: 5, preprints: 3)</w:t>
       </w:r>
     </w:p>
     <w:p>
@@ -2310,7 +2348,7 @@
           </w:tcPr>
           <w:p>
             <w:r>
-              <w:t xml:space="preserve">8.</w:t>
+              <w:t xml:space="preserve">9.</w:t>
             </w:r>
           </w:p>
         </w:tc>
@@ -2354,7 +2392,7 @@
             <w:r>
               <w:t xml:space="preserve">. </w:t>
             </w:r>
-            <w:hyperlink w:history="1" r:id="rIdkell79vwhgxadgb7iu-2m">
+            <w:hyperlink w:history="1" r:id="rIdm0kgbs2-sfjhyaaq4myw-">
               <w:r>
                 <w:rPr>
                   <w:rStyle w:val="Hyperlink"/>
@@ -2419,7 +2457,7 @@
           </w:tcPr>
           <w:p>
             <w:r>
-              <w:t xml:space="preserve">7.</w:t>
+              <w:t xml:space="preserve">8.</w:t>
             </w:r>
           </w:p>
         </w:tc>
@@ -2451,19 +2489,121 @@
               <w:t xml:space="preserve">Yang, Y.</w:t>
             </w:r>
             <w:r>
-              <w:t xml:space="preserve">, Gong, W., Zhang, K., Zou, L., Tu, Z., Li, H., Li, Z., Ye, X. RAPID: A Reproducible Multi-Agent Pipeline for Interpretable Disaster Damage Assessment from Satellite and Street-View Imagery. </w:t>
+              <w:t xml:space="preserve">, Zou, L. When Satellite and Street Views Disagree: Cross-View Complementarity in Disaster Damage Assessment. </w:t>
             </w:r>
             <w:r>
               <w:rPr>
                 <w:i/>
                 <w:iCs/>
               </w:rPr>
+              <w:t xml:space="preserve">Proceedings of the 5th ACM SIGSPATIAL International Workshop on Searching and Mining Large Collections of Geospatial Data (GeoSearch '26)</w:t>
+            </w:r>
+            <w:r>
+              <w:t xml:space="preserve">, Riverside, CA (Lightning talk, 4 pages; Accepted). </w:t>
+            </w:r>
+            <w:hyperlink w:history="1" r:id="rIddd8fr4jwazm_irvdjcdbu">
+              <w:r>
+                <w:rPr>
+                  <w:rStyle w:val="Hyperlink"/>
+                </w:rPr>
+                <w:t xml:space="preserve">[arXiv:2610.04327</w:t>
+              </w:r>
+            </w:hyperlink>
+            <w:r>
+              <w:t xml:space="preserve">]</w:t>
+            </w:r>
+          </w:p>
+        </w:tc>
+      </w:tr>
+      <w:tr>
+        <w:trPr>
+          <w:cantSplit/>
+        </w:trPr>
+        <w:tc>
+          <w:tcPr>
+            <w:tcW w:type="dxa" w:w="1000"/>
+            <w:tcBorders>
+              <w:top w:val="none" w:color="FFFFFF" w:sz="0"/>
+              <w:left w:val="none" w:color="FFFFFF" w:sz="0"/>
+              <w:bottom w:val="none" w:color="FFFFFF" w:sz="0"/>
+              <w:right w:val="none" w:color="FFFFFF" w:sz="0"/>
+            </w:tcBorders>
+            <w:tcMar>
+              <w:top w:type="dxa" w:w="40"/>
+              <w:left w:type="dxa" w:w="60"/>
+              <w:bottom w:type="dxa" w:w="40"/>
+              <w:right w:type="dxa" w:w="60"/>
+            </w:tcMar>
+          </w:tcPr>
+          <w:p>
+            <w:r>
+              <w:t xml:space="preserve">2026</w:t>
+            </w:r>
+          </w:p>
+        </w:tc>
+        <w:tc>
+          <w:tcPr>
+            <w:tcW w:type="dxa" w:w="500"/>
+            <w:tcBorders>
+              <w:top w:val="none" w:color="FFFFFF" w:sz="0"/>
+              <w:left w:val="none" w:color="FFFFFF" w:sz="0"/>
+              <w:bottom w:val="none" w:color="FFFFFF" w:sz="0"/>
+              <w:right w:val="none" w:color="FFFFFF" w:sz="0"/>
+            </w:tcBorders>
+            <w:tcMar>
+              <w:top w:type="dxa" w:w="40"/>
+              <w:left w:type="dxa" w:w="60"/>
+              <w:bottom w:type="dxa" w:w="40"/>
+              <w:right w:type="dxa" w:w="60"/>
+            </w:tcMar>
+          </w:tcPr>
+          <w:p>
+            <w:r>
+              <w:t xml:space="preserve">7.</w:t>
+            </w:r>
+          </w:p>
+        </w:tc>
+        <w:tc>
+          <w:tcPr>
+            <w:tcW w:type="dxa" w:w="8580"/>
+            <w:tcBorders>
+              <w:top w:val="none" w:color="FFFFFF" w:sz="0"/>
+              <w:left w:val="none" w:color="FFFFFF" w:sz="0"/>
+              <w:bottom w:val="none" w:color="FFFFFF" w:sz="0"/>
+              <w:right w:val="none" w:color="FFFFFF" w:sz="0"/>
+            </w:tcBorders>
+            <w:tcMar>
+              <w:top w:type="dxa" w:w="40"/>
+              <w:left w:type="dxa" w:w="60"/>
+              <w:bottom w:type="dxa" w:w="40"/>
+              <w:right w:type="dxa" w:w="60"/>
+            </w:tcMar>
+          </w:tcPr>
+          <w:p>
+            <w:pPr>
+              <w:jc w:val="both"/>
+            </w:pPr>
+            <w:r>
+              <w:rPr>
+                <w:b/>
+                <w:bCs/>
+              </w:rPr>
+              <w:t xml:space="preserve">Yang, Y.</w:t>
+            </w:r>
+            <w:r>
+              <w:t xml:space="preserve">, Gong, W., Zhang, K., Zou, L., Tu, Z., Li, H., Li, Z., Ye, X. RAPID: A Reproducible Multi-Agent Pipeline for Interpretable Disaster Damage Assessment from Satellite and Street-View Imagery. </w:t>
+            </w:r>
+            <w:r>
+              <w:rPr>
+                <w:i/>
+                <w:iCs/>
+              </w:rPr>
               <w:t xml:space="preserve">Proceedings of the 34th ACM SIGSPATIAL International Conference on Advances in Geographic Information Systems (SIGSPATIAL '26)</w:t>
             </w:r>
             <w:r>
               <w:t xml:space="preserve">, Riverside, CA (Applications Track full paper, 12 pages; Accepted). </w:t>
             </w:r>
-            <w:hyperlink w:history="1" r:id="rIdvs7i70ocfoad2qhwgnx4q">
+            <w:hyperlink w:history="1" r:id="rIdzq1zzzcf_dv5bg2klmeci">
               <w:r>
                 <w:rPr>
                   <w:rStyle w:val="Hyperlink"/>
@@ -2565,7 +2705,7 @@
             <w:r>
               <w:t xml:space="preserve">, St. Louis, MO (Accepted). </w:t>
             </w:r>
-            <w:hyperlink w:history="1" r:id="rId9a6nwckuze-qo9aylud_j">
+            <w:hyperlink w:history="1" r:id="rIdosysaiebqmllpmj-dfamr">
               <w:r>
                 <w:rPr>
                   <w:rStyle w:val="Hyperlink"/>
@@ -2667,7 +2807,7 @@
             <w:r>
               <w:t xml:space="preserve">, Washington, D.C. (Accepted). </w:t>
             </w:r>
-            <w:hyperlink w:history="1" r:id="rIdmluorpb-5_-lvt8cpolg2">
+            <w:hyperlink w:history="1" r:id="rIdhyclq9al3xd9sc_66rew_">
               <w:r>
                 <w:rPr>
                   <w:rStyle w:val="Hyperlink"/>
@@ -2769,7 +2909,7 @@
             <w:r>
               <w:t xml:space="preserve">, 121, 102335. </w:t>
             </w:r>
-            <w:hyperlink w:history="1" r:id="rIdkjeaspren5n9uri8abuby">
+            <w:hyperlink w:history="1" r:id="rId56ifv7_5mgzzplsnntzpc">
               <w:r>
                 <w:rPr>
                   <w:rStyle w:val="Hyperlink"/>
@@ -2878,7 +3018,7 @@
             <w:r>
               <w:t xml:space="preserve">, 10, 310. </w:t>
             </w:r>
-            <w:hyperlink w:history="1" r:id="rIdwcsxr9qm8efrcoyyk-yev">
+            <w:hyperlink w:history="1" r:id="rIdvc6-mqvsxnebjdncrhhyd">
               <w:r>
                 <w:rPr>
                   <w:rStyle w:val="Hyperlink"/>
@@ -2987,7 +3127,7 @@
             <w:r>
               <w:t xml:space="preserve"> (Chapter 7, pp. 113-122). Redlands, CA: Esri Press. </w:t>
             </w:r>
-            <w:hyperlink w:history="1" r:id="rIddysxgaivx3oynx403jou3">
+            <w:hyperlink w:history="1" r:id="rIdkxyelxbp9gacvskzix15h">
               <w:r>
                 <w:rPr>
                   <w:rStyle w:val="Hyperlink"/>
@@ -3089,7 +3229,7 @@
             <w:r>
               <w:t xml:space="preserve">, 14(16), 7091. </w:t>
             </w:r>
-            <w:hyperlink w:history="1" r:id="rIdwzejuge0tl2734oi_avwz">
+            <w:hyperlink w:history="1" r:id="rIdgutvndltp6jbjhjbkseqq">
               <w:r>
                 <w:rPr>
                   <w:rStyle w:val="Hyperlink"/>
@@ -3185,7 +3325,7 @@
           </w:tcPr>
           <w:p>
             <w:r>
-              <w:t xml:space="preserve">9.</w:t>
+              <w:t xml:space="preserve">10.</w:t>
             </w:r>
           </w:p>
         </w:tc>
@@ -3232,7 +3372,7 @@
             <w:r>
               <w:t xml:space="preserve">. </w:t>
             </w:r>
-            <w:hyperlink w:history="1" r:id="rId_g65kpnntt2xdpqaoprcg">
+            <w:hyperlink w:history="1" r:id="rIdwal98uwhgupkejc3etbiu">
               <w:r>
                 <w:rPr>
                   <w:rStyle w:val="Hyperlink"/>
@@ -3268,7 +3408,7 @@
           </w:tcPr>
           <w:p>
             <w:r>
-              <w:t xml:space="preserve">Review</w:t>
+              <w:t xml:space="preserve">2026</w:t>
             </w:r>
           </w:p>
         </w:tc>
@@ -3290,7 +3430,7 @@
           </w:tcPr>
           <w:p>
             <w:r>
-              <w:t xml:space="preserve">8.</w:t>
+              <w:t xml:space="preserve">9.</w:t>
             </w:r>
           </w:p>
         </w:tc>
@@ -3325,7 +3465,7 @@
               <w:t xml:space="preserve">Yang, Y.</w:t>
             </w:r>
             <w:r>
-              <w:t xml:space="preserve">, Zhou, B. Predicting Healthcare System Visitation Flow by Integrating Hospital Attributes and Population Socioeconomics with Human Mobility Data. </w:t>
+              <w:t xml:space="preserve">, Zhou, B. Modeling Hospital Visitation Flows Through Distance-Attractiveness Tradeoffs: Integrating Human Mobility, Hospital Attributes, and Socioeconomic Context. </w:t>
             </w:r>
             <w:r>
               <w:rPr>
@@ -3335,9 +3475,9 @@
               <w:t xml:space="preserve">Transactions in GIS</w:t>
             </w:r>
             <w:r>
-              <w:t xml:space="preserve">. </w:t>
-            </w:r>
-            <w:hyperlink w:history="1" r:id="rId2tsbmfq8kviqlt3fsmmgo">
+              <w:t xml:space="preserve"> (Accepted). </w:t>
+            </w:r>
+            <w:hyperlink w:history="1" r:id="rIdonsgo2pljnaxffufrx7qd">
               <w:r>
                 <w:rPr>
                   <w:rStyle w:val="Hyperlink"/>
@@ -3395,7 +3535,7 @@
           </w:tcPr>
           <w:p>
             <w:r>
-              <w:t xml:space="preserve">7.</w:t>
+              <w:t xml:space="preserve">8.</w:t>
             </w:r>
           </w:p>
         </w:tc>
@@ -3420,7 +3560,7 @@
               <w:jc w:val="both"/>
             </w:pPr>
             <w:r>
-              <w:t xml:space="preserve">Wang, S., Liu, H., Wu, C.Y., Huang, X., Wang, R., </w:t>
+              <w:t xml:space="preserve">Kim, J., Shakya, A.R., Kelly, J., </w:t>
             </w:r>
             <w:r>
               <w:rPr>
@@ -3430,19 +3570,19 @@
               <w:t xml:space="preserve">Yang, Y.</w:t>
             </w:r>
             <w:r>
-              <w:t xml:space="preserve">, Corcoran, J., Lai, S., Xia, X., Liu, Y. The Boiling Frog Effect: Global Warming Delays Emotional Impacts of Air Pollution in Warmer Climates. </w:t>
+              <w:t xml:space="preserve">, Lee, S., Brody, S.D., Mostafavi, A. Debris-Cast: A Two-Stage Machine Learning Framework for Hurricane Debris Prediction Using Multi-Source Geospatial Data. </w:t>
             </w:r>
             <w:r>
               <w:rPr>
                 <w:i/>
                 <w:iCs/>
               </w:rPr>
-              <w:t xml:space="preserve">Journal of Hazardous Materials</w:t>
-            </w:r>
-            <w:r>
-              <w:t xml:space="preserve">, 142440. </w:t>
-            </w:r>
-            <w:hyperlink w:history="1" r:id="rIdpxwomcyeseql4tmsthata">
+              <w:t xml:space="preserve">International Journal of Disaster Risk Reduction</w:t>
+            </w:r>
+            <w:r>
+              <w:t xml:space="preserve">, 146, 106470. </w:t>
+            </w:r>
+            <w:hyperlink w:history="1" r:id="rIdc8lat_umtpjljenhkt0mn">
               <w:r>
                 <w:rPr>
                   <w:rStyle w:val="Hyperlink"/>
@@ -3500,7 +3640,7 @@
           </w:tcPr>
           <w:p>
             <w:r>
-              <w:t xml:space="preserve">6.</w:t>
+              <w:t xml:space="preserve">7.</w:t>
             </w:r>
           </w:p>
         </w:tc>
@@ -3525,7 +3665,7 @@
               <w:jc w:val="both"/>
             </w:pPr>
             <w:r>
-              <w:t xml:space="preserve">Li, Z., Li, H., </w:t>
+              <w:t xml:space="preserve">Wang, S., Liu, H., Wu, C.Y., Huang, X., Wang, R., </w:t>
             </w:r>
             <w:r>
               <w:rPr>
@@ -3535,19 +3675,19 @@
               <w:t xml:space="preserve">Yang, Y.</w:t>
             </w:r>
             <w:r>
-              <w:t xml:space="preserve">, Wang, S., Zhu, Y. Integrating Earth Observation Data into the Tri-Environmental Evaluation of the Economic Cost of Natural Disasters: A Case Study of the 2025 LA Wildfire. </w:t>
+              <w:t xml:space="preserve">, Corcoran, J., Lai, S., Xia, X., Liu, Y. The Boiling Frog Effect: Global Warming Delays Emotional Impacts of Air Pollution in Warmer Climates. </w:t>
             </w:r>
             <w:r>
               <w:rPr>
                 <w:i/>
                 <w:iCs/>
               </w:rPr>
-              <w:t xml:space="preserve">International Journal of Applied Earth Observation and Geoinformation</w:t>
-            </w:r>
-            <w:r>
-              <w:t xml:space="preserve">, 150, 105342. </w:t>
-            </w:r>
-            <w:hyperlink w:history="1" r:id="rId3fgvxrboygqovjteyrzhg">
+              <w:t xml:space="preserve">Journal of Hazardous Materials</w:t>
+            </w:r>
+            <w:r>
+              <w:t xml:space="preserve">, 142440. </w:t>
+            </w:r>
+            <w:hyperlink w:history="1" r:id="rIdqifswveedxwlxsxnefznk">
               <w:r>
                 <w:rPr>
                   <w:rStyle w:val="Hyperlink"/>
@@ -3605,7 +3745,7 @@
           </w:tcPr>
           <w:p>
             <w:r>
-              <w:t xml:space="preserve">5.</w:t>
+              <w:t xml:space="preserve">6.</w:t>
             </w:r>
           </w:p>
         </w:tc>
@@ -3630,7 +3770,7 @@
               <w:jc w:val="both"/>
             </w:pPr>
             <w:r>
-              <w:t xml:space="preserve">Ye, X., Gong, W., </w:t>
+              <w:t xml:space="preserve">Li, Z., Li, H., </w:t>
             </w:r>
             <w:r>
               <w:rPr>
@@ -3640,207 +3780,19 @@
               <w:t xml:space="preserve">Yang, Y.</w:t>
             </w:r>
             <w:r>
-              <w:t xml:space="preserve">, Zou, L., Tu, Z., Huang, X., Li, Z., Ning, H., Wu, L. Towards Agentic Urban Digital Twins (AUDiTs): Advancing New Urban Science through Human-AI Co-Learning Agents. </w:t>
+              <w:t xml:space="preserve">, Wang, S., Zhu, Y. Integrating Earth Observation Data into the Tri-Environmental Evaluation of the Economic Cost of Natural Disasters: A Case Study of the 2025 LA Wildfire. </w:t>
             </w:r>
             <w:r>
               <w:rPr>
                 <w:i/>
                 <w:iCs/>
               </w:rPr>
-              <w:t xml:space="preserve">Urban Informatics</w:t>
-            </w:r>
-            <w:r>
-              <w:t xml:space="preserve">, 5(1), 9.</w:t>
-            </w:r>
-          </w:p>
-        </w:tc>
-      </w:tr>
-      <w:tr>
-        <w:trPr>
-          <w:cantSplit/>
-        </w:trPr>
-        <w:tc>
-          <w:tcPr>
-            <w:tcW w:type="dxa" w:w="1000"/>
-            <w:tcBorders>
-              <w:top w:val="none" w:color="FFFFFF" w:sz="0"/>
-              <w:left w:val="none" w:color="FFFFFF" w:sz="0"/>
-              <w:bottom w:val="none" w:color="FFFFFF" w:sz="0"/>
-              <w:right w:val="none" w:color="FFFFFF" w:sz="0"/>
-            </w:tcBorders>
-            <w:tcMar>
-              <w:top w:type="dxa" w:w="40"/>
-              <w:left w:type="dxa" w:w="60"/>
-              <w:bottom w:type="dxa" w:w="40"/>
-              <w:right w:type="dxa" w:w="60"/>
-            </w:tcMar>
-          </w:tcPr>
-          <w:p>
-            <w:r>
-              <w:t xml:space="preserve">2025</w:t>
-            </w:r>
-          </w:p>
-        </w:tc>
-        <w:tc>
-          <w:tcPr>
-            <w:tcW w:type="dxa" w:w="500"/>
-            <w:tcBorders>
-              <w:top w:val="none" w:color="FFFFFF" w:sz="0"/>
-              <w:left w:val="none" w:color="FFFFFF" w:sz="0"/>
-              <w:bottom w:val="none" w:color="FFFFFF" w:sz="0"/>
-              <w:right w:val="none" w:color="FFFFFF" w:sz="0"/>
-            </w:tcBorders>
-            <w:tcMar>
-              <w:top w:type="dxa" w:w="40"/>
-              <w:left w:type="dxa" w:w="60"/>
-              <w:bottom w:type="dxa" w:w="40"/>
-              <w:right w:type="dxa" w:w="60"/>
-            </w:tcMar>
-          </w:tcPr>
-          <w:p>
-            <w:r>
-              <w:t xml:space="preserve">4.</w:t>
-            </w:r>
-          </w:p>
-        </w:tc>
-        <w:tc>
-          <w:tcPr>
-            <w:tcW w:type="dxa" w:w="8580"/>
-            <w:tcBorders>
-              <w:top w:val="none" w:color="FFFFFF" w:sz="0"/>
-              <w:left w:val="none" w:color="FFFFFF" w:sz="0"/>
-              <w:bottom w:val="none" w:color="FFFFFF" w:sz="0"/>
-              <w:right w:val="none" w:color="FFFFFF" w:sz="0"/>
-            </w:tcBorders>
-            <w:tcMar>
-              <w:top w:type="dxa" w:w="40"/>
-              <w:left w:type="dxa" w:w="60"/>
-              <w:bottom w:type="dxa" w:w="40"/>
-              <w:right w:type="dxa" w:w="60"/>
-            </w:tcMar>
-          </w:tcPr>
-          <w:p>
-            <w:pPr>
-              <w:jc w:val="both"/>
-            </w:pPr>
-            <w:r>
-              <w:t xml:space="preserve">Wang, Y., Yin, H., </w:t>
-            </w:r>
-            <w:r>
-              <w:rPr>
-                <w:b/>
-                <w:bCs/>
-              </w:rPr>
-              <w:t xml:space="preserve">Yang, Y.</w:t>
-            </w:r>
-            <w:r>
-              <w:t xml:space="preserve">, Zhao, C., Wang, S. Navigating Spatial Inequities in Freight Truck Crash Severity via Counterfactual Inference in Los Angeles. </w:t>
-            </w:r>
-            <w:r>
-              <w:rPr>
-                <w:i/>
-                <w:iCs/>
-              </w:rPr>
-              <w:t xml:space="preserve">Journal of Transport Geography</w:t>
-            </w:r>
-            <w:r>
-              <w:t xml:space="preserve">, 128, 104387.</w:t>
-            </w:r>
-          </w:p>
-        </w:tc>
-      </w:tr>
-      <w:tr>
-        <w:trPr>
-          <w:cantSplit/>
-        </w:trPr>
-        <w:tc>
-          <w:tcPr>
-            <w:tcW w:type="dxa" w:w="1000"/>
-            <w:tcBorders>
-              <w:top w:val="none" w:color="FFFFFF" w:sz="0"/>
-              <w:left w:val="none" w:color="FFFFFF" w:sz="0"/>
-              <w:bottom w:val="none" w:color="FFFFFF" w:sz="0"/>
-              <w:right w:val="none" w:color="FFFFFF" w:sz="0"/>
-            </w:tcBorders>
-            <w:tcMar>
-              <w:top w:type="dxa" w:w="40"/>
-              <w:left w:type="dxa" w:w="60"/>
-              <w:bottom w:type="dxa" w:w="40"/>
-              <w:right w:type="dxa" w:w="60"/>
-            </w:tcMar>
-          </w:tcPr>
-          <w:p>
-            <w:r>
-              <w:t xml:space="preserve">2025</w:t>
-            </w:r>
-          </w:p>
-        </w:tc>
-        <w:tc>
-          <w:tcPr>
-            <w:tcW w:type="dxa" w:w="500"/>
-            <w:tcBorders>
-              <w:top w:val="none" w:color="FFFFFF" w:sz="0"/>
-              <w:left w:val="none" w:color="FFFFFF" w:sz="0"/>
-              <w:bottom w:val="none" w:color="FFFFFF" w:sz="0"/>
-              <w:right w:val="none" w:color="FFFFFF" w:sz="0"/>
-            </w:tcBorders>
-            <w:tcMar>
-              <w:top w:type="dxa" w:w="40"/>
-              <w:left w:type="dxa" w:w="60"/>
-              <w:bottom w:type="dxa" w:w="40"/>
-              <w:right w:type="dxa" w:w="60"/>
-            </w:tcMar>
-          </w:tcPr>
-          <w:p>
-            <w:r>
-              <w:t xml:space="preserve">3.</w:t>
-            </w:r>
-          </w:p>
-        </w:tc>
-        <w:tc>
-          <w:tcPr>
-            <w:tcW w:type="dxa" w:w="8580"/>
-            <w:tcBorders>
-              <w:top w:val="none" w:color="FFFFFF" w:sz="0"/>
-              <w:left w:val="none" w:color="FFFFFF" w:sz="0"/>
-              <w:bottom w:val="none" w:color="FFFFFF" w:sz="0"/>
-              <w:right w:val="none" w:color="FFFFFF" w:sz="0"/>
-            </w:tcBorders>
-            <w:tcMar>
-              <w:top w:type="dxa" w:w="40"/>
-              <w:left w:type="dxa" w:w="60"/>
-              <w:bottom w:type="dxa" w:w="40"/>
-              <w:right w:type="dxa" w:w="60"/>
-            </w:tcMar>
-          </w:tcPr>
-          <w:p>
-            <w:pPr>
-              <w:jc w:val="both"/>
-            </w:pPr>
-            <w:r>
-              <w:t xml:space="preserve">Gong, W., Ye, X., Wu, K., Jamonnak, S., Zhang, W., </w:t>
-            </w:r>
-            <w:r>
-              <w:rPr>
-                <w:b/>
-                <w:bCs/>
-              </w:rPr>
-              <w:t xml:space="preserve">Yang, Y.</w:t>
-            </w:r>
-            <w:r>
-              <w:t xml:space="preserve">, Huang, X. Integrating Spatiotemporal Vision Transformer into Digital Twins for High-Resolution Heat Stress Forecasting in Campus Environments. </w:t>
-            </w:r>
-            <w:r>
-              <w:rPr>
-                <w:i/>
-                <w:iCs/>
-              </w:rPr>
-              <w:t xml:space="preserve">Journal of Planning Education and Research</w:t>
-            </w:r>
-            <w:r>
-              <w:t xml:space="preserve">, 1-15. </w:t>
-            </w:r>
-            <w:hyperlink w:history="1" r:id="rIdxydpkcg0moxqkncwqygx0">
+              <w:t xml:space="preserve">International Journal of Applied Earth Observation and Geoinformation</w:t>
+            </w:r>
+            <w:r>
+              <w:t xml:space="preserve">, 150, 105342. </w:t>
+            </w:r>
+            <w:hyperlink w:history="1" r:id="rIdls7yz9jyh6pqwyngviv0t">
               <w:r>
                 <w:rPr>
                   <w:rStyle w:val="Hyperlink"/>
@@ -3876,7 +3828,7 @@
           </w:tcPr>
           <w:p>
             <w:r>
-              <w:t xml:space="preserve">2020</w:t>
+              <w:t xml:space="preserve">2026</w:t>
             </w:r>
           </w:p>
         </w:tc>
@@ -3898,7 +3850,7 @@
           </w:tcPr>
           <w:p>
             <w:r>
-              <w:t xml:space="preserve">2.</w:t>
+              <w:t xml:space="preserve">5.</w:t>
             </w:r>
           </w:p>
         </w:tc>
@@ -3923,7 +3875,7 @@
               <w:jc w:val="both"/>
             </w:pPr>
             <w:r>
-              <w:t xml:space="preserve">Zhang, Y., Chen, J., Liu, B., </w:t>
+              <w:t xml:space="preserve">Ye, X., Gong, W., </w:t>
             </w:r>
             <w:r>
               <w:rPr>
@@ -3933,19 +3885,312 @@
               <w:t xml:space="preserve">Yang, Y.</w:t>
             </w:r>
             <w:r>
-              <w:t xml:space="preserve">, Li, H., Zheng, X., Chen, X., Ren, T., Xiong, N. COVID-19 Public Opinion and Emotion Monitoring System Based on Time Series Thermal New Word Mining. </w:t>
+              <w:t xml:space="preserve">, Zou, L., Tu, Z., Huang, X., Li, Z., Ning, H., Wu, L. Towards Agentic Urban Digital Twins (AUDiTs): Advancing New Urban Science through Human-AI Co-Learning Agents. </w:t>
             </w:r>
             <w:r>
               <w:rPr>
                 <w:i/>
                 <w:iCs/>
               </w:rPr>
+              <w:t xml:space="preserve">Urban Informatics</w:t>
+            </w:r>
+            <w:r>
+              <w:t xml:space="preserve">, 5(1), 9.</w:t>
+            </w:r>
+          </w:p>
+        </w:tc>
+      </w:tr>
+      <w:tr>
+        <w:trPr>
+          <w:cantSplit/>
+        </w:trPr>
+        <w:tc>
+          <w:tcPr>
+            <w:tcW w:type="dxa" w:w="1000"/>
+            <w:tcBorders>
+              <w:top w:val="none" w:color="FFFFFF" w:sz="0"/>
+              <w:left w:val="none" w:color="FFFFFF" w:sz="0"/>
+              <w:bottom w:val="none" w:color="FFFFFF" w:sz="0"/>
+              <w:right w:val="none" w:color="FFFFFF" w:sz="0"/>
+            </w:tcBorders>
+            <w:tcMar>
+              <w:top w:type="dxa" w:w="40"/>
+              <w:left w:type="dxa" w:w="60"/>
+              <w:bottom w:type="dxa" w:w="40"/>
+              <w:right w:type="dxa" w:w="60"/>
+            </w:tcMar>
+          </w:tcPr>
+          <w:p>
+            <w:r>
+              <w:t xml:space="preserve">2025</w:t>
+            </w:r>
+          </w:p>
+        </w:tc>
+        <w:tc>
+          <w:tcPr>
+            <w:tcW w:type="dxa" w:w="500"/>
+            <w:tcBorders>
+              <w:top w:val="none" w:color="FFFFFF" w:sz="0"/>
+              <w:left w:val="none" w:color="FFFFFF" w:sz="0"/>
+              <w:bottom w:val="none" w:color="FFFFFF" w:sz="0"/>
+              <w:right w:val="none" w:color="FFFFFF" w:sz="0"/>
+            </w:tcBorders>
+            <w:tcMar>
+              <w:top w:type="dxa" w:w="40"/>
+              <w:left w:type="dxa" w:w="60"/>
+              <w:bottom w:type="dxa" w:w="40"/>
+              <w:right w:type="dxa" w:w="60"/>
+            </w:tcMar>
+          </w:tcPr>
+          <w:p>
+            <w:r>
+              <w:t xml:space="preserve">4.</w:t>
+            </w:r>
+          </w:p>
+        </w:tc>
+        <w:tc>
+          <w:tcPr>
+            <w:tcW w:type="dxa" w:w="8580"/>
+            <w:tcBorders>
+              <w:top w:val="none" w:color="FFFFFF" w:sz="0"/>
+              <w:left w:val="none" w:color="FFFFFF" w:sz="0"/>
+              <w:bottom w:val="none" w:color="FFFFFF" w:sz="0"/>
+              <w:right w:val="none" w:color="FFFFFF" w:sz="0"/>
+            </w:tcBorders>
+            <w:tcMar>
+              <w:top w:type="dxa" w:w="40"/>
+              <w:left w:type="dxa" w:w="60"/>
+              <w:bottom w:type="dxa" w:w="40"/>
+              <w:right w:type="dxa" w:w="60"/>
+            </w:tcMar>
+          </w:tcPr>
+          <w:p>
+            <w:pPr>
+              <w:jc w:val="both"/>
+            </w:pPr>
+            <w:r>
+              <w:t xml:space="preserve">Wang, Y., Yin, H., </w:t>
+            </w:r>
+            <w:r>
+              <w:rPr>
+                <w:b/>
+                <w:bCs/>
+              </w:rPr>
+              <w:t xml:space="preserve">Yang, Y.</w:t>
+            </w:r>
+            <w:r>
+              <w:t xml:space="preserve">, Zhao, C., Wang, S. Navigating Spatial Inequities in Freight Truck Crash Severity via Counterfactual Inference in Los Angeles. </w:t>
+            </w:r>
+            <w:r>
+              <w:rPr>
+                <w:i/>
+                <w:iCs/>
+              </w:rPr>
+              <w:t xml:space="preserve">Journal of Transport Geography</w:t>
+            </w:r>
+            <w:r>
+              <w:t xml:space="preserve">, 128, 104387.</w:t>
+            </w:r>
+          </w:p>
+        </w:tc>
+      </w:tr>
+      <w:tr>
+        <w:trPr>
+          <w:cantSplit/>
+        </w:trPr>
+        <w:tc>
+          <w:tcPr>
+            <w:tcW w:type="dxa" w:w="1000"/>
+            <w:tcBorders>
+              <w:top w:val="none" w:color="FFFFFF" w:sz="0"/>
+              <w:left w:val="none" w:color="FFFFFF" w:sz="0"/>
+              <w:bottom w:val="none" w:color="FFFFFF" w:sz="0"/>
+              <w:right w:val="none" w:color="FFFFFF" w:sz="0"/>
+            </w:tcBorders>
+            <w:tcMar>
+              <w:top w:type="dxa" w:w="40"/>
+              <w:left w:type="dxa" w:w="60"/>
+              <w:bottom w:type="dxa" w:w="40"/>
+              <w:right w:type="dxa" w:w="60"/>
+            </w:tcMar>
+          </w:tcPr>
+          <w:p>
+            <w:r>
+              <w:t xml:space="preserve">2025</w:t>
+            </w:r>
+          </w:p>
+        </w:tc>
+        <w:tc>
+          <w:tcPr>
+            <w:tcW w:type="dxa" w:w="500"/>
+            <w:tcBorders>
+              <w:top w:val="none" w:color="FFFFFF" w:sz="0"/>
+              <w:left w:val="none" w:color="FFFFFF" w:sz="0"/>
+              <w:bottom w:val="none" w:color="FFFFFF" w:sz="0"/>
+              <w:right w:val="none" w:color="FFFFFF" w:sz="0"/>
+            </w:tcBorders>
+            <w:tcMar>
+              <w:top w:type="dxa" w:w="40"/>
+              <w:left w:type="dxa" w:w="60"/>
+              <w:bottom w:type="dxa" w:w="40"/>
+              <w:right w:type="dxa" w:w="60"/>
+            </w:tcMar>
+          </w:tcPr>
+          <w:p>
+            <w:r>
+              <w:t xml:space="preserve">3.</w:t>
+            </w:r>
+          </w:p>
+        </w:tc>
+        <w:tc>
+          <w:tcPr>
+            <w:tcW w:type="dxa" w:w="8580"/>
+            <w:tcBorders>
+              <w:top w:val="none" w:color="FFFFFF" w:sz="0"/>
+              <w:left w:val="none" w:color="FFFFFF" w:sz="0"/>
+              <w:bottom w:val="none" w:color="FFFFFF" w:sz="0"/>
+              <w:right w:val="none" w:color="FFFFFF" w:sz="0"/>
+            </w:tcBorders>
+            <w:tcMar>
+              <w:top w:type="dxa" w:w="40"/>
+              <w:left w:type="dxa" w:w="60"/>
+              <w:bottom w:type="dxa" w:w="40"/>
+              <w:right w:type="dxa" w:w="60"/>
+            </w:tcMar>
+          </w:tcPr>
+          <w:p>
+            <w:pPr>
+              <w:jc w:val="both"/>
+            </w:pPr>
+            <w:r>
+              <w:t xml:space="preserve">Gong, W., Ye, X., Wu, K., Jamonnak, S., Zhang, W., </w:t>
+            </w:r>
+            <w:r>
+              <w:rPr>
+                <w:b/>
+                <w:bCs/>
+              </w:rPr>
+              <w:t xml:space="preserve">Yang, Y.</w:t>
+            </w:r>
+            <w:r>
+              <w:t xml:space="preserve">, Huang, X. Integrating Spatiotemporal Vision Transformer into Digital Twins for High-Resolution Heat Stress Forecasting in Campus Environments. </w:t>
+            </w:r>
+            <w:r>
+              <w:rPr>
+                <w:i/>
+                <w:iCs/>
+              </w:rPr>
+              <w:t xml:space="preserve">Journal of Planning Education and Research</w:t>
+            </w:r>
+            <w:r>
+              <w:t xml:space="preserve">, 1-15. </w:t>
+            </w:r>
+            <w:hyperlink w:history="1" r:id="rIdndejjj_cdakokf4qw5njy">
+              <w:r>
+                <w:rPr>
+                  <w:rStyle w:val="Hyperlink"/>
+                </w:rPr>
+                <w:t xml:space="preserve">[link</w:t>
+              </w:r>
+            </w:hyperlink>
+            <w:r>
+              <w:t xml:space="preserve">]</w:t>
+            </w:r>
+          </w:p>
+        </w:tc>
+      </w:tr>
+      <w:tr>
+        <w:trPr>
+          <w:cantSplit/>
+        </w:trPr>
+        <w:tc>
+          <w:tcPr>
+            <w:tcW w:type="dxa" w:w="1000"/>
+            <w:tcBorders>
+              <w:top w:val="none" w:color="FFFFFF" w:sz="0"/>
+              <w:left w:val="none" w:color="FFFFFF" w:sz="0"/>
+              <w:bottom w:val="none" w:color="FFFFFF" w:sz="0"/>
+              <w:right w:val="none" w:color="FFFFFF" w:sz="0"/>
+            </w:tcBorders>
+            <w:tcMar>
+              <w:top w:type="dxa" w:w="40"/>
+              <w:left w:type="dxa" w:w="60"/>
+              <w:bottom w:type="dxa" w:w="40"/>
+              <w:right w:type="dxa" w:w="60"/>
+            </w:tcMar>
+          </w:tcPr>
+          <w:p>
+            <w:r>
+              <w:t xml:space="preserve">2020</w:t>
+            </w:r>
+          </w:p>
+        </w:tc>
+        <w:tc>
+          <w:tcPr>
+            <w:tcW w:type="dxa" w:w="500"/>
+            <w:tcBorders>
+              <w:top w:val="none" w:color="FFFFFF" w:sz="0"/>
+              <w:left w:val="none" w:color="FFFFFF" w:sz="0"/>
+              <w:bottom w:val="none" w:color="FFFFFF" w:sz="0"/>
+              <w:right w:val="none" w:color="FFFFFF" w:sz="0"/>
+            </w:tcBorders>
+            <w:tcMar>
+              <w:top w:type="dxa" w:w="40"/>
+              <w:left w:type="dxa" w:w="60"/>
+              <w:bottom w:type="dxa" w:w="40"/>
+              <w:right w:type="dxa" w:w="60"/>
+            </w:tcMar>
+          </w:tcPr>
+          <w:p>
+            <w:r>
+              <w:t xml:space="preserve">2.</w:t>
+            </w:r>
+          </w:p>
+        </w:tc>
+        <w:tc>
+          <w:tcPr>
+            <w:tcW w:type="dxa" w:w="8580"/>
+            <w:tcBorders>
+              <w:top w:val="none" w:color="FFFFFF" w:sz="0"/>
+              <w:left w:val="none" w:color="FFFFFF" w:sz="0"/>
+              <w:bottom w:val="none" w:color="FFFFFF" w:sz="0"/>
+              <w:right w:val="none" w:color="FFFFFF" w:sz="0"/>
+            </w:tcBorders>
+            <w:tcMar>
+              <w:top w:type="dxa" w:w="40"/>
+              <w:left w:type="dxa" w:w="60"/>
+              <w:bottom w:type="dxa" w:w="40"/>
+              <w:right w:type="dxa" w:w="60"/>
+            </w:tcMar>
+          </w:tcPr>
+          <w:p>
+            <w:pPr>
+              <w:jc w:val="both"/>
+            </w:pPr>
+            <w:r>
+              <w:t xml:space="preserve">Zhang, Y., Chen, J., Liu, B., </w:t>
+            </w:r>
+            <w:r>
+              <w:rPr>
+                <w:b/>
+                <w:bCs/>
+              </w:rPr>
+              <w:t xml:space="preserve">Yang, Y.</w:t>
+            </w:r>
+            <w:r>
+              <w:t xml:space="preserve">, Li, H., Zheng, X., Chen, X., Ren, T., Xiong, N. COVID-19 Public Opinion and Emotion Monitoring System Based on Time Series Thermal New Word Mining. </w:t>
+            </w:r>
+            <w:r>
+              <w:rPr>
+                <w:i/>
+                <w:iCs/>
+              </w:rPr>
               <w:t xml:space="preserve">Computers, Materials &amp; Continua</w:t>
             </w:r>
             <w:r>
               <w:t xml:space="preserve">, 64(3), 1415-1434. </w:t>
             </w:r>
-            <w:hyperlink w:history="1" r:id="rIdpk5hf6zqnautdd_bnks1y">
+            <w:hyperlink w:history="1" r:id="rIdzae0xnvoyaq6qqcaagspe">
               <w:r>
                 <w:rPr>
                   <w:rStyle w:val="Hyperlink"/>
@@ -4135,7 +4380,7 @@
           </w:tcPr>
           <w:p>
             <w:r>
-              <w:t xml:space="preserve">3.</w:t>
+              <w:t xml:space="preserve">5.</w:t>
             </w:r>
           </w:p>
         </w:tc>
@@ -4160,7 +4405,7 @@
               <w:jc w:val="both"/>
             </w:pPr>
             <w:r>
-              <w:t xml:space="preserve">Tian, H., Cai, H., </w:t>
+              <w:t xml:space="preserve">Kim, J., </w:t>
             </w:r>
             <w:r>
               <w:rPr>
@@ -4170,19 +4415,218 @@
               <w:t xml:space="preserve">Yang, Y.</w:t>
             </w:r>
             <w:r>
-              <w:t xml:space="preserve"> BEACON: Behavioral and Semantic Enrichment of AlphaEarth Embeddings through Tri-Modal Contrastive Learning. </w:t>
+              <w:t xml:space="preserve">, Shakya, A., Kelly, J. Optimizing HPC Performance for CDC-Based Storage and Reconstruction of High-Resolution Imagery. </w:t>
             </w:r>
             <w:r>
               <w:rPr>
                 <w:i/>
                 <w:iCs/>
               </w:rPr>
+              <w:t xml:space="preserve">SC26: The International Conference for High Performance Computing, Networking, Storage, and Analysis</w:t>
+            </w:r>
+            <w:r>
+              <w:t xml:space="preserve">, Chicago, IL (Research Poster; Accepted). </w:t>
+            </w:r>
+            <w:hyperlink w:history="1" r:id="rIdxjg_vgbyitfjp1otbuewh">
+              <w:r>
+                <w:rPr>
+                  <w:rStyle w:val="Hyperlink"/>
+                </w:rPr>
+                <w:t xml:space="preserve">[link</w:t>
+              </w:r>
+            </w:hyperlink>
+            <w:r>
+              <w:t xml:space="preserve">]</w:t>
+            </w:r>
+          </w:p>
+        </w:tc>
+      </w:tr>
+      <w:tr>
+        <w:trPr>
+          <w:cantSplit/>
+        </w:trPr>
+        <w:tc>
+          <w:tcPr>
+            <w:tcW w:type="dxa" w:w="1000"/>
+            <w:tcBorders>
+              <w:top w:val="none" w:color="FFFFFF" w:sz="0"/>
+              <w:left w:val="none" w:color="FFFFFF" w:sz="0"/>
+              <w:bottom w:val="none" w:color="FFFFFF" w:sz="0"/>
+              <w:right w:val="none" w:color="FFFFFF" w:sz="0"/>
+            </w:tcBorders>
+            <w:tcMar>
+              <w:top w:type="dxa" w:w="40"/>
+              <w:left w:type="dxa" w:w="60"/>
+              <w:bottom w:type="dxa" w:w="40"/>
+              <w:right w:type="dxa" w:w="60"/>
+            </w:tcMar>
+          </w:tcPr>
+          <w:p>
+            <w:r>
+              <w:t xml:space="preserve">2026</w:t>
+            </w:r>
+          </w:p>
+        </w:tc>
+        <w:tc>
+          <w:tcPr>
+            <w:tcW w:type="dxa" w:w="500"/>
+            <w:tcBorders>
+              <w:top w:val="none" w:color="FFFFFF" w:sz="0"/>
+              <w:left w:val="none" w:color="FFFFFF" w:sz="0"/>
+              <w:bottom w:val="none" w:color="FFFFFF" w:sz="0"/>
+              <w:right w:val="none" w:color="FFFFFF" w:sz="0"/>
+            </w:tcBorders>
+            <w:tcMar>
+              <w:top w:type="dxa" w:w="40"/>
+              <w:left w:type="dxa" w:w="60"/>
+              <w:bottom w:type="dxa" w:w="40"/>
+              <w:right w:type="dxa" w:w="60"/>
+            </w:tcMar>
+          </w:tcPr>
+          <w:p>
+            <w:r>
+              <w:t xml:space="preserve">4.</w:t>
+            </w:r>
+          </w:p>
+        </w:tc>
+        <w:tc>
+          <w:tcPr>
+            <w:tcW w:type="dxa" w:w="8580"/>
+            <w:tcBorders>
+              <w:top w:val="none" w:color="FFFFFF" w:sz="0"/>
+              <w:left w:val="none" w:color="FFFFFF" w:sz="0"/>
+              <w:bottom w:val="none" w:color="FFFFFF" w:sz="0"/>
+              <w:right w:val="none" w:color="FFFFFF" w:sz="0"/>
+            </w:tcBorders>
+            <w:tcMar>
+              <w:top w:type="dxa" w:w="40"/>
+              <w:left w:type="dxa" w:w="60"/>
+              <w:bottom w:type="dxa" w:w="40"/>
+              <w:right w:type="dxa" w:w="60"/>
+            </w:tcMar>
+          </w:tcPr>
+          <w:p>
+            <w:pPr>
+              <w:jc w:val="both"/>
+            </w:pPr>
+            <w:r>
+              <w:t xml:space="preserve">Zou, L., Zhou, B., </w:t>
+            </w:r>
+            <w:r>
+              <w:rPr>
+                <w:b/>
+                <w:bCs/>
+              </w:rPr>
+              <w:t xml:space="preserve">Yang, Y.</w:t>
+            </w:r>
+            <w:r>
+              <w:t xml:space="preserve"> Responsible GeoAI: Thoughtful Integration of GIScience and AI in the Real World. </w:t>
+            </w:r>
+            <w:r>
+              <w:rPr>
+                <w:i/>
+                <w:iCs/>
+              </w:rPr>
+              <w:t xml:space="preserve">1st International Conference on Geospatial Artificial Intelligence (GeoAI 2026)</w:t>
+            </w:r>
+            <w:r>
+              <w:t xml:space="preserve">, Ghent, Belgium.</w:t>
+            </w:r>
+          </w:p>
+        </w:tc>
+      </w:tr>
+      <w:tr>
+        <w:trPr>
+          <w:cantSplit/>
+        </w:trPr>
+        <w:tc>
+          <w:tcPr>
+            <w:tcW w:type="dxa" w:w="1000"/>
+            <w:tcBorders>
+              <w:top w:val="none" w:color="FFFFFF" w:sz="0"/>
+              <w:left w:val="none" w:color="FFFFFF" w:sz="0"/>
+              <w:bottom w:val="none" w:color="FFFFFF" w:sz="0"/>
+              <w:right w:val="none" w:color="FFFFFF" w:sz="0"/>
+            </w:tcBorders>
+            <w:tcMar>
+              <w:top w:type="dxa" w:w="40"/>
+              <w:left w:type="dxa" w:w="60"/>
+              <w:bottom w:type="dxa" w:w="40"/>
+              <w:right w:type="dxa" w:w="60"/>
+            </w:tcMar>
+          </w:tcPr>
+          <w:p>
+            <w:r>
+              <w:t xml:space="preserve">2026</w:t>
+            </w:r>
+          </w:p>
+        </w:tc>
+        <w:tc>
+          <w:tcPr>
+            <w:tcW w:type="dxa" w:w="500"/>
+            <w:tcBorders>
+              <w:top w:val="none" w:color="FFFFFF" w:sz="0"/>
+              <w:left w:val="none" w:color="FFFFFF" w:sz="0"/>
+              <w:bottom w:val="none" w:color="FFFFFF" w:sz="0"/>
+              <w:right w:val="none" w:color="FFFFFF" w:sz="0"/>
+            </w:tcBorders>
+            <w:tcMar>
+              <w:top w:type="dxa" w:w="40"/>
+              <w:left w:type="dxa" w:w="60"/>
+              <w:bottom w:type="dxa" w:w="40"/>
+              <w:right w:type="dxa" w:w="60"/>
+            </w:tcMar>
+          </w:tcPr>
+          <w:p>
+            <w:r>
+              <w:t xml:space="preserve">3.</w:t>
+            </w:r>
+          </w:p>
+        </w:tc>
+        <w:tc>
+          <w:tcPr>
+            <w:tcW w:type="dxa" w:w="8580"/>
+            <w:tcBorders>
+              <w:top w:val="none" w:color="FFFFFF" w:sz="0"/>
+              <w:left w:val="none" w:color="FFFFFF" w:sz="0"/>
+              <w:bottom w:val="none" w:color="FFFFFF" w:sz="0"/>
+              <w:right w:val="none" w:color="FFFFFF" w:sz="0"/>
+            </w:tcBorders>
+            <w:tcMar>
+              <w:top w:type="dxa" w:w="40"/>
+              <w:left w:type="dxa" w:w="60"/>
+              <w:bottom w:type="dxa" w:w="40"/>
+              <w:right w:type="dxa" w:w="60"/>
+            </w:tcMar>
+          </w:tcPr>
+          <w:p>
+            <w:pPr>
+              <w:jc w:val="both"/>
+            </w:pPr>
+            <w:r>
+              <w:t xml:space="preserve">Tian, H., Cai, H., </w:t>
+            </w:r>
+            <w:r>
+              <w:rPr>
+                <w:b/>
+                <w:bCs/>
+              </w:rPr>
+              <w:t xml:space="preserve">Yang, Y.</w:t>
+            </w:r>
+            <w:r>
+              <w:t xml:space="preserve"> BEACON: Behavioral and Semantic Enrichment of AlphaEarth Embeddings through Tri-Modal Contrastive Learning. </w:t>
+            </w:r>
+            <w:r>
+              <w:rPr>
+                <w:i/>
+                <w:iCs/>
+              </w:rPr>
               <w:t xml:space="preserve">Proceedings of the 34th ACM SIGSPATIAL International Conference on Advances in Geographic Information Systems (SIGSPATIAL '26)</w:t>
             </w:r>
             <w:r>
               <w:t xml:space="preserve">, Riverside, CA (Short paper; Accepted). </w:t>
             </w:r>
-            <w:hyperlink w:history="1" r:id="rId9z8_jyac1n5j7zlvrl8nd">
+            <w:hyperlink w:history="1" r:id="rIdnaljd1s3soh0v46vgnsz5">
               <w:r>
                 <w:rPr>
                   <w:rStyle w:val="Hyperlink"/>
@@ -4513,7 +4957,7 @@
             <w:r>
               <w:t xml:space="preserve">. </w:t>
             </w:r>
-            <w:hyperlink w:history="1" r:id="rIdvxjg4vhzezuaraf2dqigo">
+            <w:hyperlink w:history="1" r:id="rIdflpz8ipwkupttu_byrg63">
               <w:r>
                 <w:rPr>
                   <w:rStyle w:val="Hyperlink"/>
@@ -4608,7 +5052,7 @@
             <w:r>
               <w:t xml:space="preserve">. </w:t>
             </w:r>
-            <w:hyperlink w:history="1" r:id="rIdlpomwodwyzmyqtjtwe7_e">
+            <w:hyperlink w:history="1" r:id="rIdxy9evib2fqyygvoepwsol">
               <w:r>
                 <w:rPr>
                   <w:rStyle w:val="Hyperlink"/>
@@ -4713,7 +5157,7 @@
             <w:r>
               <w:t xml:space="preserve">. </w:t>
             </w:r>
-            <w:hyperlink w:history="1" r:id="rIdp3yr3bnlxmgaqcvbhnpeh">
+            <w:hyperlink w:history="1" r:id="rIdomcpb9gdeir7x1jwqp0wo">
               <w:r>
                 <w:rPr>
                   <w:rStyle w:val="Hyperlink"/>
@@ -5441,7 +5885,7 @@
         <w:spacing w:after="20" w:before="0"/>
       </w:pPr>
       <w:r>
-        <w:t xml:space="preserve">Total: 13</w:t>
+        <w:t xml:space="preserve">Total: 19</w:t>
       </w:r>
     </w:p>
     <w:p>
@@ -5503,7 +5947,7 @@
           </w:tcPr>
           <w:p>
             <w:r>
-              <w:t xml:space="preserve">2026</w:t>
+              <w:t xml:space="preserve">2027</w:t>
             </w:r>
           </w:p>
         </w:tc>
@@ -5525,7 +5969,7 @@
           </w:tcPr>
           <w:p>
             <w:r>
-              <w:t xml:space="preserve">13.</w:t>
+              <w:t xml:space="preserve">19.</w:t>
             </w:r>
           </w:p>
         </w:tc>
@@ -5557,17 +6001,17 @@
               <w:t xml:space="preserve">Yang, Y.</w:t>
             </w:r>
             <w:r>
-              <w:t xml:space="preserve">, Zou, L. RAPIDMap: Rapid Multi-Agent Pipeline for Interpretable Disaster Mapping from Satellite and Street-View Imagery. Session 1B: GeoAI, Disaster Mapping, and Hydrography, </w:t>
+              <w:t xml:space="preserve">, Zou, L. Seeing Hurricane Damage Before It Happens: Multimodal GeoAI for Street-Level Prediction and Visualization. </w:t>
             </w:r>
             <w:r>
               <w:rPr>
                 <w:i/>
                 <w:iCs/>
               </w:rPr>
-              <w:t xml:space="preserve">CaGIS Conference 2026</w:t>
-            </w:r>
-            <w:r>
-              <w:t xml:space="preserve">, St. Louis, MO (09/08-09/11, 2026).</w:t>
+              <w:t xml:space="preserve">AAG 2027 Annual Meeting</w:t>
+            </w:r>
+            <w:r>
+              <w:t xml:space="preserve">, New York, NY (02/08-02/12, 2027; Accepted).</w:t>
             </w:r>
           </w:p>
         </w:tc>
@@ -5616,7 +6060,7 @@
           </w:tcPr>
           <w:p>
             <w:r>
-              <w:t xml:space="preserve">12.</w:t>
+              <w:t xml:space="preserve">18.</w:t>
             </w:r>
           </w:p>
         </w:tc>
@@ -5641,6 +6085,9 @@
               <w:jc w:val="both"/>
             </w:pPr>
             <w:r>
+              <w:t xml:space="preserve">Kim, J., </w:t>
+            </w:r>
+            <w:r>
               <w:rPr>
                 <w:b/>
                 <w:bCs/>
@@ -5648,17 +6095,17 @@
               <w:t xml:space="preserve">Yang, Y.</w:t>
             </w:r>
             <w:r>
-              <w:t xml:space="preserve">, Zou, L., Jepson, W. Satellite-to-Street: Synthesizing Post-Disaster Views from Satellite Imagery via Generative Vision Models. Session: Leveraging AI, LLMs, and Geospatial Technologies for Rapid and Explainable Post-Disaster Damage Intelligence, </w:t>
+              <w:t xml:space="preserve">, Shakya, A., Kelly, J. Optimizing HPC Performance for CDC-Based Storage and Reconstruction of High-Resolution Imagery. Research Posters, </w:t>
             </w:r>
             <w:r>
               <w:rPr>
                 <w:i/>
                 <w:iCs/>
               </w:rPr>
-              <w:t xml:space="preserve">IEEE IGARSS 2026</w:t>
-            </w:r>
-            <w:r>
-              <w:t xml:space="preserve">, Washington, D.C. (08/13, 2026).</w:t>
+              <w:t xml:space="preserve">SC26</w:t>
+            </w:r>
+            <w:r>
+              <w:t xml:space="preserve">, McCormick Place, Chicago, IL (Poster; 11/17, 2026).</w:t>
             </w:r>
           </w:p>
         </w:tc>
@@ -5707,7 +6154,7 @@
           </w:tcPr>
           <w:p>
             <w:r>
-              <w:t xml:space="preserve">11.</w:t>
+              <w:t xml:space="preserve">17.</w:t>
             </w:r>
           </w:p>
         </w:tc>
@@ -5739,17 +6186,17 @@
               <w:t xml:space="preserve">Yang, Y.</w:t>
             </w:r>
             <w:r>
-              <w:t xml:space="preserve"> Satellite-to-Street: Synthesizing Post-Disaster Views from Satellite Imagery via Generative Vision Models. </w:t>
+              <w:t xml:space="preserve">, Gong, W., Zhang, K., Zou, L., Tu, Z., Li, H., Li, Z., Ye, X. RAPID: A Reproducible Multi-Agent Pipeline for Interpretable Disaster Damage Assessment from Satellite and Street-View Imagery. Applications Track, Application 2: Disaster &amp; Flood, </w:t>
             </w:r>
             <w:r>
               <w:rPr>
                 <w:i/>
                 <w:iCs/>
               </w:rPr>
-              <w:t xml:space="preserve">Symposium on Spatiotemporal Data Science</w:t>
-            </w:r>
-            <w:r>
-              <w:t xml:space="preserve">, Virginia Tech, Alexandria, VA (Onsite Oral; 08/07-08/08, 2026).</w:t>
+              <w:t xml:space="preserve">ACM SIGSPATIAL 2026</w:t>
+            </w:r>
+            <w:r>
+              <w:t xml:space="preserve">, Riverside, CA (11/04, 2026).</w:t>
             </w:r>
           </w:p>
         </w:tc>
@@ -5798,7 +6245,7 @@
           </w:tcPr>
           <w:p>
             <w:r>
-              <w:t xml:space="preserve">10.</w:t>
+              <w:t xml:space="preserve">16.</w:t>
             </w:r>
           </w:p>
         </w:tc>
@@ -5830,17 +6277,17 @@
               <w:t xml:space="preserve">Yang, Y.</w:t>
             </w:r>
             <w:r>
-              <w:t xml:space="preserve">, Zou, L. DamageArbiter: A Disagreement-Driven Arbitration Framework for Hurricane Damage Assessment from Street-View Imagery. GISS Specialty Group Honors Competition for Student Papers II, </w:t>
+              <w:t xml:space="preserve">, Zou, L. When Satellite and Street Views Disagree: Cross-View Complementarity in Disaster Damage Assessment. Lightning Talk, </w:t>
             </w:r>
             <w:r>
               <w:rPr>
                 <w:i/>
                 <w:iCs/>
               </w:rPr>
-              <w:t xml:space="preserve">AAG 2026 Annual Meeting</w:t>
-            </w:r>
-            <w:r>
-              <w:t xml:space="preserve">, San Francisco, CA (03/17-03/21, 2026).</w:t>
+              <w:t xml:space="preserve">GeoSearch '26 Workshop at ACM SIGSPATIAL 2026</w:t>
+            </w:r>
+            <w:r>
+              <w:t xml:space="preserve">, Riverside, CA (11/03, 2026).</w:t>
             </w:r>
           </w:p>
         </w:tc>
@@ -5867,7 +6314,7 @@
           </w:tcPr>
           <w:p>
             <w:r>
-              <w:t xml:space="preserve">2025</w:t>
+              <w:t xml:space="preserve">2026</w:t>
             </w:r>
           </w:p>
         </w:tc>
@@ -5889,7 +6336,7 @@
           </w:tcPr>
           <w:p>
             <w:r>
-              <w:t xml:space="preserve">9.</w:t>
+              <w:t xml:space="preserve">15.</w:t>
             </w:r>
           </w:p>
         </w:tc>
@@ -5921,17 +6368,17 @@
               <w:t xml:space="preserve">Yang, Y.</w:t>
             </w:r>
             <w:r>
-              <w:t xml:space="preserve"> Seeing Disagreements: An Explainable Multimodal Framework for Disaster Assessment and Spatial Mapping. Student Paper Competition, </w:t>
+              <w:t xml:space="preserve">, Zou, L., Chen, T., Brannstrom, C., Chen, X., Harsuko, R., Nakata, N., Gross, M., van Wijk, J., Montazeri, S. GATES: A Geothermal Acceptance Tracking and Evaluation System Using Multi-Source Social Sensing. Data Science and Statistical Learning Session, </w:t>
             </w:r>
             <w:r>
               <w:rPr>
                 <w:i/>
                 <w:iCs/>
               </w:rPr>
-              <w:t xml:space="preserve">Texas A&amp;M University GIS Day</w:t>
-            </w:r>
-            <w:r>
-              <w:t xml:space="preserve">, College Station, TX (Oral).</w:t>
+              <w:t xml:space="preserve">10th Annual Texas A&amp;M Conference on Energy</w:t>
+            </w:r>
+            <w:r>
+              <w:t xml:space="preserve">, College Station, TX (Oral; 09/25, 2026).</w:t>
             </w:r>
           </w:p>
         </w:tc>
@@ -5958,7 +6405,7 @@
           </w:tcPr>
           <w:p>
             <w:r>
-              <w:t xml:space="preserve">2025</w:t>
+              <w:t xml:space="preserve">2026</w:t>
             </w:r>
           </w:p>
         </w:tc>
@@ -5980,7 +6427,7 @@
           </w:tcPr>
           <w:p>
             <w:r>
-              <w:t xml:space="preserve">8.</w:t>
+              <w:t xml:space="preserve">14.</w:t>
             </w:r>
           </w:p>
         </w:tc>
@@ -6005,6 +6452,9 @@
               <w:jc w:val="both"/>
             </w:pPr>
             <w:r>
+              <w:t xml:space="preserve">Fillman, K., Nawar, N., Thapaliya, R., </w:t>
+            </w:r>
+            <w:r>
               <w:rPr>
                 <w:b/>
                 <w:bCs/>
@@ -6012,17 +6462,28 @@
               <w:t xml:space="preserve">Yang, Y.</w:t>
             </w:r>
             <w:r>
-              <w:t xml:space="preserve">, Zou, L. Perceiving Multidimensional Disaster Damages from Street-View Images Using Visual-Language Models. Student Paper Session, </w:t>
+              <w:t xml:space="preserve">, Lyu, F. Detecting and Correcting Spatial Bias in VGI Using Remote Sensing. Invited Webinar Talk, </w:t>
             </w:r>
             <w:r>
               <w:rPr>
                 <w:i/>
                 <w:iCs/>
               </w:rPr>
-              <w:t xml:space="preserve">International Cartographic Conference (ICC 2025)</w:t>
-            </w:r>
-            <w:r>
-              <w:t xml:space="preserve">, Vancouver, Canada (08/18-08/22, 2025).</w:t>
+              <w:t xml:space="preserve">I-GUIDE Virtual Consulting Office (VCO)</w:t>
+            </w:r>
+            <w:r>
+              <w:t xml:space="preserve">, Online (09/23, 2026). </w:t>
+            </w:r>
+            <w:hyperlink w:history="1" r:id="rId-qvl-csn13vb9g-r_yxvh">
+              <w:r>
+                <w:rPr>
+                  <w:rStyle w:val="Hyperlink"/>
+                </w:rPr>
+                <w:t xml:space="preserve">[link</w:t>
+              </w:r>
+            </w:hyperlink>
+            <w:r>
+              <w:t xml:space="preserve">]</w:t>
             </w:r>
           </w:p>
         </w:tc>
@@ -6049,7 +6510,7 @@
           </w:tcPr>
           <w:p>
             <w:r>
-              <w:t xml:space="preserve">2025</w:t>
+              <w:t xml:space="preserve">2026</w:t>
             </w:r>
           </w:p>
         </w:tc>
@@ -6071,7 +6532,7 @@
           </w:tcPr>
           <w:p>
             <w:r>
-              <w:t xml:space="preserve">7.</w:t>
+              <w:t xml:space="preserve">13.</w:t>
             </w:r>
           </w:p>
         </w:tc>
@@ -6103,17 +6564,17 @@
               <w:t xml:space="preserve">Yang, Y.</w:t>
             </w:r>
             <w:r>
-              <w:t xml:space="preserve">, Zou, L. DisasterVLP: A Vision-Language Pretrained Framework for Multidimensional Disaster Damage Assessment Using Street-View Images. </w:t>
+              <w:t xml:space="preserve">, Zou, L. RAPIDMap: Rapid Multi-Agent Pipeline for Interpretable Disaster Mapping from Satellite and Street-View Imagery. Session 1B: GeoAI, Disaster Mapping, and Hydrography, </w:t>
             </w:r>
             <w:r>
               <w:rPr>
                 <w:i/>
                 <w:iCs/>
               </w:rPr>
-              <w:t xml:space="preserve">GeoAnalytics for Sustainable and Livable Cities</w:t>
-            </w:r>
-            <w:r>
-              <w:t xml:space="preserve">, ICC 2025 Pre-Conference Symposium, Vancouver, Canada (08/17, 2025).</w:t>
+              <w:t xml:space="preserve">CaGIS Conference 2026</w:t>
+            </w:r>
+            <w:r>
+              <w:t xml:space="preserve">, St. Louis, MO (09/08-09/11, 2026).</w:t>
             </w:r>
           </w:p>
         </w:tc>
@@ -6140,7 +6601,7 @@
           </w:tcPr>
           <w:p>
             <w:r>
-              <w:t xml:space="preserve">2025</w:t>
+              <w:t xml:space="preserve">2026</w:t>
             </w:r>
           </w:p>
         </w:tc>
@@ -6162,7 +6623,7 @@
           </w:tcPr>
           <w:p>
             <w:r>
-              <w:t xml:space="preserve">6.</w:t>
+              <w:t xml:space="preserve">12.</w:t>
             </w:r>
           </w:p>
         </w:tc>
@@ -6194,17 +6655,17 @@
               <w:t xml:space="preserve">Yang, Y.</w:t>
             </w:r>
             <w:r>
-              <w:t xml:space="preserve">, Gong, W., Zhang, K. DisasterVLP: Perceiving Multidimensional Disaster Damages from Street-View Images Using Visual-Language Models. </w:t>
+              <w:t xml:space="preserve">, Zou, L., Jepson, W. Satellite-to-Street: Synthesizing Post-Disaster Views from Satellite Imagery via Generative Vision Models. Session: Leveraging AI, LLMs, and Geospatial Technologies for Rapid and Explainable Post-Disaster Damage Intelligence, </w:t>
             </w:r>
             <w:r>
               <w:rPr>
                 <w:i/>
                 <w:iCs/>
               </w:rPr>
-              <w:t xml:space="preserve">Summer School on Cyberinfrastructure and Disaster Resilience</w:t>
-            </w:r>
-            <w:r>
-              <w:t xml:space="preserve">, Texas A&amp;M University, College Station, TX (Oral; 08/15, 2025).</w:t>
+              <w:t xml:space="preserve">IEEE IGARSS 2026</w:t>
+            </w:r>
+            <w:r>
+              <w:t xml:space="preserve">, Washington, D.C. (08/13, 2026).</w:t>
             </w:r>
           </w:p>
         </w:tc>
@@ -6231,7 +6692,7 @@
           </w:tcPr>
           <w:p>
             <w:r>
-              <w:t xml:space="preserve">2025</w:t>
+              <w:t xml:space="preserve">2026</w:t>
             </w:r>
           </w:p>
         </w:tc>
@@ -6253,7 +6714,7 @@
           </w:tcPr>
           <w:p>
             <w:r>
-              <w:t xml:space="preserve">5.</w:t>
+              <w:t xml:space="preserve">11.</w:t>
             </w:r>
           </w:p>
         </w:tc>
@@ -6285,17 +6746,17 @@
               <w:t xml:space="preserve">Yang, Y.</w:t>
             </w:r>
             <w:r>
-              <w:t xml:space="preserve">, Zou, L. Hyperlocal Disaster Damage Assessment Using Bi-Temporal Street-View Imagery and Pre-Trained Image Processing Models. GISS Specialty Group Paper Competition II, </w:t>
+              <w:t xml:space="preserve"> Satellite-to-Street: Synthesizing Post-Disaster Views from Satellite Imagery via Generative Vision Models. </w:t>
             </w:r>
             <w:r>
               <w:rPr>
                 <w:i/>
                 <w:iCs/>
               </w:rPr>
-              <w:t xml:space="preserve">AAG 2025 Annual Meeting</w:t>
-            </w:r>
-            <w:r>
-              <w:t xml:space="preserve">, Detroit, MI (03/24-03/28, 2025).</w:t>
+              <w:t xml:space="preserve">Symposium on Spatiotemporal Data Science</w:t>
+            </w:r>
+            <w:r>
+              <w:t xml:space="preserve">, Virginia Tech, Alexandria, VA (Onsite Oral; 08/07-08/08, 2026).</w:t>
             </w:r>
           </w:p>
         </w:tc>
@@ -6322,7 +6783,7 @@
           </w:tcPr>
           <w:p>
             <w:r>
-              <w:t xml:space="preserve">2024</w:t>
+              <w:t xml:space="preserve">2026</w:t>
             </w:r>
           </w:p>
         </w:tc>
@@ -6344,7 +6805,7 @@
           </w:tcPr>
           <w:p>
             <w:r>
-              <w:t xml:space="preserve">4.</w:t>
+              <w:t xml:space="preserve">10.</w:t>
             </w:r>
           </w:p>
         </w:tc>
@@ -6376,19 +6837,565 @@
               <w:t xml:space="preserve">Yang, Y.</w:t>
             </w:r>
             <w:r>
-              <w:t xml:space="preserve"> GeoLocator: A Location-Integrated Large Multimodal Model (LMM) for Inferring Geo-Privacy. Thematic Session “Geoprivacy Challenges and Solutions in the Digital Society,” </w:t>
+              <w:t xml:space="preserve">, Zou, L. DamageArbiter: A Disagreement-Driven Arbitration Framework for Hurricane Damage Assessment from Street-View Imagery. GISS Specialty Group Honors Competition for Student Papers II, </w:t>
             </w:r>
             <w:r>
               <w:rPr>
                 <w:i/>
                 <w:iCs/>
               </w:rPr>
+              <w:t xml:space="preserve">AAG 2026 Annual Meeting</w:t>
+            </w:r>
+            <w:r>
+              <w:t xml:space="preserve">, San Francisco, CA (03/17-03/21, 2026).</w:t>
+            </w:r>
+          </w:p>
+        </w:tc>
+      </w:tr>
+      <w:tr>
+        <w:trPr>
+          <w:cantSplit/>
+        </w:trPr>
+        <w:tc>
+          <w:tcPr>
+            <w:tcW w:type="dxa" w:w="1000"/>
+            <w:tcBorders>
+              <w:top w:val="none" w:color="FFFFFF" w:sz="0"/>
+              <w:left w:val="none" w:color="FFFFFF" w:sz="0"/>
+              <w:bottom w:val="none" w:color="FFFFFF" w:sz="0"/>
+              <w:right w:val="none" w:color="FFFFFF" w:sz="0"/>
+            </w:tcBorders>
+            <w:tcMar>
+              <w:top w:type="dxa" w:w="40"/>
+              <w:left w:type="dxa" w:w="60"/>
+              <w:bottom w:type="dxa" w:w="40"/>
+              <w:right w:type="dxa" w:w="60"/>
+            </w:tcMar>
+          </w:tcPr>
+          <w:p>
+            <w:r>
+              <w:t xml:space="preserve">2025</w:t>
+            </w:r>
+          </w:p>
+        </w:tc>
+        <w:tc>
+          <w:tcPr>
+            <w:tcW w:type="dxa" w:w="500"/>
+            <w:tcBorders>
+              <w:top w:val="none" w:color="FFFFFF" w:sz="0"/>
+              <w:left w:val="none" w:color="FFFFFF" w:sz="0"/>
+              <w:bottom w:val="none" w:color="FFFFFF" w:sz="0"/>
+              <w:right w:val="none" w:color="FFFFFF" w:sz="0"/>
+            </w:tcBorders>
+            <w:tcMar>
+              <w:top w:type="dxa" w:w="40"/>
+              <w:left w:type="dxa" w:w="60"/>
+              <w:bottom w:type="dxa" w:w="40"/>
+              <w:right w:type="dxa" w:w="60"/>
+            </w:tcMar>
+          </w:tcPr>
+          <w:p>
+            <w:r>
+              <w:t xml:space="preserve">9.</w:t>
+            </w:r>
+          </w:p>
+        </w:tc>
+        <w:tc>
+          <w:tcPr>
+            <w:tcW w:type="dxa" w:w="8580"/>
+            <w:tcBorders>
+              <w:top w:val="none" w:color="FFFFFF" w:sz="0"/>
+              <w:left w:val="none" w:color="FFFFFF" w:sz="0"/>
+              <w:bottom w:val="none" w:color="FFFFFF" w:sz="0"/>
+              <w:right w:val="none" w:color="FFFFFF" w:sz="0"/>
+            </w:tcBorders>
+            <w:tcMar>
+              <w:top w:type="dxa" w:w="40"/>
+              <w:left w:type="dxa" w:w="60"/>
+              <w:bottom w:type="dxa" w:w="40"/>
+              <w:right w:type="dxa" w:w="60"/>
+            </w:tcMar>
+          </w:tcPr>
+          <w:p>
+            <w:pPr>
+              <w:jc w:val="both"/>
+            </w:pPr>
+            <w:r>
+              <w:rPr>
+                <w:b/>
+                <w:bCs/>
+              </w:rPr>
+              <w:t xml:space="preserve">Yang, Y.</w:t>
+            </w:r>
+            <w:r>
+              <w:t xml:space="preserve"> Seeing Disagreements: An Explainable Multimodal Framework for Disaster Assessment and Spatial Mapping. Student Paper Competition, </w:t>
+            </w:r>
+            <w:r>
+              <w:rPr>
+                <w:i/>
+                <w:iCs/>
+              </w:rPr>
+              <w:t xml:space="preserve">Texas A&amp;M University GIS Day (TxGIS Day 2025)</w:t>
+            </w:r>
+            <w:r>
+              <w:t xml:space="preserve">, College Station, TX (Oral; 11/17-11/21, 2025).</w:t>
+            </w:r>
+          </w:p>
+        </w:tc>
+      </w:tr>
+      <w:tr>
+        <w:trPr>
+          <w:cantSplit/>
+        </w:trPr>
+        <w:tc>
+          <w:tcPr>
+            <w:tcW w:type="dxa" w:w="1000"/>
+            <w:tcBorders>
+              <w:top w:val="none" w:color="FFFFFF" w:sz="0"/>
+              <w:left w:val="none" w:color="FFFFFF" w:sz="0"/>
+              <w:bottom w:val="none" w:color="FFFFFF" w:sz="0"/>
+              <w:right w:val="none" w:color="FFFFFF" w:sz="0"/>
+            </w:tcBorders>
+            <w:tcMar>
+              <w:top w:type="dxa" w:w="40"/>
+              <w:left w:type="dxa" w:w="60"/>
+              <w:bottom w:type="dxa" w:w="40"/>
+              <w:right w:type="dxa" w:w="60"/>
+            </w:tcMar>
+          </w:tcPr>
+          <w:p>
+            <w:r>
+              <w:t xml:space="preserve">2025</w:t>
+            </w:r>
+          </w:p>
+        </w:tc>
+        <w:tc>
+          <w:tcPr>
+            <w:tcW w:type="dxa" w:w="500"/>
+            <w:tcBorders>
+              <w:top w:val="none" w:color="FFFFFF" w:sz="0"/>
+              <w:left w:val="none" w:color="FFFFFF" w:sz="0"/>
+              <w:bottom w:val="none" w:color="FFFFFF" w:sz="0"/>
+              <w:right w:val="none" w:color="FFFFFF" w:sz="0"/>
+            </w:tcBorders>
+            <w:tcMar>
+              <w:top w:type="dxa" w:w="40"/>
+              <w:left w:type="dxa" w:w="60"/>
+              <w:bottom w:type="dxa" w:w="40"/>
+              <w:right w:type="dxa" w:w="60"/>
+            </w:tcMar>
+          </w:tcPr>
+          <w:p>
+            <w:r>
+              <w:t xml:space="preserve">8.</w:t>
+            </w:r>
+          </w:p>
+        </w:tc>
+        <w:tc>
+          <w:tcPr>
+            <w:tcW w:type="dxa" w:w="8580"/>
+            <w:tcBorders>
+              <w:top w:val="none" w:color="FFFFFF" w:sz="0"/>
+              <w:left w:val="none" w:color="FFFFFF" w:sz="0"/>
+              <w:bottom w:val="none" w:color="FFFFFF" w:sz="0"/>
+              <w:right w:val="none" w:color="FFFFFF" w:sz="0"/>
+            </w:tcBorders>
+            <w:tcMar>
+              <w:top w:type="dxa" w:w="40"/>
+              <w:left w:type="dxa" w:w="60"/>
+              <w:bottom w:type="dxa" w:w="40"/>
+              <w:right w:type="dxa" w:w="60"/>
+            </w:tcMar>
+          </w:tcPr>
+          <w:p>
+            <w:pPr>
+              <w:jc w:val="both"/>
+            </w:pPr>
+            <w:r>
+              <w:rPr>
+                <w:b/>
+                <w:bCs/>
+              </w:rPr>
+              <w:t xml:space="preserve">Yang, Y.</w:t>
+            </w:r>
+            <w:r>
+              <w:t xml:space="preserve">, Zou, L. Perceiving Multidimensional Disaster Damages from Street-View Images Using Visual-Language Models. Student Paper Session, </w:t>
+            </w:r>
+            <w:r>
+              <w:rPr>
+                <w:i/>
+                <w:iCs/>
+              </w:rPr>
+              <w:t xml:space="preserve">International Cartographic Conference (ICC 2025)</w:t>
+            </w:r>
+            <w:r>
+              <w:t xml:space="preserve">, Vancouver, Canada (08/18-08/22, 2025).</w:t>
+            </w:r>
+          </w:p>
+        </w:tc>
+      </w:tr>
+      <w:tr>
+        <w:trPr>
+          <w:cantSplit/>
+        </w:trPr>
+        <w:tc>
+          <w:tcPr>
+            <w:tcW w:type="dxa" w:w="1000"/>
+            <w:tcBorders>
+              <w:top w:val="none" w:color="FFFFFF" w:sz="0"/>
+              <w:left w:val="none" w:color="FFFFFF" w:sz="0"/>
+              <w:bottom w:val="none" w:color="FFFFFF" w:sz="0"/>
+              <w:right w:val="none" w:color="FFFFFF" w:sz="0"/>
+            </w:tcBorders>
+            <w:tcMar>
+              <w:top w:type="dxa" w:w="40"/>
+              <w:left w:type="dxa" w:w="60"/>
+              <w:bottom w:type="dxa" w:w="40"/>
+              <w:right w:type="dxa" w:w="60"/>
+            </w:tcMar>
+          </w:tcPr>
+          <w:p>
+            <w:r>
+              <w:t xml:space="preserve">2025</w:t>
+            </w:r>
+          </w:p>
+        </w:tc>
+        <w:tc>
+          <w:tcPr>
+            <w:tcW w:type="dxa" w:w="500"/>
+            <w:tcBorders>
+              <w:top w:val="none" w:color="FFFFFF" w:sz="0"/>
+              <w:left w:val="none" w:color="FFFFFF" w:sz="0"/>
+              <w:bottom w:val="none" w:color="FFFFFF" w:sz="0"/>
+              <w:right w:val="none" w:color="FFFFFF" w:sz="0"/>
+            </w:tcBorders>
+            <w:tcMar>
+              <w:top w:type="dxa" w:w="40"/>
+              <w:left w:type="dxa" w:w="60"/>
+              <w:bottom w:type="dxa" w:w="40"/>
+              <w:right w:type="dxa" w:w="60"/>
+            </w:tcMar>
+          </w:tcPr>
+          <w:p>
+            <w:r>
+              <w:t xml:space="preserve">7.</w:t>
+            </w:r>
+          </w:p>
+        </w:tc>
+        <w:tc>
+          <w:tcPr>
+            <w:tcW w:type="dxa" w:w="8580"/>
+            <w:tcBorders>
+              <w:top w:val="none" w:color="FFFFFF" w:sz="0"/>
+              <w:left w:val="none" w:color="FFFFFF" w:sz="0"/>
+              <w:bottom w:val="none" w:color="FFFFFF" w:sz="0"/>
+              <w:right w:val="none" w:color="FFFFFF" w:sz="0"/>
+            </w:tcBorders>
+            <w:tcMar>
+              <w:top w:type="dxa" w:w="40"/>
+              <w:left w:type="dxa" w:w="60"/>
+              <w:bottom w:type="dxa" w:w="40"/>
+              <w:right w:type="dxa" w:w="60"/>
+            </w:tcMar>
+          </w:tcPr>
+          <w:p>
+            <w:pPr>
+              <w:jc w:val="both"/>
+            </w:pPr>
+            <w:r>
+              <w:rPr>
+                <w:b/>
+                <w:bCs/>
+              </w:rPr>
+              <w:t xml:space="preserve">Yang, Y.</w:t>
+            </w:r>
+            <w:r>
+              <w:t xml:space="preserve">, Zou, L. DisasterVLP: A Vision-Language Pretrained Framework for Multidimensional Disaster Damage Assessment Using Street-View Images. </w:t>
+            </w:r>
+            <w:r>
+              <w:rPr>
+                <w:i/>
+                <w:iCs/>
+              </w:rPr>
+              <w:t xml:space="preserve">GeoAnalytics for Sustainable and Livable Cities</w:t>
+            </w:r>
+            <w:r>
+              <w:t xml:space="preserve">, ICC 2025 Pre-Conference Symposium, Vancouver, Canada (08/17, 2025).</w:t>
+            </w:r>
+          </w:p>
+        </w:tc>
+      </w:tr>
+      <w:tr>
+        <w:trPr>
+          <w:cantSplit/>
+        </w:trPr>
+        <w:tc>
+          <w:tcPr>
+            <w:tcW w:type="dxa" w:w="1000"/>
+            <w:tcBorders>
+              <w:top w:val="none" w:color="FFFFFF" w:sz="0"/>
+              <w:left w:val="none" w:color="FFFFFF" w:sz="0"/>
+              <w:bottom w:val="none" w:color="FFFFFF" w:sz="0"/>
+              <w:right w:val="none" w:color="FFFFFF" w:sz="0"/>
+            </w:tcBorders>
+            <w:tcMar>
+              <w:top w:type="dxa" w:w="40"/>
+              <w:left w:type="dxa" w:w="60"/>
+              <w:bottom w:type="dxa" w:w="40"/>
+              <w:right w:type="dxa" w:w="60"/>
+            </w:tcMar>
+          </w:tcPr>
+          <w:p>
+            <w:r>
+              <w:t xml:space="preserve">2025</w:t>
+            </w:r>
+          </w:p>
+        </w:tc>
+        <w:tc>
+          <w:tcPr>
+            <w:tcW w:type="dxa" w:w="500"/>
+            <w:tcBorders>
+              <w:top w:val="none" w:color="FFFFFF" w:sz="0"/>
+              <w:left w:val="none" w:color="FFFFFF" w:sz="0"/>
+              <w:bottom w:val="none" w:color="FFFFFF" w:sz="0"/>
+              <w:right w:val="none" w:color="FFFFFF" w:sz="0"/>
+            </w:tcBorders>
+            <w:tcMar>
+              <w:top w:type="dxa" w:w="40"/>
+              <w:left w:type="dxa" w:w="60"/>
+              <w:bottom w:type="dxa" w:w="40"/>
+              <w:right w:type="dxa" w:w="60"/>
+            </w:tcMar>
+          </w:tcPr>
+          <w:p>
+            <w:r>
+              <w:t xml:space="preserve">6.</w:t>
+            </w:r>
+          </w:p>
+        </w:tc>
+        <w:tc>
+          <w:tcPr>
+            <w:tcW w:type="dxa" w:w="8580"/>
+            <w:tcBorders>
+              <w:top w:val="none" w:color="FFFFFF" w:sz="0"/>
+              <w:left w:val="none" w:color="FFFFFF" w:sz="0"/>
+              <w:bottom w:val="none" w:color="FFFFFF" w:sz="0"/>
+              <w:right w:val="none" w:color="FFFFFF" w:sz="0"/>
+            </w:tcBorders>
+            <w:tcMar>
+              <w:top w:type="dxa" w:w="40"/>
+              <w:left w:type="dxa" w:w="60"/>
+              <w:bottom w:type="dxa" w:w="40"/>
+              <w:right w:type="dxa" w:w="60"/>
+            </w:tcMar>
+          </w:tcPr>
+          <w:p>
+            <w:pPr>
+              <w:jc w:val="both"/>
+            </w:pPr>
+            <w:r>
+              <w:rPr>
+                <w:b/>
+                <w:bCs/>
+              </w:rPr>
+              <w:t xml:space="preserve">Yang, Y.</w:t>
+            </w:r>
+            <w:r>
+              <w:t xml:space="preserve">, Gong, W., Zhang, K. DisasterVLP: Perceiving Multidimensional Disaster Damages from Street-View Images Using Visual-Language Models. </w:t>
+            </w:r>
+            <w:r>
+              <w:rPr>
+                <w:i/>
+                <w:iCs/>
+              </w:rPr>
+              <w:t xml:space="preserve">Summer School on Cyberinfrastructure and Disaster Resilience</w:t>
+            </w:r>
+            <w:r>
+              <w:t xml:space="preserve">, Texas A&amp;M University, College Station, TX (Oral; 08/15, 2025).</w:t>
+            </w:r>
+          </w:p>
+        </w:tc>
+      </w:tr>
+      <w:tr>
+        <w:trPr>
+          <w:cantSplit/>
+        </w:trPr>
+        <w:tc>
+          <w:tcPr>
+            <w:tcW w:type="dxa" w:w="1000"/>
+            <w:tcBorders>
+              <w:top w:val="none" w:color="FFFFFF" w:sz="0"/>
+              <w:left w:val="none" w:color="FFFFFF" w:sz="0"/>
+              <w:bottom w:val="none" w:color="FFFFFF" w:sz="0"/>
+              <w:right w:val="none" w:color="FFFFFF" w:sz="0"/>
+            </w:tcBorders>
+            <w:tcMar>
+              <w:top w:type="dxa" w:w="40"/>
+              <w:left w:type="dxa" w:w="60"/>
+              <w:bottom w:type="dxa" w:w="40"/>
+              <w:right w:type="dxa" w:w="60"/>
+            </w:tcMar>
+          </w:tcPr>
+          <w:p>
+            <w:r>
+              <w:t xml:space="preserve">2025</w:t>
+            </w:r>
+          </w:p>
+        </w:tc>
+        <w:tc>
+          <w:tcPr>
+            <w:tcW w:type="dxa" w:w="500"/>
+            <w:tcBorders>
+              <w:top w:val="none" w:color="FFFFFF" w:sz="0"/>
+              <w:left w:val="none" w:color="FFFFFF" w:sz="0"/>
+              <w:bottom w:val="none" w:color="FFFFFF" w:sz="0"/>
+              <w:right w:val="none" w:color="FFFFFF" w:sz="0"/>
+            </w:tcBorders>
+            <w:tcMar>
+              <w:top w:type="dxa" w:w="40"/>
+              <w:left w:type="dxa" w:w="60"/>
+              <w:bottom w:type="dxa" w:w="40"/>
+              <w:right w:type="dxa" w:w="60"/>
+            </w:tcMar>
+          </w:tcPr>
+          <w:p>
+            <w:r>
+              <w:t xml:space="preserve">5.</w:t>
+            </w:r>
+          </w:p>
+        </w:tc>
+        <w:tc>
+          <w:tcPr>
+            <w:tcW w:type="dxa" w:w="8580"/>
+            <w:tcBorders>
+              <w:top w:val="none" w:color="FFFFFF" w:sz="0"/>
+              <w:left w:val="none" w:color="FFFFFF" w:sz="0"/>
+              <w:bottom w:val="none" w:color="FFFFFF" w:sz="0"/>
+              <w:right w:val="none" w:color="FFFFFF" w:sz="0"/>
+            </w:tcBorders>
+            <w:tcMar>
+              <w:top w:type="dxa" w:w="40"/>
+              <w:left w:type="dxa" w:w="60"/>
+              <w:bottom w:type="dxa" w:w="40"/>
+              <w:right w:type="dxa" w:w="60"/>
+            </w:tcMar>
+          </w:tcPr>
+          <w:p>
+            <w:pPr>
+              <w:jc w:val="both"/>
+            </w:pPr>
+            <w:r>
+              <w:rPr>
+                <w:b/>
+                <w:bCs/>
+              </w:rPr>
+              <w:t xml:space="preserve">Yang, Y.</w:t>
+            </w:r>
+            <w:r>
+              <w:t xml:space="preserve">, Zou, L. Hyperlocal Disaster Damage Assessment Using Bi-Temporal Street-View Imagery and Pre-Trained Image Processing Models. GISS Specialty Group Paper Competition II, </w:t>
+            </w:r>
+            <w:r>
+              <w:rPr>
+                <w:i/>
+                <w:iCs/>
+              </w:rPr>
+              <w:t xml:space="preserve">AAG 2025 Annual Meeting</w:t>
+            </w:r>
+            <w:r>
+              <w:t xml:space="preserve">, Detroit, MI (03/24-03/28, 2025).</w:t>
+            </w:r>
+          </w:p>
+        </w:tc>
+      </w:tr>
+      <w:tr>
+        <w:trPr>
+          <w:cantSplit/>
+        </w:trPr>
+        <w:tc>
+          <w:tcPr>
+            <w:tcW w:type="dxa" w:w="1000"/>
+            <w:tcBorders>
+              <w:top w:val="none" w:color="FFFFFF" w:sz="0"/>
+              <w:left w:val="none" w:color="FFFFFF" w:sz="0"/>
+              <w:bottom w:val="none" w:color="FFFFFF" w:sz="0"/>
+              <w:right w:val="none" w:color="FFFFFF" w:sz="0"/>
+            </w:tcBorders>
+            <w:tcMar>
+              <w:top w:type="dxa" w:w="40"/>
+              <w:left w:type="dxa" w:w="60"/>
+              <w:bottom w:type="dxa" w:w="40"/>
+              <w:right w:type="dxa" w:w="60"/>
+            </w:tcMar>
+          </w:tcPr>
+          <w:p>
+            <w:r>
+              <w:t xml:space="preserve">2024</w:t>
+            </w:r>
+          </w:p>
+        </w:tc>
+        <w:tc>
+          <w:tcPr>
+            <w:tcW w:type="dxa" w:w="500"/>
+            <w:tcBorders>
+              <w:top w:val="none" w:color="FFFFFF" w:sz="0"/>
+              <w:left w:val="none" w:color="FFFFFF" w:sz="0"/>
+              <w:bottom w:val="none" w:color="FFFFFF" w:sz="0"/>
+              <w:right w:val="none" w:color="FFFFFF" w:sz="0"/>
+            </w:tcBorders>
+            <w:tcMar>
+              <w:top w:type="dxa" w:w="40"/>
+              <w:left w:type="dxa" w:w="60"/>
+              <w:bottom w:type="dxa" w:w="40"/>
+              <w:right w:type="dxa" w:w="60"/>
+            </w:tcMar>
+          </w:tcPr>
+          <w:p>
+            <w:r>
+              <w:t xml:space="preserve">4.</w:t>
+            </w:r>
+          </w:p>
+        </w:tc>
+        <w:tc>
+          <w:tcPr>
+            <w:tcW w:type="dxa" w:w="8580"/>
+            <w:tcBorders>
+              <w:top w:val="none" w:color="FFFFFF" w:sz="0"/>
+              <w:left w:val="none" w:color="FFFFFF" w:sz="0"/>
+              <w:bottom w:val="none" w:color="FFFFFF" w:sz="0"/>
+              <w:right w:val="none" w:color="FFFFFF" w:sz="0"/>
+            </w:tcBorders>
+            <w:tcMar>
+              <w:top w:type="dxa" w:w="40"/>
+              <w:left w:type="dxa" w:w="60"/>
+              <w:bottom w:type="dxa" w:w="40"/>
+              <w:right w:type="dxa" w:w="60"/>
+            </w:tcMar>
+          </w:tcPr>
+          <w:p>
+            <w:pPr>
+              <w:jc w:val="both"/>
+            </w:pPr>
+            <w:r>
+              <w:rPr>
+                <w:b/>
+                <w:bCs/>
+              </w:rPr>
+              <w:t xml:space="preserve">Yang, Y.</w:t>
+            </w:r>
+            <w:r>
+              <w:t xml:space="preserve"> GeoLocator: A Location-Integrated Large Multimodal Model (LMM) for Inferring Geo-Privacy. Thematic Session “Geoprivacy Challenges and Solutions in the Digital Society,” </w:t>
+            </w:r>
+            <w:r>
+              <w:rPr>
+                <w:i/>
+                <w:iCs/>
+              </w:rPr>
               <w:t xml:space="preserve">Spatial Data Science Symposium 2024</w:t>
             </w:r>
             <w:r>
               <w:t xml:space="preserve">, Virtual. </w:t>
             </w:r>
-            <w:hyperlink w:history="1" r:id="rIdmitfmr_mhs5i7rr2ddhln">
+            <w:hyperlink w:history="1" r:id="rIdcb-tfgspsakghmmyub0-n">
               <w:r>
                 <w:rPr>
                   <w:rStyle w:val="Hyperlink"/>
@@ -6723,34 +7730,15 @@
         <w:jc w:val="both"/>
       </w:pPr>
       <w:r>
-        <w:t xml:space="preserve">2026</w:t>
+        <w:t xml:space="preserve">2027</w:t>
       </w:r>
       <w:r>
         <w:t xml:space="preserve">	</w:t>
       </w:r>
       <w:r>
-        <w:t xml:space="preserve">Session Organizer, “Spatiotemporal AI for Urban and Environmental Intelligence: Sensing, Inference, and Human-Centered Applications,” Symposium on Spatiotemporal Data Science, Virginia Tech, Alexandria, VA (08/07-08/08, 2026)</w:t>
-      </w:r>
-    </w:p>
-    <w:p>
-      <w:pPr>
-        <w:tabs>
-          <w:tab w:val="left" w:pos="1440"/>
-        </w:tabs>
-        <w:spacing w:after="60" w:before="60"/>
-        <w:ind w:left="1440" w:hanging="1166"/>
-        <w:jc w:val="both"/>
-      </w:pPr>
-      <w:r>
-        <w:t xml:space="preserve">2026</w:t>
-      </w:r>
-      <w:r>
-        <w:t xml:space="preserve">	</w:t>
-      </w:r>
-      <w:r>
-        <w:t xml:space="preserve">Session Co-Organizer, “GeoAI and Data Science for Disaster Resilience,” 33rd International Conference on Geoinformatics (GeoInformatics 2026), Singapore (with Lei Zou, Yi Qiang, Yingjie Hu, Qunying Huang, Xiao Huang, and Bing Zhou) </w:t>
-      </w:r>
-      <w:hyperlink w:history="1" r:id="rIdhfdu-cmclf7zo74rg_sbt">
+        <w:t xml:space="preserve">Organizer and Chair, GeoAI Symposium: Panel Session on AI and Disaster Resilience, AAG 2027 Annual Meeting, New York, NY (02/08-02/12, 2027) </w:t>
+      </w:r>
+      <w:hyperlink w:history="1" r:id="rIdq_1qovqpwballkbrta9ee">
         <w:r>
           <w:rPr>
             <w:rStyle w:val="Hyperlink"/>
@@ -6778,6 +7766,55 @@
         <w:t xml:space="preserve">	</w:t>
       </w:r>
       <w:r>
+        <w:t xml:space="preserve">Session Organizer, “Spatiotemporal AI for Urban and Environmental Intelligence: Sensing, Inference, and Human-Centered Applications,” Symposium on Spatiotemporal Data Science, Virginia Tech, Alexandria, VA (08/07-08/08, 2026)</w:t>
+      </w:r>
+    </w:p>
+    <w:p>
+      <w:pPr>
+        <w:tabs>
+          <w:tab w:val="left" w:pos="1440"/>
+        </w:tabs>
+        <w:spacing w:after="60" w:before="60"/>
+        <w:ind w:left="1440" w:hanging="1166"/>
+        <w:jc w:val="both"/>
+      </w:pPr>
+      <w:r>
+        <w:t xml:space="preserve">2026</w:t>
+      </w:r>
+      <w:r>
+        <w:t xml:space="preserve">	</w:t>
+      </w:r>
+      <w:r>
+        <w:t xml:space="preserve">Session Co-Organizer, “GeoAI and Data Science for Disaster Resilience,” 33rd International Conference on Geoinformatics (GeoInformatics 2026), Singapore (with Lei Zou, Yi Qiang, Yingjie Hu, Qunying Huang, Xiao Huang, and Bing Zhou) </w:t>
+      </w:r>
+      <w:hyperlink w:history="1" r:id="rIdgaxiitewvrgcjlcwdwv5w">
+        <w:r>
+          <w:rPr>
+            <w:rStyle w:val="Hyperlink"/>
+          </w:rPr>
+          <w:t xml:space="preserve">[link</w:t>
+        </w:r>
+      </w:hyperlink>
+      <w:r>
+        <w:t xml:space="preserve">]</w:t>
+      </w:r>
+    </w:p>
+    <w:p>
+      <w:pPr>
+        <w:tabs>
+          <w:tab w:val="left" w:pos="1440"/>
+        </w:tabs>
+        <w:spacing w:after="60" w:before="60"/>
+        <w:ind w:left="1440" w:hanging="1166"/>
+        <w:jc w:val="both"/>
+      </w:pPr>
+      <w:r>
+        <w:t xml:space="preserve">2026</w:t>
+      </w:r>
+      <w:r>
+        <w:t xml:space="preserve">	</w:t>
+      </w:r>
+      <w:r>
         <w:t xml:space="preserve">Session Co-Organizer, GeoAI and Deep Learning Symposium: GeoAI for Disaster Resilience, AAG 2026 Annual Meeting, San Francisco, CA (with Lei Zou, Yingjie Hu, Qunying Huang, Yi Qiang, Marcela Suarez, and Morteza Karimzadeh)</w:t>
       </w:r>
     </w:p>
@@ -7024,6 +8061,15 @@
       </w:pPr>
       <w:r>
         <w:t xml:space="preserve">Journal of Transport Geography</w:t>
+      </w:r>
+    </w:p>
+    <w:p>
+      <w:pPr>
+        <w:spacing w:after="40" w:before="0"/>
+        <w:ind w:left="270"/>
+      </w:pPr>
+      <w:r>
+        <w:t xml:space="preserve">npj Natural Hazards</w:t>
       </w:r>
     </w:p>
     <w:p>
@@ -7097,7 +8143,7 @@
       <w:r>
         <w:t xml:space="preserve">Founder, Rayford AI: building a geospatial physical AI company that turns remote sensing, street-level imagery, and geospatial context into auditable intelligence for disaster assessment, claims triage, and infrastructure and property decisions </w:t>
       </w:r>
-      <w:hyperlink w:history="1" r:id="rIdscv-le2-fznoma4hyyhcf">
+      <w:hyperlink w:history="1" r:id="rId_dmfipux1xp1fi_5m_j3e">
         <w:r>
           <w:rPr>
             <w:rStyle w:val="Hyperlink"/>
@@ -7146,7 +8192,7 @@
       <w:r>
         <w:t xml:space="preserve">Featured Research, Mosaic - Geospatial Imaging Leaders (Prague, Czech Republic): hyperlocal damage assessment using Mosaic street-level imagery from Hurricane Milton </w:t>
       </w:r>
-      <w:hyperlink w:history="1" r:id="rIdnr8rrbbhrwctzckkbht5u">
+      <w:hyperlink w:history="1" r:id="rIdwcverxtmcqucttrjtrvns">
         <w:r>
           <w:rPr>
             <w:rStyle w:val="Hyperlink"/>
@@ -7245,6 +8291,26 @@
         <w:jc w:val="both"/>
       </w:pPr>
       <w:r>
+        <w:t xml:space="preserve">2025-pres.</w:t>
+      </w:r>
+      <w:r>
+        <w:t xml:space="preserve">	</w:t>
+      </w:r>
+      <w:r>
+        <w:t xml:space="preserve">Cartography and Geographic Information Society (CaGIS)</w:t>
+      </w:r>
+    </w:p>
+    <w:p>
+      <w:pPr>
+        <w:keepNext/>
+        <w:tabs>
+          <w:tab w:val="left" w:pos="1440"/>
+        </w:tabs>
+        <w:spacing w:after="60" w:before="60"/>
+        <w:ind w:left="1440" w:hanging="1166"/>
+        <w:jc w:val="both"/>
+      </w:pPr>
+      <w:r>
         <w:t xml:space="preserve">2024-pres.</w:t>
       </w:r>
       <w:r>
@@ -7376,7 +8442,7 @@
       <w:r>
         <w:t xml:space="preserve">Texas A&amp;M College of Arts &amp; Sciences, Five Texas A&amp;M Researchers Join National Climate-Health Initiative </w:t>
       </w:r>
-      <w:hyperlink w:history="1" r:id="rIddkq6vmed1qcrqxcv5nn_v">
+      <w:hyperlink w:history="1" r:id="rIdooj1_picfb5lg_iwuht4w">
         <w:r>
           <w:rPr>
             <w:rStyle w:val="Hyperlink"/>
@@ -7406,7 +8472,7 @@
       <w:r>
         <w:t xml:space="preserve">Mosaic - Geospatial Imaging Leaders, How Texas A&amp;M Is Pioneering Damage Assessment Using Mosaic Imagery from Hurricane Milton </w:t>
       </w:r>
-      <w:hyperlink w:history="1" r:id="rIdhynl0vgu_8pbpqe8qghfa">
+      <w:hyperlink w:history="1" r:id="rIdw2utevucblthtnd0n8ca7">
         <w:r>
           <w:rPr>
             <w:rStyle w:val="Hyperlink"/>
@@ -7428,15 +8494,15 @@
         <w:jc w:val="both"/>
       </w:pPr>
       <w:r>
-        <w:t xml:space="preserve">2024</w:t>
+        <w:t xml:space="preserve">2025</w:t>
       </w:r>
       <w:r>
         <w:t xml:space="preserve">	</w:t>
       </w:r>
       <w:r>
-        <w:t xml:space="preserve">Texas A&amp;M Engineering News, Throwing Shade at Heatwaves </w:t>
-      </w:r>
-      <w:hyperlink w:history="1" r:id="rIdr9s5c_zw-esahizarikip">
+        <w:t xml:space="preserve">Texas A&amp;M Institute of Data Science (TAMIDS), TAMIDS Announces 2025-2026 Cohort of Student Ambassadors </w:t>
+      </w:r>
+      <w:hyperlink w:history="1" r:id="rIdmqkt0g2n0mtxf6a_judsk">
         <w:r>
           <w:rPr>
             <w:rStyle w:val="Hyperlink"/>
@@ -7464,9 +8530,39 @@
         <w:t xml:space="preserve">	</w:t>
       </w:r>
       <w:r>
+        <w:t xml:space="preserve">Texas A&amp;M Engineering News, Throwing Shade at Heatwaves </w:t>
+      </w:r>
+      <w:hyperlink w:history="1" r:id="rIdntfurscrumcjrxp79gzpf">
+        <w:r>
+          <w:rPr>
+            <w:rStyle w:val="Hyperlink"/>
+          </w:rPr>
+          <w:t xml:space="preserve">[link</w:t>
+        </w:r>
+      </w:hyperlink>
+      <w:r>
+        <w:t xml:space="preserve">]</w:t>
+      </w:r>
+    </w:p>
+    <w:p>
+      <w:pPr>
+        <w:tabs>
+          <w:tab w:val="left" w:pos="1440"/>
+        </w:tabs>
+        <w:spacing w:after="60" w:before="60"/>
+        <w:ind w:left="1440" w:hanging="1166"/>
+        <w:jc w:val="both"/>
+      </w:pPr>
+      <w:r>
+        <w:t xml:space="preserve">2024</w:t>
+      </w:r>
+      <w:r>
+        <w:t xml:space="preserve">	</w:t>
+      </w:r>
+      <w:r>
         <w:t xml:space="preserve">Esri Industry Blog, Showcasing Innovation in GIS Education through Student Projects at the LA Geospatial Summit </w:t>
       </w:r>
-      <w:hyperlink w:history="1" r:id="rIdfekwevuw5tnh630bcnsn9">
+      <w:hyperlink w:history="1" r:id="rIdc1uo57xdsxu-gc539_0a4">
         <w:r>
           <w:rPr>
             <w:rStyle w:val="Hyperlink"/>
@@ -7544,7 +8640,7 @@
         <w:sz w:val="22"/>
         <w:szCs w:val="22"/>
       </w:rPr>
-      <w:t xml:space="preserve">09/2026</w:t>
+      <w:t xml:space="preserve">10/2026</w:t>
     </w:r>
     <w:r>
       <w:rPr>

</xml_diff>

<commit_message>
CV: add CRC Press chapter Generative AI for Disaster Resilience (under review)
Co-Authored-By: Claude Opus 5.5 <noreply@anthropic.com>
</commit_message>
<xml_diff>
--- a/resume/Yifan_Yang_CV.docx
+++ b/resume/Yifan_Yang_CV.docx
@@ -126,7 +126,7 @@
             <w:r>
               <w:t xml:space="preserve">Email: </w:t>
             </w:r>
-            <w:hyperlink w:history="1" r:id="rIdyw3aqng0vhhn1jhoaye1h">
+            <w:hyperlink w:history="1" r:id="rIdbfs9kq3s5pyghbvnefg3l">
               <w:r>
                 <w:rPr>
                   <w:rStyle w:val="Hyperlink"/>
@@ -143,7 +143,7 @@
             <w:r>
               <w:t xml:space="preserve">Website: </w:t>
             </w:r>
-            <w:hyperlink w:history="1" r:id="rIdkfjqzpjms1gkn_9tdt7td">
+            <w:hyperlink w:history="1" r:id="rIdpehwi_hbj2cgupqcvr-kp">
               <w:r>
                 <w:rPr>
                   <w:rStyle w:val="Hyperlink"/>
@@ -160,7 +160,7 @@
             <w:r>
               <w:t xml:space="preserve">Google Scholar: </w:t>
             </w:r>
-            <w:hyperlink w:history="1" r:id="rIdx97fjbvwf-cz1h--80wj8">
+            <w:hyperlink w:history="1" r:id="rIdqm1qrux6qiwzzclxpznnw">
               <w:r>
                 <w:rPr>
                   <w:rStyle w:val="Hyperlink"/>
@@ -177,7 +177,7 @@
             <w:r>
               <w:t xml:space="preserve">ORCID: </w:t>
             </w:r>
-            <w:hyperlink w:history="1" r:id="rIdmnzxs9w-ttlimejaqylt4">
+            <w:hyperlink w:history="1" r:id="rIdti1bjaoh9hbjkt3ueld5d">
               <w:r>
                 <w:rPr>
                   <w:rStyle w:val="Hyperlink"/>
@@ -194,7 +194,7 @@
             <w:r>
               <w:t xml:space="preserve">GitHub: </w:t>
             </w:r>
-            <w:hyperlink w:history="1" r:id="rId-b5ct6xy7b11rvnpzrz9j">
+            <w:hyperlink w:history="1" r:id="rId5ylzcj8lrq-jh_o7mxwph">
               <w:r>
                 <w:rPr>
                   <w:rStyle w:val="Hyperlink"/>
@@ -1628,7 +1628,7 @@
       <w:r>
         <w:t xml:space="preserve"> A WebGIS / smartphone progressive web app with a risk-analyst assistant (Ray) that may only state what the evidence supports, and a Steward Harness that enforces outcome, process, and institutional validity in code. Submitted to OASIS @ ACM SIGSPATIAL 2026 (Track A). </w:t>
       </w:r>
-      <w:hyperlink w:history="1" r:id="rIdmlspdi2s_fq2jixhqcdfu">
+      <w:hyperlink w:history="1" r:id="rIdy0tkznyb7myzjbvj74r1x">
         <w:r>
           <w:rPr>
             <w:rStyle w:val="Hyperlink"/>
@@ -1639,7 +1639,7 @@
       <w:r>
         <w:t xml:space="preserve">] </w:t>
       </w:r>
-      <w:hyperlink w:history="1" r:id="rId8uvvo7m53v5saerlmfor3">
+      <w:hyperlink w:history="1" r:id="rIdptq8xgzfl3jklowv5hewo">
         <w:r>
           <w:rPr>
             <w:rStyle w:val="Hyperlink"/>
@@ -1732,7 +1732,7 @@
       <w:r>
         <w:t xml:space="preserve"> A multimodal generative framework that benchmarks cross-view image generation strategies integrating diffusion models, ControlNet, and VLM-guided semantic conditioning to synthesize realistic street-view imagery from post-disaster satellite imagery. </w:t>
       </w:r>
-      <w:hyperlink w:history="1" r:id="rId3hrq1ugod_smw1msgjiac">
+      <w:hyperlink w:history="1" r:id="rIdnj60uvebbjmekkgb4bolz">
         <w:r>
           <w:rPr>
             <w:rStyle w:val="Hyperlink"/>
@@ -1825,7 +1825,7 @@
       <w:r>
         <w:t xml:space="preserve"> An autonomous multi-agent GeoAI framework for hyperlocal, interpretable, near-real-time damage assessment that orchestrates specialized agents built on vision-language foundation models for cross-view perception, damage recognition, reasoning, and automated report generation without task-specific retraining. </w:t>
       </w:r>
-      <w:hyperlink w:history="1" r:id="rIdlwayj50remx8w4gkcmpfl">
+      <w:hyperlink w:history="1" r:id="rIdl8d83m1w8d5xgco3n34lk">
         <w:r>
           <w:rPr>
             <w:rStyle w:val="Hyperlink"/>
@@ -1904,7 +1904,7 @@
       <w:r>
         <w:t xml:space="preserve"> A multimodal arbitration framework for hyperlocal hurricane damage assessment from bi-temporal street-view imagery, integrating vision-language models (CLIP) with deep vision backbones (ViT-B/16) to improve robustness under post-disaster uncertainty. </w:t>
       </w:r>
-      <w:hyperlink w:history="1" r:id="rIddidphmntosi0gjmz2mjtz">
+      <w:hyperlink w:history="1" r:id="rIdsoa5ozjqv2q8kl12zlskm">
         <w:r>
           <w:rPr>
             <w:rStyle w:val="Hyperlink"/>
@@ -1969,7 +1969,7 @@
       <w:r>
         <w:t xml:space="preserve"> A dual-channel framework using pre-trained vision backbones (Swin Transformer, ConvNeXt) on pre- and post-disaster street-view pairs to improve the accuracy and interpretability of damage-severity estimation. </w:t>
       </w:r>
-      <w:hyperlink w:history="1" r:id="rIdaijjpfoujglxmqggpoepr">
+      <w:hyperlink w:history="1" r:id="rId5yucoilrj-n08aghhgyc_">
         <w:r>
           <w:rPr>
             <w:rStyle w:val="Hyperlink"/>
@@ -2043,7 +2043,7 @@
       <w:r>
         <w:t xml:space="preserve">: featured by Mosaic - Geospatial Imaging Leaders (Prague, Czech Republic) for 360° street-level surveying and disaster-intelligence applications </w:t>
       </w:r>
-      <w:hyperlink w:history="1" r:id="rIdxncbghd8kvshrnrqzp5uh">
+      <w:hyperlink w:history="1" r:id="rIdi-9ednpzen1taupoo3e9d">
         <w:r>
           <w:rPr>
             <w:rStyle w:val="Hyperlink"/>
@@ -2100,7 +2100,7 @@
       <w:r>
         <w:t xml:space="preserve">, AutonomousGeoAI4Science (AutoGeoAI4Sci), an open research community and hub for papers, tools, benchmarks, and collaboration advancing autonomous and multimodal GeoAI for scientific discovery. </w:t>
       </w:r>
-      <w:hyperlink w:history="1" r:id="rId5m0diyjxsji3ockfwwd5q">
+      <w:hyperlink w:history="1" r:id="rId5-m4noipx3dhk5qhg394k">
         <w:r>
           <w:rPr>
             <w:rStyle w:val="Hyperlink"/>
@@ -2206,7 +2206,7 @@
         </w:numPr>
         <w:spacing w:after="20" w:before="0"/>
       </w:pPr>
-      <w:hyperlink w:history="1" r:id="rId8pdnjp1-zatggqhwzlxyt">
+      <w:hyperlink w:history="1" r:id="rIdogwyfeybnnzfwbn3ruikc">
         <w:r>
           <w:rPr>
             <w:rStyle w:val="Hyperlink"/>
@@ -2236,7 +2236,7 @@
         <w:t xml:space="preserve">Total</w:t>
       </w:r>
       <w:r>
-        <w:t xml:space="preserve">: 27 (published/accepted: 22; in review: 2; preprints: 3)</w:t>
+        <w:t xml:space="preserve">: 28 (published/accepted: 22; in review: 3; preprints: 3)</w:t>
       </w:r>
     </w:p>
     <w:p>
@@ -2250,7 +2250,7 @@
         <w:spacing w:after="20" w:before="0"/>
       </w:pPr>
       <w:r>
-        <w:t xml:space="preserve">First-Authored Publications: 9 (journal articles: 3, conference proceedings: 5, book chapters: 1)</w:t>
+        <w:t xml:space="preserve">First-Authored Publications: 10 (journal articles: 3, conference papers: 5, book chapters: 2)</w:t>
       </w:r>
     </w:p>
     <w:p>
@@ -2264,7 +2264,7 @@
         <w:spacing w:after="20" w:before="0"/>
       </w:pPr>
       <w:r>
-        <w:t xml:space="preserve">Co-Authored Publications: 18 (journal articles: 10, conference proceedings: 5, preprints: 3)</w:t>
+        <w:t xml:space="preserve">Co-Authored Publications: 18 (journal articles: 10, conference papers: 5, preprints: 3)</w:t>
       </w:r>
     </w:p>
     <w:p>
@@ -2348,7 +2348,7 @@
           </w:tcPr>
           <w:p>
             <w:r>
-              <w:t xml:space="preserve">9.</w:t>
+              <w:t xml:space="preserve">10.</w:t>
             </w:r>
           </w:p>
         </w:tc>
@@ -2392,7 +2392,7 @@
             <w:r>
               <w:t xml:space="preserve">. </w:t>
             </w:r>
-            <w:hyperlink w:history="1" r:id="rIdm0kgbs2-sfjhyaaq4myw-">
+            <w:hyperlink w:history="1" r:id="rId5tvnbe8npee9sm9jmk7nz">
               <w:r>
                 <w:rPr>
                   <w:rStyle w:val="Hyperlink"/>
@@ -2435,7 +2435,7 @@
           </w:tcPr>
           <w:p>
             <w:r>
-              <w:t xml:space="preserve">2026</w:t>
+              <w:t xml:space="preserve">Review</w:t>
             </w:r>
           </w:p>
         </w:tc>
@@ -2457,7 +2457,7 @@
           </w:tcPr>
           <w:p>
             <w:r>
-              <w:t xml:space="preserve">8.</w:t>
+              <w:t xml:space="preserve">9.</w:t>
             </w:r>
           </w:p>
         </w:tc>
@@ -2489,19 +2489,121 @@
               <w:t xml:space="preserve">Yang, Y.</w:t>
             </w:r>
             <w:r>
-              <w:t xml:space="preserve">, Zou, L. When Satellite and Street Views Disagree: Cross-View Complementarity in Disaster Damage Assessment. </w:t>
+              <w:t xml:space="preserve">, Zou, L., Tian, H., Zhou, B., Abedin, J., Li, Z., Tu, Z. Generative AI for Disaster Resilience. In G. Mai, X. Huang, D. Jain, &amp; D. Lunga (Eds.), </w:t>
             </w:r>
             <w:r>
               <w:rPr>
                 <w:i/>
                 <w:iCs/>
               </w:rPr>
+              <w:t xml:space="preserve">Geography in the Age of Generative AI: Innovations in Mapping, Analysis &amp; Geospatial Applications</w:t>
+            </w:r>
+            <w:r>
+              <w:t xml:space="preserve">. CRC Press / Taylor &amp; Francis. </w:t>
+            </w:r>
+            <w:hyperlink w:history="1" r:id="rIdfd1jxj-gzhnnvxgbro7gj">
+              <w:r>
+                <w:rPr>
+                  <w:rStyle w:val="Hyperlink"/>
+                </w:rPr>
+                <w:t xml:space="preserve">[project page</w:t>
+              </w:r>
+            </w:hyperlink>
+            <w:r>
+              <w:t xml:space="preserve">]</w:t>
+            </w:r>
+          </w:p>
+        </w:tc>
+      </w:tr>
+      <w:tr>
+        <w:trPr>
+          <w:cantSplit/>
+        </w:trPr>
+        <w:tc>
+          <w:tcPr>
+            <w:tcW w:type="dxa" w:w="1000"/>
+            <w:tcBorders>
+              <w:top w:val="none" w:color="FFFFFF" w:sz="0"/>
+              <w:left w:val="none" w:color="FFFFFF" w:sz="0"/>
+              <w:bottom w:val="none" w:color="FFFFFF" w:sz="0"/>
+              <w:right w:val="none" w:color="FFFFFF" w:sz="0"/>
+            </w:tcBorders>
+            <w:tcMar>
+              <w:top w:type="dxa" w:w="40"/>
+              <w:left w:type="dxa" w:w="60"/>
+              <w:bottom w:type="dxa" w:w="40"/>
+              <w:right w:type="dxa" w:w="60"/>
+            </w:tcMar>
+          </w:tcPr>
+          <w:p>
+            <w:r>
+              <w:t xml:space="preserve">2026</w:t>
+            </w:r>
+          </w:p>
+        </w:tc>
+        <w:tc>
+          <w:tcPr>
+            <w:tcW w:type="dxa" w:w="500"/>
+            <w:tcBorders>
+              <w:top w:val="none" w:color="FFFFFF" w:sz="0"/>
+              <w:left w:val="none" w:color="FFFFFF" w:sz="0"/>
+              <w:bottom w:val="none" w:color="FFFFFF" w:sz="0"/>
+              <w:right w:val="none" w:color="FFFFFF" w:sz="0"/>
+            </w:tcBorders>
+            <w:tcMar>
+              <w:top w:type="dxa" w:w="40"/>
+              <w:left w:type="dxa" w:w="60"/>
+              <w:bottom w:type="dxa" w:w="40"/>
+              <w:right w:type="dxa" w:w="60"/>
+            </w:tcMar>
+          </w:tcPr>
+          <w:p>
+            <w:r>
+              <w:t xml:space="preserve">8.</w:t>
+            </w:r>
+          </w:p>
+        </w:tc>
+        <w:tc>
+          <w:tcPr>
+            <w:tcW w:type="dxa" w:w="8580"/>
+            <w:tcBorders>
+              <w:top w:val="none" w:color="FFFFFF" w:sz="0"/>
+              <w:left w:val="none" w:color="FFFFFF" w:sz="0"/>
+              <w:bottom w:val="none" w:color="FFFFFF" w:sz="0"/>
+              <w:right w:val="none" w:color="FFFFFF" w:sz="0"/>
+            </w:tcBorders>
+            <w:tcMar>
+              <w:top w:type="dxa" w:w="40"/>
+              <w:left w:type="dxa" w:w="60"/>
+              <w:bottom w:type="dxa" w:w="40"/>
+              <w:right w:type="dxa" w:w="60"/>
+            </w:tcMar>
+          </w:tcPr>
+          <w:p>
+            <w:pPr>
+              <w:jc w:val="both"/>
+            </w:pPr>
+            <w:r>
+              <w:rPr>
+                <w:b/>
+                <w:bCs/>
+              </w:rPr>
+              <w:t xml:space="preserve">Yang, Y.</w:t>
+            </w:r>
+            <w:r>
+              <w:t xml:space="preserve">, Zou, L. When Satellite and Street Views Disagree: Cross-View Complementarity in Disaster Damage Assessment. </w:t>
+            </w:r>
+            <w:r>
+              <w:rPr>
+                <w:i/>
+                <w:iCs/>
+              </w:rPr>
               <w:t xml:space="preserve">Proceedings of the 5th ACM SIGSPATIAL International Workshop on Searching and Mining Large Collections of Geospatial Data (GeoSearch '26)</w:t>
             </w:r>
             <w:r>
               <w:t xml:space="preserve">, Riverside, CA (Lightning talk, 4 pages; Accepted). </w:t>
             </w:r>
-            <w:hyperlink w:history="1" r:id="rIddd8fr4jwazm_irvdjcdbu">
+            <w:hyperlink w:history="1" r:id="rIdplabrbzdxnp6ml-2t-fm1">
               <w:r>
                 <w:rPr>
                   <w:rStyle w:val="Hyperlink"/>
@@ -2603,7 +2705,7 @@
             <w:r>
               <w:t xml:space="preserve">, Riverside, CA (Applications Track full paper, 12 pages; Accepted). </w:t>
             </w:r>
-            <w:hyperlink w:history="1" r:id="rIdzq1zzzcf_dv5bg2klmeci">
+            <w:hyperlink w:history="1" r:id="rId_edbv1z2x92gbn6d4ww4g">
               <w:r>
                 <w:rPr>
                   <w:rStyle w:val="Hyperlink"/>
@@ -2705,7 +2807,7 @@
             <w:r>
               <w:t xml:space="preserve">, St. Louis, MO (Accepted). </w:t>
             </w:r>
-            <w:hyperlink w:history="1" r:id="rIdosysaiebqmllpmj-dfamr">
+            <w:hyperlink w:history="1" r:id="rIdcvcf2uvhfztqjjhogc9ih">
               <w:r>
                 <w:rPr>
                   <w:rStyle w:val="Hyperlink"/>
@@ -2807,7 +2909,7 @@
             <w:r>
               <w:t xml:space="preserve">, Washington, D.C. (Accepted). </w:t>
             </w:r>
-            <w:hyperlink w:history="1" r:id="rIdhyclq9al3xd9sc_66rew_">
+            <w:hyperlink w:history="1" r:id="rIdehnl0b4ermhuwn8dzxjyk">
               <w:r>
                 <w:rPr>
                   <w:rStyle w:val="Hyperlink"/>
@@ -2909,7 +3011,7 @@
             <w:r>
               <w:t xml:space="preserve">, 121, 102335. </w:t>
             </w:r>
-            <w:hyperlink w:history="1" r:id="rId56ifv7_5mgzzplsnntzpc">
+            <w:hyperlink w:history="1" r:id="rIdb1_lr-ihhofhvjqxiv6fi">
               <w:r>
                 <w:rPr>
                   <w:rStyle w:val="Hyperlink"/>
@@ -3018,7 +3120,7 @@
             <w:r>
               <w:t xml:space="preserve">, 10, 310. </w:t>
             </w:r>
-            <w:hyperlink w:history="1" r:id="rIdvc6-mqvsxnebjdncrhhyd">
+            <w:hyperlink w:history="1" r:id="rIdmq9vdyki-6rxrazenauoi">
               <w:r>
                 <w:rPr>
                   <w:rStyle w:val="Hyperlink"/>
@@ -3127,7 +3229,7 @@
             <w:r>
               <w:t xml:space="preserve"> (Chapter 7, pp. 113-122). Redlands, CA: Esri Press. </w:t>
             </w:r>
-            <w:hyperlink w:history="1" r:id="rIdkxyelxbp9gacvskzix15h">
+            <w:hyperlink w:history="1" r:id="rIdxekpo_wamhnink5mhrepr">
               <w:r>
                 <w:rPr>
                   <w:rStyle w:val="Hyperlink"/>
@@ -3229,7 +3331,7 @@
             <w:r>
               <w:t xml:space="preserve">, 14(16), 7091. </w:t>
             </w:r>
-            <w:hyperlink w:history="1" r:id="rIdgutvndltp6jbjhjbkseqq">
+            <w:hyperlink w:history="1" r:id="rIdm7llfct7412dt4-68yuyp">
               <w:r>
                 <w:rPr>
                   <w:rStyle w:val="Hyperlink"/>
@@ -3372,7 +3474,7 @@
             <w:r>
               <w:t xml:space="preserve">. </w:t>
             </w:r>
-            <w:hyperlink w:history="1" r:id="rIdwal98uwhgupkejc3etbiu">
+            <w:hyperlink w:history="1" r:id="rIdrqgh2nn4y161yeelsk2hh">
               <w:r>
                 <w:rPr>
                   <w:rStyle w:val="Hyperlink"/>
@@ -3477,7 +3579,7 @@
             <w:r>
               <w:t xml:space="preserve"> (Accepted). </w:t>
             </w:r>
-            <w:hyperlink w:history="1" r:id="rIdonsgo2pljnaxffufrx7qd">
+            <w:hyperlink w:history="1" r:id="rIdgbn2qzsqhyvb8wfm3plgl">
               <w:r>
                 <w:rPr>
                   <w:rStyle w:val="Hyperlink"/>
@@ -3582,7 +3684,7 @@
             <w:r>
               <w:t xml:space="preserve">, 146, 106470. </w:t>
             </w:r>
-            <w:hyperlink w:history="1" r:id="rIdc8lat_umtpjljenhkt0mn">
+            <w:hyperlink w:history="1" r:id="rId5kbe9pe9tbyl9--qj4ggl">
               <w:r>
                 <w:rPr>
                   <w:rStyle w:val="Hyperlink"/>
@@ -3687,7 +3789,7 @@
             <w:r>
               <w:t xml:space="preserve">, 142440. </w:t>
             </w:r>
-            <w:hyperlink w:history="1" r:id="rIdqifswveedxwlxsxnefznk">
+            <w:hyperlink w:history="1" r:id="rIdhhnlf6pm0afwblkuhukai">
               <w:r>
                 <w:rPr>
                   <w:rStyle w:val="Hyperlink"/>
@@ -3792,7 +3894,7 @@
             <w:r>
               <w:t xml:space="preserve">, 150, 105342. </w:t>
             </w:r>
-            <w:hyperlink w:history="1" r:id="rIdls7yz9jyh6pqwyngviv0t">
+            <w:hyperlink w:history="1" r:id="rIdxfc9ft2umap5vjlxgntf7">
               <w:r>
                 <w:rPr>
                   <w:rStyle w:val="Hyperlink"/>
@@ -4085,7 +4187,7 @@
             <w:r>
               <w:t xml:space="preserve">, 1-15. </w:t>
             </w:r>
-            <w:hyperlink w:history="1" r:id="rIdndejjj_cdakokf4qw5njy">
+            <w:hyperlink w:history="1" r:id="rIdf0vwyuvtqhk5c9dem7cxt">
               <w:r>
                 <w:rPr>
                   <w:rStyle w:val="Hyperlink"/>
@@ -4190,7 +4292,7 @@
             <w:r>
               <w:t xml:space="preserve">, 64(3), 1415-1434. </w:t>
             </w:r>
-            <w:hyperlink w:history="1" r:id="rIdzae0xnvoyaq6qqcaagspe">
+            <w:hyperlink w:history="1" r:id="rIdvbpi0sesdavar8egnfjrj">
               <w:r>
                 <w:rPr>
                   <w:rStyle w:val="Hyperlink"/>
@@ -4427,7 +4529,7 @@
             <w:r>
               <w:t xml:space="preserve">, Chicago, IL (Research Poster; Accepted). </w:t>
             </w:r>
-            <w:hyperlink w:history="1" r:id="rIdxjg_vgbyitfjp1otbuewh">
+            <w:hyperlink w:history="1" r:id="rId8cstdfbcbuxu5yo4cyvtw">
               <w:r>
                 <w:rPr>
                   <w:rStyle w:val="Hyperlink"/>
@@ -4626,7 +4728,7 @@
             <w:r>
               <w:t xml:space="preserve">, Riverside, CA (Short paper; Accepted). </w:t>
             </w:r>
-            <w:hyperlink w:history="1" r:id="rIdnaljd1s3soh0v46vgnsz5">
+            <w:hyperlink w:history="1" r:id="rIdd2mq6jc3znjohgphbljli">
               <w:r>
                 <w:rPr>
                   <w:rStyle w:val="Hyperlink"/>
@@ -4957,7 +5059,7 @@
             <w:r>
               <w:t xml:space="preserve">. </w:t>
             </w:r>
-            <w:hyperlink w:history="1" r:id="rIdflpz8ipwkupttu_byrg63">
+            <w:hyperlink w:history="1" r:id="rIdaeh5wpzqyvmpndyqm9cv_">
               <w:r>
                 <w:rPr>
                   <w:rStyle w:val="Hyperlink"/>
@@ -5052,7 +5154,7 @@
             <w:r>
               <w:t xml:space="preserve">. </w:t>
             </w:r>
-            <w:hyperlink w:history="1" r:id="rIdxy9evib2fqyygvoepwsol">
+            <w:hyperlink w:history="1" r:id="rIdqq22c3df4viux5ip_cili">
               <w:r>
                 <w:rPr>
                   <w:rStyle w:val="Hyperlink"/>
@@ -5157,7 +5259,7 @@
             <w:r>
               <w:t xml:space="preserve">. </w:t>
             </w:r>
-            <w:hyperlink w:history="1" r:id="rIdomcpb9gdeir7x1jwqp0wo">
+            <w:hyperlink w:history="1" r:id="rId8cgo2h08u26__l8uchzwu">
               <w:r>
                 <w:rPr>
                   <w:rStyle w:val="Hyperlink"/>
@@ -6474,7 +6576,7 @@
             <w:r>
               <w:t xml:space="preserve">, Online (09/23, 2026). </w:t>
             </w:r>
-            <w:hyperlink w:history="1" r:id="rId-qvl-csn13vb9g-r_yxvh">
+            <w:hyperlink w:history="1" r:id="rIdk_ejwzzzmxzdmbsbwndsf">
               <w:r>
                 <w:rPr>
                   <w:rStyle w:val="Hyperlink"/>
@@ -7395,7 +7497,7 @@
             <w:r>
               <w:t xml:space="preserve">, Virtual. </w:t>
             </w:r>
-            <w:hyperlink w:history="1" r:id="rIdcb-tfgspsakghmmyub0-n">
+            <w:hyperlink w:history="1" r:id="rIdi1k5hozzhhh6zrovkbwc9">
               <w:r>
                 <w:rPr>
                   <w:rStyle w:val="Hyperlink"/>
@@ -7738,7 +7840,7 @@
       <w:r>
         <w:t xml:space="preserve">Organizer and Chair, GeoAI Symposium: Panel Session on AI and Disaster Resilience, AAG 2027 Annual Meeting, New York, NY (02/08-02/12, 2027) </w:t>
       </w:r>
-      <w:hyperlink w:history="1" r:id="rIdq_1qovqpwballkbrta9ee">
+      <w:hyperlink w:history="1" r:id="rIdcthpgte8eggzom6bnfpfs">
         <w:r>
           <w:rPr>
             <w:rStyle w:val="Hyperlink"/>
@@ -7787,7 +7889,7 @@
       <w:r>
         <w:t xml:space="preserve">Session Co-Organizer, “GeoAI and Data Science for Disaster Resilience,” 33rd International Conference on Geoinformatics (GeoInformatics 2026), Singapore (with Lei Zou, Yi Qiang, Yingjie Hu, Qunying Huang, Xiao Huang, and Bing Zhou) </w:t>
       </w:r>
-      <w:hyperlink w:history="1" r:id="rIdgaxiitewvrgcjlcwdwv5w">
+      <w:hyperlink w:history="1" r:id="rIdp43f5wcnucocqnzyoxkmi">
         <w:r>
           <w:rPr>
             <w:rStyle w:val="Hyperlink"/>
@@ -8143,7 +8245,7 @@
       <w:r>
         <w:t xml:space="preserve">Founder, Rayford AI: building a geospatial physical AI company that turns remote sensing, street-level imagery, and geospatial context into auditable intelligence for disaster assessment, claims triage, and infrastructure and property decisions </w:t>
       </w:r>
-      <w:hyperlink w:history="1" r:id="rId_dmfipux1xp1fi_5m_j3e">
+      <w:hyperlink w:history="1" r:id="rIdjflqccvkex9cp-7hydhfq">
         <w:r>
           <w:rPr>
             <w:rStyle w:val="Hyperlink"/>
@@ -8192,7 +8294,7 @@
       <w:r>
         <w:t xml:space="preserve">Featured Research, Mosaic - Geospatial Imaging Leaders (Prague, Czech Republic): hyperlocal damage assessment using Mosaic street-level imagery from Hurricane Milton </w:t>
       </w:r>
-      <w:hyperlink w:history="1" r:id="rIdwcverxtmcqucttrjtrvns">
+      <w:hyperlink w:history="1" r:id="rIdn0rl4a9puqxycvihfrou2">
         <w:r>
           <w:rPr>
             <w:rStyle w:val="Hyperlink"/>
@@ -8442,7 +8544,7 @@
       <w:r>
         <w:t xml:space="preserve">Texas A&amp;M College of Arts &amp; Sciences, Five Texas A&amp;M Researchers Join National Climate-Health Initiative </w:t>
       </w:r>
-      <w:hyperlink w:history="1" r:id="rIdooj1_picfb5lg_iwuht4w">
+      <w:hyperlink w:history="1" r:id="rId9fpvj7ffhhfbt4_wpekcn">
         <w:r>
           <w:rPr>
             <w:rStyle w:val="Hyperlink"/>
@@ -8472,7 +8574,7 @@
       <w:r>
         <w:t xml:space="preserve">Mosaic - Geospatial Imaging Leaders, How Texas A&amp;M Is Pioneering Damage Assessment Using Mosaic Imagery from Hurricane Milton </w:t>
       </w:r>
-      <w:hyperlink w:history="1" r:id="rIdw2utevucblthtnd0n8ca7">
+      <w:hyperlink w:history="1" r:id="rId5etxlg9qhuo7qc_4wlqre">
         <w:r>
           <w:rPr>
             <w:rStyle w:val="Hyperlink"/>
@@ -8502,7 +8604,7 @@
       <w:r>
         <w:t xml:space="preserve">Texas A&amp;M Institute of Data Science (TAMIDS), TAMIDS Announces 2025-2026 Cohort of Student Ambassadors </w:t>
       </w:r>
-      <w:hyperlink w:history="1" r:id="rIdmqkt0g2n0mtxf6a_judsk">
+      <w:hyperlink w:history="1" r:id="rIdgyodawlvdwje5u4hf8f-9">
         <w:r>
           <w:rPr>
             <w:rStyle w:val="Hyperlink"/>
@@ -8532,7 +8634,7 @@
       <w:r>
         <w:t xml:space="preserve">Texas A&amp;M Engineering News, Throwing Shade at Heatwaves </w:t>
       </w:r>
-      <w:hyperlink w:history="1" r:id="rIdntfurscrumcjrxp79gzpf">
+      <w:hyperlink w:history="1" r:id="rId5shubba9u54m18ny0yoml">
         <w:r>
           <w:rPr>
             <w:rStyle w:val="Hyperlink"/>
@@ -8562,7 +8664,7 @@
       <w:r>
         <w:t xml:space="preserve">Esri Industry Blog, Showcasing Innovation in GIS Education through Student Projects at the LA Geospatial Summit </w:t>
       </w:r>
-      <w:hyperlink w:history="1" r:id="rIdc1uo57xdsxu-gc539_0a4">
+      <w:hyperlink w:history="1" r:id="rId3-yxls9vwdis6hr6n67uq">
         <w:r>
           <w:rPr>
             <w:rStyle w:val="Hyperlink"/>

</xml_diff>

<commit_message>
CV: list Yifan first on I-GUIDE VCO talk; mark Sat2Street, RAPID, DamageArbiter projects 2025-2026
Co-Authored-By: Claude Opus 5.5 <noreply@anthropic.com>
</commit_message>
<xml_diff>
--- a/resume/Yifan_Yang_CV.docx
+++ b/resume/Yifan_Yang_CV.docx
@@ -126,7 +126,7 @@
             <w:r>
               <w:t xml:space="preserve">Email: </w:t>
             </w:r>
-            <w:hyperlink w:history="1" r:id="rIdbfs9kq3s5pyghbvnefg3l">
+            <w:hyperlink w:history="1" r:id="rIdqx5zl9iisu9xrwnacst2n">
               <w:r>
                 <w:rPr>
                   <w:rStyle w:val="Hyperlink"/>
@@ -143,7 +143,7 @@
             <w:r>
               <w:t xml:space="preserve">Website: </w:t>
             </w:r>
-            <w:hyperlink w:history="1" r:id="rIdpehwi_hbj2cgupqcvr-kp">
+            <w:hyperlink w:history="1" r:id="rIdcf6sospncz4j8l6jwcx-j">
               <w:r>
                 <w:rPr>
                   <w:rStyle w:val="Hyperlink"/>
@@ -160,7 +160,7 @@
             <w:r>
               <w:t xml:space="preserve">Google Scholar: </w:t>
             </w:r>
-            <w:hyperlink w:history="1" r:id="rIdqm1qrux6qiwzzclxpznnw">
+            <w:hyperlink w:history="1" r:id="rIdmtq2mxthrvdblqhdrzwkj">
               <w:r>
                 <w:rPr>
                   <w:rStyle w:val="Hyperlink"/>
@@ -177,7 +177,7 @@
             <w:r>
               <w:t xml:space="preserve">ORCID: </w:t>
             </w:r>
-            <w:hyperlink w:history="1" r:id="rIdti1bjaoh9hbjkt3ueld5d">
+            <w:hyperlink w:history="1" r:id="rIdd2iagc6y-7bmedkg4n53j">
               <w:r>
                 <w:rPr>
                   <w:rStyle w:val="Hyperlink"/>
@@ -194,7 +194,7 @@
             <w:r>
               <w:t xml:space="preserve">GitHub: </w:t>
             </w:r>
-            <w:hyperlink w:history="1" r:id="rId5ylzcj8lrq-jh_o7mxwph">
+            <w:hyperlink w:history="1" r:id="rIdk3s5nmganhrvthuez_cgl">
               <w:r>
                 <w:rPr>
                   <w:rStyle w:val="Hyperlink"/>
@@ -1628,7 +1628,7 @@
       <w:r>
         <w:t xml:space="preserve"> A WebGIS / smartphone progressive web app with a risk-analyst assistant (Ray) that may only state what the evidence supports, and a Steward Harness that enforces outcome, process, and institutional validity in code. Submitted to OASIS @ ACM SIGSPATIAL 2026 (Track A). </w:t>
       </w:r>
-      <w:hyperlink w:history="1" r:id="rIdy0tkznyb7myzjbvj74r1x">
+      <w:hyperlink w:history="1" r:id="rIdkkji2lnd2tl6gv_ijhp1q">
         <w:r>
           <w:rPr>
             <w:rStyle w:val="Hyperlink"/>
@@ -1639,7 +1639,7 @@
       <w:r>
         <w:t xml:space="preserve">] </w:t>
       </w:r>
-      <w:hyperlink w:history="1" r:id="rIdptq8xgzfl3jklowv5hewo">
+      <w:hyperlink w:history="1" r:id="rIdpmuvqyqctun0eifyxnn21">
         <w:r>
           <w:rPr>
             <w:rStyle w:val="Hyperlink"/>
@@ -1717,7 +1717,7 @@
         <w:jc w:val="both"/>
       </w:pPr>
       <w:r>
-        <w:t xml:space="preserve">2025-pres.</w:t>
+        <w:t xml:space="preserve">2025-2026</w:t>
       </w:r>
       <w:r>
         <w:t xml:space="preserve">	</w:t>
@@ -1732,7 +1732,7 @@
       <w:r>
         <w:t xml:space="preserve"> A multimodal generative framework that benchmarks cross-view image generation strategies integrating diffusion models, ControlNet, and VLM-guided semantic conditioning to synthesize realistic street-view imagery from post-disaster satellite imagery. </w:t>
       </w:r>
-      <w:hyperlink w:history="1" r:id="rIdnj60uvebbjmekkgb4bolz">
+      <w:hyperlink w:history="1" r:id="rId2vm5ax9qp7jo-8gvh07wh">
         <w:r>
           <w:rPr>
             <w:rStyle w:val="Hyperlink"/>
@@ -1810,7 +1810,7 @@
         <w:jc w:val="both"/>
       </w:pPr>
       <w:r>
-        <w:t xml:space="preserve">2025-pres.</w:t>
+        <w:t xml:space="preserve">2025-2026</w:t>
       </w:r>
       <w:r>
         <w:t xml:space="preserve">	</w:t>
@@ -1825,7 +1825,7 @@
       <w:r>
         <w:t xml:space="preserve"> An autonomous multi-agent GeoAI framework for hyperlocal, interpretable, near-real-time damage assessment that orchestrates specialized agents built on vision-language foundation models for cross-view perception, damage recognition, reasoning, and automated report generation without task-specific retraining. </w:t>
       </w:r>
-      <w:hyperlink w:history="1" r:id="rIdl8d83m1w8d5xgco3n34lk">
+      <w:hyperlink w:history="1" r:id="rIdsna5b9tlzjgm-bhrtcjbk">
         <w:r>
           <w:rPr>
             <w:rStyle w:val="Hyperlink"/>
@@ -1889,7 +1889,7 @@
         <w:jc w:val="both"/>
       </w:pPr>
       <w:r>
-        <w:t xml:space="preserve">2025-pres.</w:t>
+        <w:t xml:space="preserve">2025-2026</w:t>
       </w:r>
       <w:r>
         <w:t xml:space="preserve">	</w:t>
@@ -1904,7 +1904,7 @@
       <w:r>
         <w:t xml:space="preserve"> A multimodal arbitration framework for hyperlocal hurricane damage assessment from bi-temporal street-view imagery, integrating vision-language models (CLIP) with deep vision backbones (ViT-B/16) to improve robustness under post-disaster uncertainty. </w:t>
       </w:r>
-      <w:hyperlink w:history="1" r:id="rIdsoa5ozjqv2q8kl12zlskm">
+      <w:hyperlink w:history="1" r:id="rIdlobhmhebutcjsfpzpjnxd">
         <w:r>
           <w:rPr>
             <w:rStyle w:val="Hyperlink"/>
@@ -1969,7 +1969,7 @@
       <w:r>
         <w:t xml:space="preserve"> A dual-channel framework using pre-trained vision backbones (Swin Transformer, ConvNeXt) on pre- and post-disaster street-view pairs to improve the accuracy and interpretability of damage-severity estimation. </w:t>
       </w:r>
-      <w:hyperlink w:history="1" r:id="rId5yucoilrj-n08aghhgyc_">
+      <w:hyperlink w:history="1" r:id="rIdzgeapalc9kkpnvvjkvbht">
         <w:r>
           <w:rPr>
             <w:rStyle w:val="Hyperlink"/>
@@ -2043,7 +2043,7 @@
       <w:r>
         <w:t xml:space="preserve">: featured by Mosaic - Geospatial Imaging Leaders (Prague, Czech Republic) for 360° street-level surveying and disaster-intelligence applications </w:t>
       </w:r>
-      <w:hyperlink w:history="1" r:id="rIdi-9ednpzen1taupoo3e9d">
+      <w:hyperlink w:history="1" r:id="rId2-c36hjxnasbkvo1j5a7l">
         <w:r>
           <w:rPr>
             <w:rStyle w:val="Hyperlink"/>
@@ -2100,7 +2100,7 @@
       <w:r>
         <w:t xml:space="preserve">, AutonomousGeoAI4Science (AutoGeoAI4Sci), an open research community and hub for papers, tools, benchmarks, and collaboration advancing autonomous and multimodal GeoAI for scientific discovery. </w:t>
       </w:r>
-      <w:hyperlink w:history="1" r:id="rId5-m4noipx3dhk5qhg394k">
+      <w:hyperlink w:history="1" r:id="rIdfjr4jjv8h6w1hp4eo3grn">
         <w:r>
           <w:rPr>
             <w:rStyle w:val="Hyperlink"/>
@@ -2206,7 +2206,7 @@
         </w:numPr>
         <w:spacing w:after="20" w:before="0"/>
       </w:pPr>
-      <w:hyperlink w:history="1" r:id="rIdogwyfeybnnzfwbn3ruikc">
+      <w:hyperlink w:history="1" r:id="rIdazqf2uvdycurvydiczrip">
         <w:r>
           <w:rPr>
             <w:rStyle w:val="Hyperlink"/>
@@ -2392,7 +2392,7 @@
             <w:r>
               <w:t xml:space="preserve">. </w:t>
             </w:r>
-            <w:hyperlink w:history="1" r:id="rId5tvnbe8npee9sm9jmk7nz">
+            <w:hyperlink w:history="1" r:id="rIdcjzqentkjnd9l23y--tbx">
               <w:r>
                 <w:rPr>
                   <w:rStyle w:val="Hyperlink"/>
@@ -2501,7 +2501,7 @@
             <w:r>
               <w:t xml:space="preserve">. CRC Press / Taylor &amp; Francis. </w:t>
             </w:r>
-            <w:hyperlink w:history="1" r:id="rIdfd1jxj-gzhnnvxgbro7gj">
+            <w:hyperlink w:history="1" r:id="rIdc_zz-2r7s-epp-f5wjlhy">
               <w:r>
                 <w:rPr>
                   <w:rStyle w:val="Hyperlink"/>
@@ -2603,7 +2603,7 @@
             <w:r>
               <w:t xml:space="preserve">, Riverside, CA (Lightning talk, 4 pages; Accepted). </w:t>
             </w:r>
-            <w:hyperlink w:history="1" r:id="rIdplabrbzdxnp6ml-2t-fm1">
+            <w:hyperlink w:history="1" r:id="rIdrjitvk3w5bhahlorrf7qs">
               <w:r>
                 <w:rPr>
                   <w:rStyle w:val="Hyperlink"/>
@@ -2705,7 +2705,7 @@
             <w:r>
               <w:t xml:space="preserve">, Riverside, CA (Applications Track full paper, 12 pages; Accepted). </w:t>
             </w:r>
-            <w:hyperlink w:history="1" r:id="rId_edbv1z2x92gbn6d4ww4g">
+            <w:hyperlink w:history="1" r:id="rIdxb1l6vbey8xxlg79wtdqy">
               <w:r>
                 <w:rPr>
                   <w:rStyle w:val="Hyperlink"/>
@@ -2807,7 +2807,7 @@
             <w:r>
               <w:t xml:space="preserve">, St. Louis, MO (Accepted). </w:t>
             </w:r>
-            <w:hyperlink w:history="1" r:id="rIdcvcf2uvhfztqjjhogc9ih">
+            <w:hyperlink w:history="1" r:id="rIdjddrhmf-vqivf_dz6d9me">
               <w:r>
                 <w:rPr>
                   <w:rStyle w:val="Hyperlink"/>
@@ -2909,7 +2909,7 @@
             <w:r>
               <w:t xml:space="preserve">, Washington, D.C. (Accepted). </w:t>
             </w:r>
-            <w:hyperlink w:history="1" r:id="rIdehnl0b4ermhuwn8dzxjyk">
+            <w:hyperlink w:history="1" r:id="rIdtjnsbqd2dtqpd9tbppalc">
               <w:r>
                 <w:rPr>
                   <w:rStyle w:val="Hyperlink"/>
@@ -3011,7 +3011,7 @@
             <w:r>
               <w:t xml:space="preserve">, 121, 102335. </w:t>
             </w:r>
-            <w:hyperlink w:history="1" r:id="rIdb1_lr-ihhofhvjqxiv6fi">
+            <w:hyperlink w:history="1" r:id="rIdrh0rg8ucmch-0z_z2dblf">
               <w:r>
                 <w:rPr>
                   <w:rStyle w:val="Hyperlink"/>
@@ -3120,7 +3120,7 @@
             <w:r>
               <w:t xml:space="preserve">, 10, 310. </w:t>
             </w:r>
-            <w:hyperlink w:history="1" r:id="rIdmq9vdyki-6rxrazenauoi">
+            <w:hyperlink w:history="1" r:id="rIdvhlxlnwnen05p5ll6fwmp">
               <w:r>
                 <w:rPr>
                   <w:rStyle w:val="Hyperlink"/>
@@ -3229,7 +3229,7 @@
             <w:r>
               <w:t xml:space="preserve"> (Chapter 7, pp. 113-122). Redlands, CA: Esri Press. </w:t>
             </w:r>
-            <w:hyperlink w:history="1" r:id="rIdxekpo_wamhnink5mhrepr">
+            <w:hyperlink w:history="1" r:id="rIdi33x8ltxtj7uo_xc9gmo7">
               <w:r>
                 <w:rPr>
                   <w:rStyle w:val="Hyperlink"/>
@@ -3331,7 +3331,7 @@
             <w:r>
               <w:t xml:space="preserve">, 14(16), 7091. </w:t>
             </w:r>
-            <w:hyperlink w:history="1" r:id="rIdm7llfct7412dt4-68yuyp">
+            <w:hyperlink w:history="1" r:id="rIdd3gr5a4qizy0bxd_fxgmv">
               <w:r>
                 <w:rPr>
                   <w:rStyle w:val="Hyperlink"/>
@@ -3474,7 +3474,7 @@
             <w:r>
               <w:t xml:space="preserve">. </w:t>
             </w:r>
-            <w:hyperlink w:history="1" r:id="rIdrqgh2nn4y161yeelsk2hh">
+            <w:hyperlink w:history="1" r:id="rId0twtsl4pnb7qxydcjseqj">
               <w:r>
                 <w:rPr>
                   <w:rStyle w:val="Hyperlink"/>
@@ -3579,7 +3579,7 @@
             <w:r>
               <w:t xml:space="preserve"> (Accepted). </w:t>
             </w:r>
-            <w:hyperlink w:history="1" r:id="rIdgbn2qzsqhyvb8wfm3plgl">
+            <w:hyperlink w:history="1" r:id="rIdmelhtyjnh-zpvy_itligi">
               <w:r>
                 <w:rPr>
                   <w:rStyle w:val="Hyperlink"/>
@@ -3684,7 +3684,7 @@
             <w:r>
               <w:t xml:space="preserve">, 146, 106470. </w:t>
             </w:r>
-            <w:hyperlink w:history="1" r:id="rId5kbe9pe9tbyl9--qj4ggl">
+            <w:hyperlink w:history="1" r:id="rId8sjrssmyssqtmjkol9b9j">
               <w:r>
                 <w:rPr>
                   <w:rStyle w:val="Hyperlink"/>
@@ -3789,7 +3789,7 @@
             <w:r>
               <w:t xml:space="preserve">, 142440. </w:t>
             </w:r>
-            <w:hyperlink w:history="1" r:id="rIdhhnlf6pm0afwblkuhukai">
+            <w:hyperlink w:history="1" r:id="rIdgllarh8shaubghsqmdhi2">
               <w:r>
                 <w:rPr>
                   <w:rStyle w:val="Hyperlink"/>
@@ -3894,7 +3894,7 @@
             <w:r>
               <w:t xml:space="preserve">, 150, 105342. </w:t>
             </w:r>
-            <w:hyperlink w:history="1" r:id="rIdxfc9ft2umap5vjlxgntf7">
+            <w:hyperlink w:history="1" r:id="rIdvgih8lch9xbazgcvlzsk8">
               <w:r>
                 <w:rPr>
                   <w:rStyle w:val="Hyperlink"/>
@@ -4187,7 +4187,7 @@
             <w:r>
               <w:t xml:space="preserve">, 1-15. </w:t>
             </w:r>
-            <w:hyperlink w:history="1" r:id="rIdf0vwyuvtqhk5c9dem7cxt">
+            <w:hyperlink w:history="1" r:id="rIdf49dusd7di6n5d014v_qd">
               <w:r>
                 <w:rPr>
                   <w:rStyle w:val="Hyperlink"/>
@@ -4292,7 +4292,7 @@
             <w:r>
               <w:t xml:space="preserve">, 64(3), 1415-1434. </w:t>
             </w:r>
-            <w:hyperlink w:history="1" r:id="rIdvbpi0sesdavar8egnfjrj">
+            <w:hyperlink w:history="1" r:id="rIdrndnl8jmlphfpvuig_qoq">
               <w:r>
                 <w:rPr>
                   <w:rStyle w:val="Hyperlink"/>
@@ -4529,7 +4529,7 @@
             <w:r>
               <w:t xml:space="preserve">, Chicago, IL (Research Poster; Accepted). </w:t>
             </w:r>
-            <w:hyperlink w:history="1" r:id="rId8cstdfbcbuxu5yo4cyvtw">
+            <w:hyperlink w:history="1" r:id="rIdbvlerile8h7msfizvc7z-">
               <w:r>
                 <w:rPr>
                   <w:rStyle w:val="Hyperlink"/>
@@ -4728,7 +4728,7 @@
             <w:r>
               <w:t xml:space="preserve">, Riverside, CA (Short paper; Accepted). </w:t>
             </w:r>
-            <w:hyperlink w:history="1" r:id="rIdd2mq6jc3znjohgphbljli">
+            <w:hyperlink w:history="1" r:id="rIdxf3l49irfrzg5zjhjdqhc">
               <w:r>
                 <w:rPr>
                   <w:rStyle w:val="Hyperlink"/>
@@ -5059,7 +5059,7 @@
             <w:r>
               <w:t xml:space="preserve">. </w:t>
             </w:r>
-            <w:hyperlink w:history="1" r:id="rIdaeh5wpzqyvmpndyqm9cv_">
+            <w:hyperlink w:history="1" r:id="rIdimlcgo-xqugyz6yubhlss">
               <w:r>
                 <w:rPr>
                   <w:rStyle w:val="Hyperlink"/>
@@ -5154,7 +5154,7 @@
             <w:r>
               <w:t xml:space="preserve">. </w:t>
             </w:r>
-            <w:hyperlink w:history="1" r:id="rIdqq22c3df4viux5ip_cili">
+            <w:hyperlink w:history="1" r:id="rIdg-xy4c112k3xtq_eoqyiv">
               <w:r>
                 <w:rPr>
                   <w:rStyle w:val="Hyperlink"/>
@@ -5259,7 +5259,7 @@
             <w:r>
               <w:t xml:space="preserve">. </w:t>
             </w:r>
-            <w:hyperlink w:history="1" r:id="rId8cgo2h08u26__l8uchzwu">
+            <w:hyperlink w:history="1" r:id="rIdhmp4qtlccc3dukuf68xqf">
               <w:r>
                 <w:rPr>
                   <w:rStyle w:val="Hyperlink"/>
@@ -6554,9 +6554,6 @@
               <w:jc w:val="both"/>
             </w:pPr>
             <w:r>
-              <w:t xml:space="preserve">Fillman, K., Nawar, N., Thapaliya, R., </w:t>
-            </w:r>
-            <w:r>
               <w:rPr>
                 <w:b/>
                 <w:bCs/>
@@ -6564,7 +6561,7 @@
               <w:t xml:space="preserve">Yang, Y.</w:t>
             </w:r>
             <w:r>
-              <w:t xml:space="preserve">, Lyu, F. Detecting and Correcting Spatial Bias in VGI Using Remote Sensing. Invited Webinar Talk, </w:t>
+              <w:t xml:space="preserve">, Fillman, K., Nawar, N., Thapaliya, R., Lyu, F. Detecting and Correcting Spatial Bias in VGI Using Remote Sensing. Invited Webinar Talk, </w:t>
             </w:r>
             <w:r>
               <w:rPr>
@@ -6576,7 +6573,7 @@
             <w:r>
               <w:t xml:space="preserve">, Online (09/23, 2026). </w:t>
             </w:r>
-            <w:hyperlink w:history="1" r:id="rIdk_ejwzzzmxzdmbsbwndsf">
+            <w:hyperlink w:history="1" r:id="rIdbuhn1ifa-6vy-dsccunqd">
               <w:r>
                 <w:rPr>
                   <w:rStyle w:val="Hyperlink"/>
@@ -7497,7 +7494,7 @@
             <w:r>
               <w:t xml:space="preserve">, Virtual. </w:t>
             </w:r>
-            <w:hyperlink w:history="1" r:id="rIdi1k5hozzhhh6zrovkbwc9">
+            <w:hyperlink w:history="1" r:id="rIdf_log6yftxv6ktlknoiek">
               <w:r>
                 <w:rPr>
                   <w:rStyle w:val="Hyperlink"/>
@@ -7840,7 +7837,7 @@
       <w:r>
         <w:t xml:space="preserve">Organizer and Chair, GeoAI Symposium: Panel Session on AI and Disaster Resilience, AAG 2027 Annual Meeting, New York, NY (02/08-02/12, 2027) </w:t>
       </w:r>
-      <w:hyperlink w:history="1" r:id="rIdcthpgte8eggzom6bnfpfs">
+      <w:hyperlink w:history="1" r:id="rIdlvt-55hqzq5vjuadfpat2">
         <w:r>
           <w:rPr>
             <w:rStyle w:val="Hyperlink"/>
@@ -7889,7 +7886,7 @@
       <w:r>
         <w:t xml:space="preserve">Session Co-Organizer, “GeoAI and Data Science for Disaster Resilience,” 33rd International Conference on Geoinformatics (GeoInformatics 2026), Singapore (with Lei Zou, Yi Qiang, Yingjie Hu, Qunying Huang, Xiao Huang, and Bing Zhou) </w:t>
       </w:r>
-      <w:hyperlink w:history="1" r:id="rIdp43f5wcnucocqnzyoxkmi">
+      <w:hyperlink w:history="1" r:id="rIdts4brp2bkgbivy1c_ygd8">
         <w:r>
           <w:rPr>
             <w:rStyle w:val="Hyperlink"/>
@@ -8245,7 +8242,7 @@
       <w:r>
         <w:t xml:space="preserve">Founder, Rayford AI: building a geospatial physical AI company that turns remote sensing, street-level imagery, and geospatial context into auditable intelligence for disaster assessment, claims triage, and infrastructure and property decisions </w:t>
       </w:r>
-      <w:hyperlink w:history="1" r:id="rIdjflqccvkex9cp-7hydhfq">
+      <w:hyperlink w:history="1" r:id="rIda3wvpc-q98suqgkqoabcd">
         <w:r>
           <w:rPr>
             <w:rStyle w:val="Hyperlink"/>
@@ -8294,7 +8291,7 @@
       <w:r>
         <w:t xml:space="preserve">Featured Research, Mosaic - Geospatial Imaging Leaders (Prague, Czech Republic): hyperlocal damage assessment using Mosaic street-level imagery from Hurricane Milton </w:t>
       </w:r>
-      <w:hyperlink w:history="1" r:id="rIdn0rl4a9puqxycvihfrou2">
+      <w:hyperlink w:history="1" r:id="rId6fp8iubjuqgq-le_rgwj8">
         <w:r>
           <w:rPr>
             <w:rStyle w:val="Hyperlink"/>
@@ -8544,7 +8541,7 @@
       <w:r>
         <w:t xml:space="preserve">Texas A&amp;M College of Arts &amp; Sciences, Five Texas A&amp;M Researchers Join National Climate-Health Initiative </w:t>
       </w:r>
-      <w:hyperlink w:history="1" r:id="rId9fpvj7ffhhfbt4_wpekcn">
+      <w:hyperlink w:history="1" r:id="rIdjqmmia_59nygec21kh2dv">
         <w:r>
           <w:rPr>
             <w:rStyle w:val="Hyperlink"/>
@@ -8574,7 +8571,7 @@
       <w:r>
         <w:t xml:space="preserve">Mosaic - Geospatial Imaging Leaders, How Texas A&amp;M Is Pioneering Damage Assessment Using Mosaic Imagery from Hurricane Milton </w:t>
       </w:r>
-      <w:hyperlink w:history="1" r:id="rId5etxlg9qhuo7qc_4wlqre">
+      <w:hyperlink w:history="1" r:id="rId13kgyvkcevncvx1ayjgfz">
         <w:r>
           <w:rPr>
             <w:rStyle w:val="Hyperlink"/>
@@ -8604,7 +8601,7 @@
       <w:r>
         <w:t xml:space="preserve">Texas A&amp;M Institute of Data Science (TAMIDS), TAMIDS Announces 2025-2026 Cohort of Student Ambassadors </w:t>
       </w:r>
-      <w:hyperlink w:history="1" r:id="rIdgyodawlvdwje5u4hf8f-9">
+      <w:hyperlink w:history="1" r:id="rIdxwn_mx5itbp5gthkxniw7">
         <w:r>
           <w:rPr>
             <w:rStyle w:val="Hyperlink"/>
@@ -8634,7 +8631,7 @@
       <w:r>
         <w:t xml:space="preserve">Texas A&amp;M Engineering News, Throwing Shade at Heatwaves </w:t>
       </w:r>
-      <w:hyperlink w:history="1" r:id="rId5shubba9u54m18ny0yoml">
+      <w:hyperlink w:history="1" r:id="rId7ydri2jwf4nftsnmn958f">
         <w:r>
           <w:rPr>
             <w:rStyle w:val="Hyperlink"/>
@@ -8664,7 +8661,7 @@
       <w:r>
         <w:t xml:space="preserve">Esri Industry Blog, Showcasing Innovation in GIS Education through Student Projects at the LA Geospatial Summit </w:t>
       </w:r>
-      <w:hyperlink w:history="1" r:id="rId3-yxls9vwdis6hr6n67uq">
+      <w:hyperlink w:history="1" r:id="rIdh3q89dmr34ldbidiagca1">
         <w:r>
           <w:rPr>
             <w:rStyle w:val="Hyperlink"/>

</xml_diff>

<commit_message>
List Yifan first on I-GUIDE VCO talk; CV: add two Scholar preprints, fix CMC/ICAIS/Earth Embeddings author lists
Co-Authored-By: Claude Opus 5.5 <noreply@anthropic.com>
</commit_message>
<xml_diff>
--- a/resume/Yifan_Yang_CV.docx
+++ b/resume/Yifan_Yang_CV.docx
@@ -126,7 +126,7 @@
             <w:r>
               <w:t xml:space="preserve">Email: </w:t>
             </w:r>
-            <w:hyperlink w:history="1" r:id="rIdqx5zl9iisu9xrwnacst2n">
+            <w:hyperlink w:history="1" r:id="rId7qnztshx5gokezlccpwil">
               <w:r>
                 <w:rPr>
                   <w:rStyle w:val="Hyperlink"/>
@@ -143,7 +143,7 @@
             <w:r>
               <w:t xml:space="preserve">Website: </w:t>
             </w:r>
-            <w:hyperlink w:history="1" r:id="rIdcf6sospncz4j8l6jwcx-j">
+            <w:hyperlink w:history="1" r:id="rIdit_gekhl5ykqb_ftcij57">
               <w:r>
                 <w:rPr>
                   <w:rStyle w:val="Hyperlink"/>
@@ -160,7 +160,7 @@
             <w:r>
               <w:t xml:space="preserve">Google Scholar: </w:t>
             </w:r>
-            <w:hyperlink w:history="1" r:id="rIdmtq2mxthrvdblqhdrzwkj">
+            <w:hyperlink w:history="1" r:id="rId7o61geaywnb2tuw9cepi-">
               <w:r>
                 <w:rPr>
                   <w:rStyle w:val="Hyperlink"/>
@@ -177,7 +177,7 @@
             <w:r>
               <w:t xml:space="preserve">ORCID: </w:t>
             </w:r>
-            <w:hyperlink w:history="1" r:id="rIdd2iagc6y-7bmedkg4n53j">
+            <w:hyperlink w:history="1" r:id="rIdsuv9snjgewbkjlsabuqcz">
               <w:r>
                 <w:rPr>
                   <w:rStyle w:val="Hyperlink"/>
@@ -194,7 +194,7 @@
             <w:r>
               <w:t xml:space="preserve">GitHub: </w:t>
             </w:r>
-            <w:hyperlink w:history="1" r:id="rIdk3s5nmganhrvthuez_cgl">
+            <w:hyperlink w:history="1" r:id="rIdbjrkv-knhybgray_xqprh">
               <w:r>
                 <w:rPr>
                   <w:rStyle w:val="Hyperlink"/>
@@ -1628,7 +1628,7 @@
       <w:r>
         <w:t xml:space="preserve"> A WebGIS / smartphone progressive web app with a risk-analyst assistant (Ray) that may only state what the evidence supports, and a Steward Harness that enforces outcome, process, and institutional validity in code. Submitted to OASIS @ ACM SIGSPATIAL 2026 (Track A). </w:t>
       </w:r>
-      <w:hyperlink w:history="1" r:id="rIdkkji2lnd2tl6gv_ijhp1q">
+      <w:hyperlink w:history="1" r:id="rIdbpyu_rl_w-ax32ucce9qj">
         <w:r>
           <w:rPr>
             <w:rStyle w:val="Hyperlink"/>
@@ -1639,7 +1639,7 @@
       <w:r>
         <w:t xml:space="preserve">] </w:t>
       </w:r>
-      <w:hyperlink w:history="1" r:id="rIdpmuvqyqctun0eifyxnn21">
+      <w:hyperlink w:history="1" r:id="rIdd14ali3rumlu7ghplnq0g">
         <w:r>
           <w:rPr>
             <w:rStyle w:val="Hyperlink"/>
@@ -1732,7 +1732,7 @@
       <w:r>
         <w:t xml:space="preserve"> A multimodal generative framework that benchmarks cross-view image generation strategies integrating diffusion models, ControlNet, and VLM-guided semantic conditioning to synthesize realistic street-view imagery from post-disaster satellite imagery. </w:t>
       </w:r>
-      <w:hyperlink w:history="1" r:id="rId2vm5ax9qp7jo-8gvh07wh">
+      <w:hyperlink w:history="1" r:id="rIdkjdcstjavs9zq0gp3wboo">
         <w:r>
           <w:rPr>
             <w:rStyle w:val="Hyperlink"/>
@@ -1825,7 +1825,7 @@
       <w:r>
         <w:t xml:space="preserve"> An autonomous multi-agent GeoAI framework for hyperlocal, interpretable, near-real-time damage assessment that orchestrates specialized agents built on vision-language foundation models for cross-view perception, damage recognition, reasoning, and automated report generation without task-specific retraining. </w:t>
       </w:r>
-      <w:hyperlink w:history="1" r:id="rIdsna5b9tlzjgm-bhrtcjbk">
+      <w:hyperlink w:history="1" r:id="rIdkot_t7tqfokwcrdjvtsc2">
         <w:r>
           <w:rPr>
             <w:rStyle w:val="Hyperlink"/>
@@ -1904,7 +1904,7 @@
       <w:r>
         <w:t xml:space="preserve"> A multimodal arbitration framework for hyperlocal hurricane damage assessment from bi-temporal street-view imagery, integrating vision-language models (CLIP) with deep vision backbones (ViT-B/16) to improve robustness under post-disaster uncertainty. </w:t>
       </w:r>
-      <w:hyperlink w:history="1" r:id="rIdlobhmhebutcjsfpzpjnxd">
+      <w:hyperlink w:history="1" r:id="rId6fv0dzynljk5debeld1tv">
         <w:r>
           <w:rPr>
             <w:rStyle w:val="Hyperlink"/>
@@ -1969,7 +1969,7 @@
       <w:r>
         <w:t xml:space="preserve"> A dual-channel framework using pre-trained vision backbones (Swin Transformer, ConvNeXt) on pre- and post-disaster street-view pairs to improve the accuracy and interpretability of damage-severity estimation. </w:t>
       </w:r>
-      <w:hyperlink w:history="1" r:id="rIdzgeapalc9kkpnvvjkvbht">
+      <w:hyperlink w:history="1" r:id="rId8hbgkkgo1xddsoe_sim-n">
         <w:r>
           <w:rPr>
             <w:rStyle w:val="Hyperlink"/>
@@ -2043,7 +2043,7 @@
       <w:r>
         <w:t xml:space="preserve">: featured by Mosaic - Geospatial Imaging Leaders (Prague, Czech Republic) for 360° street-level surveying and disaster-intelligence applications </w:t>
       </w:r>
-      <w:hyperlink w:history="1" r:id="rId2-c36hjxnasbkvo1j5a7l">
+      <w:hyperlink w:history="1" r:id="rIds1ssnaz8p5s_g6bzbfnyj">
         <w:r>
           <w:rPr>
             <w:rStyle w:val="Hyperlink"/>
@@ -2100,7 +2100,7 @@
       <w:r>
         <w:t xml:space="preserve">, AutonomousGeoAI4Science (AutoGeoAI4Sci), an open research community and hub for papers, tools, benchmarks, and collaboration advancing autonomous and multimodal GeoAI for scientific discovery. </w:t>
       </w:r>
-      <w:hyperlink w:history="1" r:id="rIdfjr4jjv8h6w1hp4eo3grn">
+      <w:hyperlink w:history="1" r:id="rIds5j8pvivtbnpzhq_i7bge">
         <w:r>
           <w:rPr>
             <w:rStyle w:val="Hyperlink"/>
@@ -2206,7 +2206,7 @@
         </w:numPr>
         <w:spacing w:after="20" w:before="0"/>
       </w:pPr>
-      <w:hyperlink w:history="1" r:id="rIdazqf2uvdycurvydiczrip">
+      <w:hyperlink w:history="1" r:id="rIdoe7hlfoqharf6wanxp3d-">
         <w:r>
           <w:rPr>
             <w:rStyle w:val="Hyperlink"/>
@@ -2236,7 +2236,7 @@
         <w:t xml:space="preserve">Total</w:t>
       </w:r>
       <w:r>
-        <w:t xml:space="preserve">: 28 (published/accepted: 22; in review: 3; preprints: 3)</w:t>
+        <w:t xml:space="preserve">: 30 (published/accepted: 22; in review: 3; preprints: 5)</w:t>
       </w:r>
     </w:p>
     <w:p>
@@ -2264,7 +2264,7 @@
         <w:spacing w:after="20" w:before="0"/>
       </w:pPr>
       <w:r>
-        <w:t xml:space="preserve">Co-Authored Publications: 18 (journal articles: 10, conference papers: 5, preprints: 3)</w:t>
+        <w:t xml:space="preserve">Co-Authored Publications: 20 (journal articles: 10, conference papers: 5, preprints: 5)</w:t>
       </w:r>
     </w:p>
     <w:p>
@@ -2392,7 +2392,7 @@
             <w:r>
               <w:t xml:space="preserve">. </w:t>
             </w:r>
-            <w:hyperlink w:history="1" r:id="rIdcjzqentkjnd9l23y--tbx">
+            <w:hyperlink w:history="1" r:id="rIdffx4tck9zztsjze0dxz2x">
               <w:r>
                 <w:rPr>
                   <w:rStyle w:val="Hyperlink"/>
@@ -2501,7 +2501,7 @@
             <w:r>
               <w:t xml:space="preserve">. CRC Press / Taylor &amp; Francis. </w:t>
             </w:r>
-            <w:hyperlink w:history="1" r:id="rIdc_zz-2r7s-epp-f5wjlhy">
+            <w:hyperlink w:history="1" r:id="rIdjfv_jb6embf_bjvq3t6ki">
               <w:r>
                 <w:rPr>
                   <w:rStyle w:val="Hyperlink"/>
@@ -2603,7 +2603,7 @@
             <w:r>
               <w:t xml:space="preserve">, Riverside, CA (Lightning talk, 4 pages; Accepted). </w:t>
             </w:r>
-            <w:hyperlink w:history="1" r:id="rIdrjitvk3w5bhahlorrf7qs">
+            <w:hyperlink w:history="1" r:id="rIdopegvj4li56c8et62o9pt">
               <w:r>
                 <w:rPr>
                   <w:rStyle w:val="Hyperlink"/>
@@ -2705,7 +2705,7 @@
             <w:r>
               <w:t xml:space="preserve">, Riverside, CA (Applications Track full paper, 12 pages; Accepted). </w:t>
             </w:r>
-            <w:hyperlink w:history="1" r:id="rIdxb1l6vbey8xxlg79wtdqy">
+            <w:hyperlink w:history="1" r:id="rIdydl7y7uiw2l5wsqzpjwpm">
               <w:r>
                 <w:rPr>
                   <w:rStyle w:val="Hyperlink"/>
@@ -2807,7 +2807,7 @@
             <w:r>
               <w:t xml:space="preserve">, St. Louis, MO (Accepted). </w:t>
             </w:r>
-            <w:hyperlink w:history="1" r:id="rIdjddrhmf-vqivf_dz6d9me">
+            <w:hyperlink w:history="1" r:id="rIdilt2bl-ruowaqtp9di9su">
               <w:r>
                 <w:rPr>
                   <w:rStyle w:val="Hyperlink"/>
@@ -2909,7 +2909,7 @@
             <w:r>
               <w:t xml:space="preserve">, Washington, D.C. (Accepted). </w:t>
             </w:r>
-            <w:hyperlink w:history="1" r:id="rIdtjnsbqd2dtqpd9tbppalc">
+            <w:hyperlink w:history="1" r:id="rIdvvzzzdsfohjdodplk0m8j">
               <w:r>
                 <w:rPr>
                   <w:rStyle w:val="Hyperlink"/>
@@ -3011,7 +3011,7 @@
             <w:r>
               <w:t xml:space="preserve">, 121, 102335. </w:t>
             </w:r>
-            <w:hyperlink w:history="1" r:id="rIdrh0rg8ucmch-0z_z2dblf">
+            <w:hyperlink w:history="1" r:id="rIduz9jvrpe8eitkvqmh7_yl">
               <w:r>
                 <w:rPr>
                   <w:rStyle w:val="Hyperlink"/>
@@ -3120,7 +3120,7 @@
             <w:r>
               <w:t xml:space="preserve">, 10, 310. </w:t>
             </w:r>
-            <w:hyperlink w:history="1" r:id="rIdvhlxlnwnen05p5ll6fwmp">
+            <w:hyperlink w:history="1" r:id="rIdqc6v3mulr-8dvzc_pc8f8">
               <w:r>
                 <w:rPr>
                   <w:rStyle w:val="Hyperlink"/>
@@ -3229,7 +3229,7 @@
             <w:r>
               <w:t xml:space="preserve"> (Chapter 7, pp. 113-122). Redlands, CA: Esri Press. </w:t>
             </w:r>
-            <w:hyperlink w:history="1" r:id="rIdi33x8ltxtj7uo_xc9gmo7">
+            <w:hyperlink w:history="1" r:id="rIdvxwpia-e3alhcc08m9hwm">
               <w:r>
                 <w:rPr>
                   <w:rStyle w:val="Hyperlink"/>
@@ -3331,7 +3331,7 @@
             <w:r>
               <w:t xml:space="preserve">, 14(16), 7091. </w:t>
             </w:r>
-            <w:hyperlink w:history="1" r:id="rIdd3gr5a4qizy0bxd_fxgmv">
+            <w:hyperlink w:history="1" r:id="rIdupvm8jccs6fiq8gwxl2md">
               <w:r>
                 <w:rPr>
                   <w:rStyle w:val="Hyperlink"/>
@@ -3474,7 +3474,7 @@
             <w:r>
               <w:t xml:space="preserve">. </w:t>
             </w:r>
-            <w:hyperlink w:history="1" r:id="rId0twtsl4pnb7qxydcjseqj">
+            <w:hyperlink w:history="1" r:id="rIdpyp0aabxxorttf97c4mas">
               <w:r>
                 <w:rPr>
                   <w:rStyle w:val="Hyperlink"/>
@@ -3579,7 +3579,7 @@
             <w:r>
               <w:t xml:space="preserve"> (Accepted). </w:t>
             </w:r>
-            <w:hyperlink w:history="1" r:id="rIdmelhtyjnh-zpvy_itligi">
+            <w:hyperlink w:history="1" r:id="rIdaupddhbzwl2uitkwbyccy">
               <w:r>
                 <w:rPr>
                   <w:rStyle w:val="Hyperlink"/>
@@ -3684,7 +3684,7 @@
             <w:r>
               <w:t xml:space="preserve">, 146, 106470. </w:t>
             </w:r>
-            <w:hyperlink w:history="1" r:id="rId8sjrssmyssqtmjkol9b9j">
+            <w:hyperlink w:history="1" r:id="rIdp6hb93glystrw0hmm-c6p">
               <w:r>
                 <w:rPr>
                   <w:rStyle w:val="Hyperlink"/>
@@ -3789,7 +3789,7 @@
             <w:r>
               <w:t xml:space="preserve">, 142440. </w:t>
             </w:r>
-            <w:hyperlink w:history="1" r:id="rIdgllarh8shaubghsqmdhi2">
+            <w:hyperlink w:history="1" r:id="rIdh5lrgidddukq1cwgg9rdn">
               <w:r>
                 <w:rPr>
                   <w:rStyle w:val="Hyperlink"/>
@@ -3894,7 +3894,7 @@
             <w:r>
               <w:t xml:space="preserve">, 150, 105342. </w:t>
             </w:r>
-            <w:hyperlink w:history="1" r:id="rIdvgih8lch9xbazgcvlzsk8">
+            <w:hyperlink w:history="1" r:id="rIdt06m20rxpwfg83nyr4bba">
               <w:r>
                 <w:rPr>
                   <w:rStyle w:val="Hyperlink"/>
@@ -4187,7 +4187,7 @@
             <w:r>
               <w:t xml:space="preserve">, 1-15. </w:t>
             </w:r>
-            <w:hyperlink w:history="1" r:id="rIdf49dusd7di6n5d014v_qd">
+            <w:hyperlink w:history="1" r:id="rId_fymrjgxicm09e7jep6ne">
               <w:r>
                 <w:rPr>
                   <w:rStyle w:val="Hyperlink"/>
@@ -4270,7 +4270,7 @@
               <w:jc w:val="both"/>
             </w:pPr>
             <w:r>
-              <w:t xml:space="preserve">Zhang, Y., Chen, J., Liu, B., </w:t>
+              <w:t xml:space="preserve">Zhang, Y., Chen, J., </w:t>
             </w:r>
             <w:r>
               <w:rPr>
@@ -4280,7 +4280,7 @@
               <w:t xml:space="preserve">Yang, Y.</w:t>
             </w:r>
             <w:r>
-              <w:t xml:space="preserve">, Li, H., Zheng, X., Chen, X., Ren, T., Xiong, N. COVID-19 Public Opinion and Emotion Monitoring System Based on Time Series Thermal New Word Mining. </w:t>
+              <w:t xml:space="preserve">, Li, H., Zheng, X., Chen, X., Liu, B., Ren, T., Xiong, N. COVID-19 Public Opinion and Emotion Monitoring System Based on Time Series Thermal New Word Mining. </w:t>
             </w:r>
             <w:r>
               <w:rPr>
@@ -4292,7 +4292,7 @@
             <w:r>
               <w:t xml:space="preserve">, 64(3), 1415-1434. </w:t>
             </w:r>
-            <w:hyperlink w:history="1" r:id="rIdrndnl8jmlphfpvuig_qoq">
+            <w:hyperlink w:history="1" r:id="rIdfld7-clwemvy-9fs1y4g0">
               <w:r>
                 <w:rPr>
                   <w:rStyle w:val="Hyperlink"/>
@@ -4529,7 +4529,7 @@
             <w:r>
               <w:t xml:space="preserve">, Chicago, IL (Research Poster; Accepted). </w:t>
             </w:r>
-            <w:hyperlink w:history="1" r:id="rIdbvlerile8h7msfizvc7z-">
+            <w:hyperlink w:history="1" r:id="rIdifw_btrii9z4kbymnfr0o">
               <w:r>
                 <w:rPr>
                   <w:rStyle w:val="Hyperlink"/>
@@ -4728,7 +4728,7 @@
             <w:r>
               <w:t xml:space="preserve">, Riverside, CA (Short paper; Accepted). </w:t>
             </w:r>
-            <w:hyperlink w:history="1" r:id="rIdxf3l49irfrzg5zjhjdqhc">
+            <w:hyperlink w:history="1" r:id="rIdtpibhq59sgu60ck8wmasl">
               <w:r>
                 <w:rPr>
                   <w:rStyle w:val="Hyperlink"/>
@@ -4915,7 +4915,7 @@
               <w:t xml:space="preserve">Yang, Y.</w:t>
             </w:r>
             <w:r>
-              <w:t xml:space="preserve">, Liu, L., Liu, B. Experiments of Federated Learning for COVID-19 Chest X-ray Images. </w:t>
+              <w:t xml:space="preserve">, Liu, L., Zhao, H., Wang, C., Liu, B. Experiments of Federated Learning for COVID-19 Chest X-ray Images. </w:t>
             </w:r>
             <w:r>
               <w:rPr>
@@ -4925,7 +4925,18 @@
               <w:t xml:space="preserve">International Conference on Artificial Intelligence and Security (ICAIS 2021)</w:t>
             </w:r>
             <w:r>
-              <w:t xml:space="preserve">, pp. 41-53. Springer, Cham.</w:t>
+              <w:t xml:space="preserve">, pp. 41-53. Springer, Cham. </w:t>
+            </w:r>
+            <w:hyperlink w:history="1" r:id="rIdpnbs7zvmjf1oyynuc5602">
+              <w:r>
+                <w:rPr>
+                  <w:rStyle w:val="Hyperlink"/>
+                </w:rPr>
+                <w:t xml:space="preserve">[link</w:t>
+              </w:r>
+            </w:hyperlink>
+            <w:r>
+              <w:t xml:space="preserve">]</w:t>
             </w:r>
           </w:p>
         </w:tc>
@@ -5012,7 +5023,7 @@
           </w:tcPr>
           <w:p>
             <w:r>
-              <w:t xml:space="preserve">3.</w:t>
+              <w:t xml:space="preserve">5.</w:t>
             </w:r>
           </w:p>
         </w:tc>
@@ -5059,7 +5070,7 @@
             <w:r>
               <w:t xml:space="preserve">. </w:t>
             </w:r>
-            <w:hyperlink w:history="1" r:id="rIdimlcgo-xqugyz6yubhlss">
+            <w:hyperlink w:history="1" r:id="rIds1qsc7113uxzr1fkwlhf9">
               <w:r>
                 <w:rPr>
                   <w:rStyle w:val="Hyperlink"/>
@@ -5117,7 +5128,7 @@
           </w:tcPr>
           <w:p>
             <w:r>
-              <w:t xml:space="preserve">2.</w:t>
+              <w:t xml:space="preserve">4.</w:t>
             </w:r>
           </w:p>
         </w:tc>
@@ -5142,19 +5153,239 @@
               <w:jc w:val="both"/>
             </w:pPr>
             <w:r>
-              <w:t xml:space="preserve">Gong, W., Srivastava, U., Wang, Y., Jia, Y., Wu, Q., Bai, W., et al., Ye, X. Earth Embeddings Reveal Diverse Urban Signals from Space. </w:t>
+              <w:t xml:space="preserve">Arora, A., Deng, J., Arora, A., Cai, H., Zou, L., </w:t>
+            </w:r>
+            <w:r>
+              <w:rPr>
+                <w:b/>
+                <w:bCs/>
+              </w:rPr>
+              <w:t xml:space="preserve">Yang, Y.</w:t>
+            </w:r>
+            <w:r>
+              <w:t xml:space="preserve"> Does FIFA World Cup Performance Influence Tourism Arrivals?: Evidence from Cabo Verde and Other Countries. </w:t>
             </w:r>
             <w:r>
               <w:rPr>
                 <w:i/>
                 <w:iCs/>
               </w:rPr>
+              <w:t xml:space="preserve">SSRN preprint</w:t>
+            </w:r>
+            <w:r>
+              <w:t xml:space="preserve">. </w:t>
+            </w:r>
+            <w:hyperlink w:history="1" r:id="rId87_pbypqcsy8omcro-gzg">
+              <w:r>
+                <w:rPr>
+                  <w:rStyle w:val="Hyperlink"/>
+                </w:rPr>
+                <w:t xml:space="preserve">[SSRN:7596480</w:t>
+              </w:r>
+            </w:hyperlink>
+            <w:r>
+              <w:t xml:space="preserve">]</w:t>
+            </w:r>
+          </w:p>
+        </w:tc>
+      </w:tr>
+      <w:tr>
+        <w:trPr>
+          <w:cantSplit/>
+        </w:trPr>
+        <w:tc>
+          <w:tcPr>
+            <w:tcW w:type="dxa" w:w="1000"/>
+            <w:tcBorders>
+              <w:top w:val="none" w:color="FFFFFF" w:sz="0"/>
+              <w:left w:val="none" w:color="FFFFFF" w:sz="0"/>
+              <w:bottom w:val="none" w:color="FFFFFF" w:sz="0"/>
+              <w:right w:val="none" w:color="FFFFFF" w:sz="0"/>
+            </w:tcBorders>
+            <w:tcMar>
+              <w:top w:type="dxa" w:w="40"/>
+              <w:left w:type="dxa" w:w="60"/>
+              <w:bottom w:type="dxa" w:w="40"/>
+              <w:right w:type="dxa" w:w="60"/>
+            </w:tcMar>
+          </w:tcPr>
+          <w:p>
+            <w:r>
+              <w:t xml:space="preserve">2026</w:t>
+            </w:r>
+          </w:p>
+        </w:tc>
+        <w:tc>
+          <w:tcPr>
+            <w:tcW w:type="dxa" w:w="500"/>
+            <w:tcBorders>
+              <w:top w:val="none" w:color="FFFFFF" w:sz="0"/>
+              <w:left w:val="none" w:color="FFFFFF" w:sz="0"/>
+              <w:bottom w:val="none" w:color="FFFFFF" w:sz="0"/>
+              <w:right w:val="none" w:color="FFFFFF" w:sz="0"/>
+            </w:tcBorders>
+            <w:tcMar>
+              <w:top w:type="dxa" w:w="40"/>
+              <w:left w:type="dxa" w:w="60"/>
+              <w:bottom w:type="dxa" w:w="40"/>
+              <w:right w:type="dxa" w:w="60"/>
+            </w:tcMar>
+          </w:tcPr>
+          <w:p>
+            <w:r>
+              <w:t xml:space="preserve">3.</w:t>
+            </w:r>
+          </w:p>
+        </w:tc>
+        <w:tc>
+          <w:tcPr>
+            <w:tcW w:type="dxa" w:w="8580"/>
+            <w:tcBorders>
+              <w:top w:val="none" w:color="FFFFFF" w:sz="0"/>
+              <w:left w:val="none" w:color="FFFFFF" w:sz="0"/>
+              <w:bottom w:val="none" w:color="FFFFFF" w:sz="0"/>
+              <w:right w:val="none" w:color="FFFFFF" w:sz="0"/>
+            </w:tcBorders>
+            <w:tcMar>
+              <w:top w:type="dxa" w:w="40"/>
+              <w:left w:type="dxa" w:w="60"/>
+              <w:bottom w:type="dxa" w:w="40"/>
+              <w:right w:type="dxa" w:w="60"/>
+            </w:tcMar>
+          </w:tcPr>
+          <w:p>
+            <w:pPr>
+              <w:jc w:val="both"/>
+            </w:pPr>
+            <w:r>
+              <w:t xml:space="preserve">Tian, H., Cai, H., Chen, X., </w:t>
+            </w:r>
+            <w:r>
+              <w:rPr>
+                <w:b/>
+                <w:bCs/>
+              </w:rPr>
+              <w:t xml:space="preserve">Yang, Y.</w:t>
+            </w:r>
+            <w:r>
+              <w:t xml:space="preserve"> Monitoring Urban Traffic Dynamics at Fine Spatiotemporal Resolution Using Distributed Acoustic Sensing and Deep Learning. </w:t>
+            </w:r>
+            <w:r>
+              <w:rPr>
+                <w:i/>
+                <w:iCs/>
+              </w:rPr>
               <w:t xml:space="preserve">arXiv preprint</w:t>
             </w:r>
             <w:r>
               <w:t xml:space="preserve">. </w:t>
             </w:r>
-            <w:hyperlink w:history="1" r:id="rIdg-xy4c112k3xtq_eoqyiv">
+            <w:hyperlink w:history="1" r:id="rIdjttctx0kbzdpii7cf9gkh">
+              <w:r>
+                <w:rPr>
+                  <w:rStyle w:val="Hyperlink"/>
+                </w:rPr>
+                <w:t xml:space="preserve">[arXiv:2609.28793</w:t>
+              </w:r>
+            </w:hyperlink>
+            <w:r>
+              <w:t xml:space="preserve">]</w:t>
+            </w:r>
+          </w:p>
+        </w:tc>
+      </w:tr>
+      <w:tr>
+        <w:trPr>
+          <w:cantSplit/>
+        </w:trPr>
+        <w:tc>
+          <w:tcPr>
+            <w:tcW w:type="dxa" w:w="1000"/>
+            <w:tcBorders>
+              <w:top w:val="none" w:color="FFFFFF" w:sz="0"/>
+              <w:left w:val="none" w:color="FFFFFF" w:sz="0"/>
+              <w:bottom w:val="none" w:color="FFFFFF" w:sz="0"/>
+              <w:right w:val="none" w:color="FFFFFF" w:sz="0"/>
+            </w:tcBorders>
+            <w:tcMar>
+              <w:top w:type="dxa" w:w="40"/>
+              <w:left w:type="dxa" w:w="60"/>
+              <w:bottom w:type="dxa" w:w="40"/>
+              <w:right w:type="dxa" w:w="60"/>
+            </w:tcMar>
+          </w:tcPr>
+          <w:p>
+            <w:r>
+              <w:t xml:space="preserve">2026</w:t>
+            </w:r>
+          </w:p>
+        </w:tc>
+        <w:tc>
+          <w:tcPr>
+            <w:tcW w:type="dxa" w:w="500"/>
+            <w:tcBorders>
+              <w:top w:val="none" w:color="FFFFFF" w:sz="0"/>
+              <w:left w:val="none" w:color="FFFFFF" w:sz="0"/>
+              <w:bottom w:val="none" w:color="FFFFFF" w:sz="0"/>
+              <w:right w:val="none" w:color="FFFFFF" w:sz="0"/>
+            </w:tcBorders>
+            <w:tcMar>
+              <w:top w:type="dxa" w:w="40"/>
+              <w:left w:type="dxa" w:w="60"/>
+              <w:bottom w:type="dxa" w:w="40"/>
+              <w:right w:type="dxa" w:w="60"/>
+            </w:tcMar>
+          </w:tcPr>
+          <w:p>
+            <w:r>
+              <w:t xml:space="preserve">2.</w:t>
+            </w:r>
+          </w:p>
+        </w:tc>
+        <w:tc>
+          <w:tcPr>
+            <w:tcW w:type="dxa" w:w="8580"/>
+            <w:tcBorders>
+              <w:top w:val="none" w:color="FFFFFF" w:sz="0"/>
+              <w:left w:val="none" w:color="FFFFFF" w:sz="0"/>
+              <w:bottom w:val="none" w:color="FFFFFF" w:sz="0"/>
+              <w:right w:val="none" w:color="FFFFFF" w:sz="0"/>
+            </w:tcBorders>
+            <w:tcMar>
+              <w:top w:type="dxa" w:w="40"/>
+              <w:left w:type="dxa" w:w="60"/>
+              <w:bottom w:type="dxa" w:w="40"/>
+              <w:right w:type="dxa" w:w="60"/>
+            </w:tcMar>
+          </w:tcPr>
+          <w:p>
+            <w:pPr>
+              <w:jc w:val="both"/>
+            </w:pPr>
+            <w:r>
+              <w:t xml:space="preserve">Gong, W., Srivastava, U., Wang, Y., Jia, Y., Wu, Q., Bai, W., </w:t>
+            </w:r>
+            <w:r>
+              <w:rPr>
+                <w:b/>
+                <w:bCs/>
+              </w:rPr>
+              <w:t xml:space="preserve">Yang, Y.</w:t>
+            </w:r>
+            <w:r>
+              <w:t xml:space="preserve">, Huang, X., et al., Ye, X. Earth Embeddings Reveal Diverse Urban Signals from Space. </w:t>
+            </w:r>
+            <w:r>
+              <w:rPr>
+                <w:i/>
+                <w:iCs/>
+              </w:rPr>
+              <w:t xml:space="preserve">arXiv preprint</w:t>
+            </w:r>
+            <w:r>
+              <w:t xml:space="preserve">. </w:t>
+            </w:r>
+            <w:hyperlink w:history="1" r:id="rIddm9oh4jnuk8uyly5mfjwi">
               <w:r>
                 <w:rPr>
                   <w:rStyle w:val="Hyperlink"/>
@@ -5259,7 +5490,7 @@
             <w:r>
               <w:t xml:space="preserve">. </w:t>
             </w:r>
-            <w:hyperlink w:history="1" r:id="rIdhmp4qtlccc3dukuf68xqf">
+            <w:hyperlink w:history="1" r:id="rIdcv5putwbbdtrkw2p4njdr">
               <w:r>
                 <w:rPr>
                   <w:rStyle w:val="Hyperlink"/>
@@ -6573,7 +6804,7 @@
             <w:r>
               <w:t xml:space="preserve">, Online (09/23, 2026). </w:t>
             </w:r>
-            <w:hyperlink w:history="1" r:id="rIdbuhn1ifa-6vy-dsccunqd">
+            <w:hyperlink w:history="1" r:id="rIdet_xavufuakhrxulxq4m2">
               <w:r>
                 <w:rPr>
                   <w:rStyle w:val="Hyperlink"/>
@@ -7494,7 +7725,7 @@
             <w:r>
               <w:t xml:space="preserve">, Virtual. </w:t>
             </w:r>
-            <w:hyperlink w:history="1" r:id="rIdf_log6yftxv6ktlknoiek">
+            <w:hyperlink w:history="1" r:id="rIdthqvvudgsorwjwptkncz7">
               <w:r>
                 <w:rPr>
                   <w:rStyle w:val="Hyperlink"/>
@@ -7837,7 +8068,7 @@
       <w:r>
         <w:t xml:space="preserve">Organizer and Chair, GeoAI Symposium: Panel Session on AI and Disaster Resilience, AAG 2027 Annual Meeting, New York, NY (02/08-02/12, 2027) </w:t>
       </w:r>
-      <w:hyperlink w:history="1" r:id="rIdlvt-55hqzq5vjuadfpat2">
+      <w:hyperlink w:history="1" r:id="rIdxoc1om4zju5cqdjebdbvs">
         <w:r>
           <w:rPr>
             <w:rStyle w:val="Hyperlink"/>
@@ -7886,7 +8117,7 @@
       <w:r>
         <w:t xml:space="preserve">Session Co-Organizer, “GeoAI and Data Science for Disaster Resilience,” 33rd International Conference on Geoinformatics (GeoInformatics 2026), Singapore (with Lei Zou, Yi Qiang, Yingjie Hu, Qunying Huang, Xiao Huang, and Bing Zhou) </w:t>
       </w:r>
-      <w:hyperlink w:history="1" r:id="rIdts4brp2bkgbivy1c_ygd8">
+      <w:hyperlink w:history="1" r:id="rIdhyjs0j2o8qnoly9pqchwb">
         <w:r>
           <w:rPr>
             <w:rStyle w:val="Hyperlink"/>
@@ -8242,7 +8473,7 @@
       <w:r>
         <w:t xml:space="preserve">Founder, Rayford AI: building a geospatial physical AI company that turns remote sensing, street-level imagery, and geospatial context into auditable intelligence for disaster assessment, claims triage, and infrastructure and property decisions </w:t>
       </w:r>
-      <w:hyperlink w:history="1" r:id="rIda3wvpc-q98suqgkqoabcd">
+      <w:hyperlink w:history="1" r:id="rId65xn4_llcgaucob7rhuni">
         <w:r>
           <w:rPr>
             <w:rStyle w:val="Hyperlink"/>
@@ -8291,7 +8522,7 @@
       <w:r>
         <w:t xml:space="preserve">Featured Research, Mosaic - Geospatial Imaging Leaders (Prague, Czech Republic): hyperlocal damage assessment using Mosaic street-level imagery from Hurricane Milton </w:t>
       </w:r>
-      <w:hyperlink w:history="1" r:id="rId6fp8iubjuqgq-le_rgwj8">
+      <w:hyperlink w:history="1" r:id="rIdolgkb0zmuzi8akv5jlnk9">
         <w:r>
           <w:rPr>
             <w:rStyle w:val="Hyperlink"/>
@@ -8541,7 +8772,7 @@
       <w:r>
         <w:t xml:space="preserve">Texas A&amp;M College of Arts &amp; Sciences, Five Texas A&amp;M Researchers Join National Climate-Health Initiative </w:t>
       </w:r>
-      <w:hyperlink w:history="1" r:id="rIdjqmmia_59nygec21kh2dv">
+      <w:hyperlink w:history="1" r:id="rIdqcjpdih-dx9an6daheali">
         <w:r>
           <w:rPr>
             <w:rStyle w:val="Hyperlink"/>
@@ -8571,7 +8802,7 @@
       <w:r>
         <w:t xml:space="preserve">Mosaic - Geospatial Imaging Leaders, How Texas A&amp;M Is Pioneering Damage Assessment Using Mosaic Imagery from Hurricane Milton </w:t>
       </w:r>
-      <w:hyperlink w:history="1" r:id="rId13kgyvkcevncvx1ayjgfz">
+      <w:hyperlink w:history="1" r:id="rIdccykxgjy74kg3ywrgk-un">
         <w:r>
           <w:rPr>
             <w:rStyle w:val="Hyperlink"/>
@@ -8601,7 +8832,7 @@
       <w:r>
         <w:t xml:space="preserve">Texas A&amp;M Institute of Data Science (TAMIDS), TAMIDS Announces 2025-2026 Cohort of Student Ambassadors </w:t>
       </w:r>
-      <w:hyperlink w:history="1" r:id="rIdxwn_mx5itbp5gthkxniw7">
+      <w:hyperlink w:history="1" r:id="rIdnp8qclq57gcvirfznlw8l">
         <w:r>
           <w:rPr>
             <w:rStyle w:val="Hyperlink"/>
@@ -8631,7 +8862,7 @@
       <w:r>
         <w:t xml:space="preserve">Texas A&amp;M Engineering News, Throwing Shade at Heatwaves </w:t>
       </w:r>
-      <w:hyperlink w:history="1" r:id="rId7ydri2jwf4nftsnmn958f">
+      <w:hyperlink w:history="1" r:id="rIdmv_dga2mntcgssbqhvheu">
         <w:r>
           <w:rPr>
             <w:rStyle w:val="Hyperlink"/>
@@ -8661,7 +8892,7 @@
       <w:r>
         <w:t xml:space="preserve">Esri Industry Blog, Showcasing Innovation in GIS Education through Student Projects at the LA Geospatial Summit </w:t>
       </w:r>
-      <w:hyperlink w:history="1" r:id="rIdh3q89dmr34ldbidiagca1">
+      <w:hyperlink w:history="1" r:id="rIdz9f5a26egmzomvqifet9f">
         <w:r>
           <w:rPr>
             <w:rStyle w:val="Hyperlink"/>

</xml_diff>